<commit_message>
Exercise 2: Implementing the Factory Method Pattern
</commit_message>
<xml_diff>
--- a/Engineering Concepts/Design Pattern & Principles.docx
+++ b/Engineering Concepts/Design Pattern & Principles.docx
@@ -3036,6 +3036,9 @@
     </w:p>
     <w:p>
       <w:r>
+        <w:rPr>
+          <w:noProof/>
+        </w:rPr>
         <w:drawing>
           <wp:inline distT="0" distB="0" distL="0" distR="0" wp14:anchorId="51E43F8E" wp14:editId="69CACFCC">
             <wp:extent cx="5943600" cy="3170555"/>
@@ -3072,6 +3075,4009 @@
           </wp:inline>
         </w:drawing>
       </w:r>
+    </w:p>
+    <w:p>
+      <w:pPr>
+        <w:rPr>
+          <w:sz w:val="28"/>
+          <w:szCs w:val="28"/>
+        </w:rPr>
+      </w:pPr>
+      <w:r>
+        <w:rPr>
+          <w:b/>
+          <w:bCs/>
+          <w:sz w:val="28"/>
+          <w:szCs w:val="28"/>
+        </w:rPr>
+        <w:t>Exercise 2: Implementing the Factory Method Pattern</w:t>
+      </w:r>
+    </w:p>
+    <w:p>
+      <w:r>
+        <w:rPr>
+          <w:b/>
+          <w:bCs/>
+        </w:rPr>
+        <w:t>Scenario:</w:t>
+      </w:r>
+      <w:r>
+        <w:t xml:space="preserve"> </w:t>
+      </w:r>
+    </w:p>
+    <w:p>
+      <w:r>
+        <w:t>You are developing a document management system that needs to create different types of documents (e.g., Word, PDF, Excel). Use the Factory Method Pattern to achieve this.</w:t>
+      </w:r>
+    </w:p>
+    <w:p>
+      <w:pPr>
+        <w:rPr>
+          <w:b/>
+          <w:bCs/>
+        </w:rPr>
+      </w:pPr>
+      <w:r>
+        <w:rPr>
+          <w:b/>
+          <w:bCs/>
+        </w:rPr>
+        <w:t>Document.java</w:t>
+      </w:r>
+    </w:p>
+    <w:p>
+      <w:pPr>
+        <w:pStyle w:val="NormalWeb"/>
+        <w:shd w:val="clear" w:color="auto" w:fill="1E1F22"/>
+        <w:spacing w:before="0" w:beforeAutospacing="0" w:after="0" w:afterAutospacing="0"/>
+        <w:rPr>
+          <w:rFonts w:ascii="Consolas" w:hAnsi="Consolas"/>
+          <w:color w:val="CCCCCC"/>
+          <w:sz w:val="20"/>
+          <w:szCs w:val="20"/>
+        </w:rPr>
+      </w:pPr>
+      <w:r>
+        <w:rPr>
+          <w:rFonts w:ascii="Consolas" w:hAnsi="Consolas"/>
+          <w:color w:val="CC6C1D"/>
+          <w:sz w:val="20"/>
+          <w:szCs w:val="20"/>
+        </w:rPr>
+        <w:t>package</w:t>
+      </w:r>
+      <w:r>
+        <w:rPr>
+          <w:rFonts w:ascii="Consolas" w:hAnsi="Consolas"/>
+          <w:color w:val="D9E8F7"/>
+          <w:sz w:val="20"/>
+          <w:szCs w:val="20"/>
+        </w:rPr>
+        <w:t xml:space="preserve"> </w:t>
+      </w:r>
+      <w:proofErr w:type="spellStart"/>
+      <w:proofErr w:type="gramStart"/>
+      <w:r>
+        <w:rPr>
+          <w:rFonts w:ascii="Consolas" w:hAnsi="Consolas"/>
+          <w:color w:val="D9E8F7"/>
+          <w:sz w:val="20"/>
+          <w:szCs w:val="20"/>
+        </w:rPr>
+        <w:t>com</w:t>
+      </w:r>
+      <w:r>
+        <w:rPr>
+          <w:rFonts w:ascii="Consolas" w:hAnsi="Consolas"/>
+          <w:color w:val="E6E6FA"/>
+          <w:sz w:val="20"/>
+          <w:szCs w:val="20"/>
+        </w:rPr>
+        <w:t>.</w:t>
+      </w:r>
+      <w:r>
+        <w:rPr>
+          <w:rFonts w:ascii="Consolas" w:hAnsi="Consolas"/>
+          <w:color w:val="D9E8F7"/>
+          <w:sz w:val="20"/>
+          <w:szCs w:val="20"/>
+        </w:rPr>
+        <w:t>result</w:t>
+      </w:r>
+      <w:proofErr w:type="gramEnd"/>
+      <w:r>
+        <w:rPr>
+          <w:rFonts w:ascii="Consolas" w:hAnsi="Consolas"/>
+          <w:color w:val="E6E6FA"/>
+          <w:sz w:val="20"/>
+          <w:szCs w:val="20"/>
+        </w:rPr>
+        <w:t>.</w:t>
+      </w:r>
+      <w:r>
+        <w:rPr>
+          <w:rFonts w:ascii="Consolas" w:hAnsi="Consolas"/>
+          <w:color w:val="D9E8F7"/>
+          <w:sz w:val="20"/>
+          <w:szCs w:val="20"/>
+        </w:rPr>
+        <w:t>factory</w:t>
+      </w:r>
+      <w:proofErr w:type="spellEnd"/>
+      <w:r>
+        <w:rPr>
+          <w:rFonts w:ascii="Consolas" w:hAnsi="Consolas"/>
+          <w:color w:val="E6E6FA"/>
+          <w:sz w:val="20"/>
+          <w:szCs w:val="20"/>
+        </w:rPr>
+        <w:t>;</w:t>
+      </w:r>
+    </w:p>
+    <w:p>
+      <w:pPr>
+        <w:pStyle w:val="NormalWeb"/>
+        <w:shd w:val="clear" w:color="auto" w:fill="1E1F22"/>
+        <w:spacing w:before="0" w:beforeAutospacing="0" w:after="0" w:afterAutospacing="0"/>
+        <w:rPr>
+          <w:rFonts w:ascii="Consolas" w:hAnsi="Consolas"/>
+          <w:color w:val="CCCCCC"/>
+          <w:sz w:val="20"/>
+          <w:szCs w:val="20"/>
+        </w:rPr>
+      </w:pPr>
+    </w:p>
+    <w:p>
+      <w:pPr>
+        <w:pStyle w:val="NormalWeb"/>
+        <w:shd w:val="clear" w:color="auto" w:fill="1E1F22"/>
+        <w:spacing w:before="0" w:beforeAutospacing="0" w:after="0" w:afterAutospacing="0"/>
+        <w:rPr>
+          <w:rFonts w:ascii="Consolas" w:hAnsi="Consolas"/>
+          <w:color w:val="CCCCCC"/>
+          <w:sz w:val="20"/>
+          <w:szCs w:val="20"/>
+        </w:rPr>
+      </w:pPr>
+      <w:r>
+        <w:rPr>
+          <w:rFonts w:ascii="Consolas" w:hAnsi="Consolas"/>
+          <w:color w:val="CC6C1D"/>
+          <w:sz w:val="20"/>
+          <w:szCs w:val="20"/>
+        </w:rPr>
+        <w:t>public</w:t>
+      </w:r>
+      <w:r>
+        <w:rPr>
+          <w:rFonts w:ascii="Consolas" w:hAnsi="Consolas"/>
+          <w:color w:val="D9E8F7"/>
+          <w:sz w:val="20"/>
+          <w:szCs w:val="20"/>
+        </w:rPr>
+        <w:t xml:space="preserve"> </w:t>
+      </w:r>
+      <w:r>
+        <w:rPr>
+          <w:rFonts w:ascii="Consolas" w:hAnsi="Consolas"/>
+          <w:color w:val="CC6C1D"/>
+          <w:sz w:val="20"/>
+          <w:szCs w:val="20"/>
+        </w:rPr>
+        <w:t>interface</w:t>
+      </w:r>
+      <w:r>
+        <w:rPr>
+          <w:rFonts w:ascii="Consolas" w:hAnsi="Consolas"/>
+          <w:color w:val="D9E8F7"/>
+          <w:sz w:val="20"/>
+          <w:szCs w:val="20"/>
+        </w:rPr>
+        <w:t xml:space="preserve"> </w:t>
+      </w:r>
+      <w:r>
+        <w:rPr>
+          <w:rFonts w:ascii="Consolas" w:hAnsi="Consolas"/>
+          <w:color w:val="80F2F6"/>
+          <w:sz w:val="20"/>
+          <w:szCs w:val="20"/>
+        </w:rPr>
+        <w:t>Document</w:t>
+      </w:r>
+      <w:r>
+        <w:rPr>
+          <w:rFonts w:ascii="Consolas" w:hAnsi="Consolas"/>
+          <w:color w:val="D9E8F7"/>
+          <w:sz w:val="20"/>
+          <w:szCs w:val="20"/>
+        </w:rPr>
+        <w:t xml:space="preserve"> </w:t>
+      </w:r>
+      <w:r>
+        <w:rPr>
+          <w:rFonts w:ascii="Consolas" w:hAnsi="Consolas"/>
+          <w:color w:val="F9FAF4"/>
+          <w:sz w:val="20"/>
+          <w:szCs w:val="20"/>
+        </w:rPr>
+        <w:t>{</w:t>
+      </w:r>
+    </w:p>
+    <w:p>
+      <w:pPr>
+        <w:pStyle w:val="NormalWeb"/>
+        <w:shd w:val="clear" w:color="auto" w:fill="1E1F22"/>
+        <w:spacing w:before="0" w:beforeAutospacing="0" w:after="0" w:afterAutospacing="0"/>
+        <w:rPr>
+          <w:rFonts w:ascii="Consolas" w:hAnsi="Consolas"/>
+          <w:color w:val="CCCCCC"/>
+          <w:sz w:val="20"/>
+          <w:szCs w:val="20"/>
+        </w:rPr>
+      </w:pPr>
+      <w:r>
+        <w:rPr>
+          <w:rFonts w:ascii="Consolas" w:hAnsi="Consolas"/>
+          <w:color w:val="D9E8F7"/>
+          <w:sz w:val="20"/>
+          <w:szCs w:val="20"/>
+        </w:rPr>
+        <w:t xml:space="preserve">    </w:t>
+      </w:r>
+      <w:r>
+        <w:rPr>
+          <w:rFonts w:ascii="Consolas" w:hAnsi="Consolas"/>
+          <w:color w:val="CC6C1D"/>
+          <w:sz w:val="20"/>
+          <w:szCs w:val="20"/>
+        </w:rPr>
+        <w:t>void</w:t>
+      </w:r>
+      <w:r>
+        <w:rPr>
+          <w:rFonts w:ascii="Consolas" w:hAnsi="Consolas"/>
+          <w:color w:val="D9E8F7"/>
+          <w:sz w:val="20"/>
+          <w:szCs w:val="20"/>
+        </w:rPr>
+        <w:t xml:space="preserve"> </w:t>
+      </w:r>
+      <w:proofErr w:type="gramStart"/>
+      <w:r>
+        <w:rPr>
+          <w:rFonts w:ascii="Consolas" w:hAnsi="Consolas"/>
+          <w:color w:val="1EB540"/>
+          <w:sz w:val="20"/>
+          <w:szCs w:val="20"/>
+        </w:rPr>
+        <w:t>open</w:t>
+      </w:r>
+      <w:r>
+        <w:rPr>
+          <w:rFonts w:ascii="Consolas" w:hAnsi="Consolas"/>
+          <w:color w:val="F9FAF4"/>
+          <w:sz w:val="20"/>
+          <w:szCs w:val="20"/>
+        </w:rPr>
+        <w:t>(</w:t>
+      </w:r>
+      <w:proofErr w:type="gramEnd"/>
+      <w:r>
+        <w:rPr>
+          <w:rFonts w:ascii="Consolas" w:hAnsi="Consolas"/>
+          <w:color w:val="F9FAF4"/>
+          <w:sz w:val="20"/>
+          <w:szCs w:val="20"/>
+        </w:rPr>
+        <w:t>)</w:t>
+      </w:r>
+      <w:r>
+        <w:rPr>
+          <w:rFonts w:ascii="Consolas" w:hAnsi="Consolas"/>
+          <w:color w:val="E6E6FA"/>
+          <w:sz w:val="20"/>
+          <w:szCs w:val="20"/>
+        </w:rPr>
+        <w:t>;</w:t>
+      </w:r>
+    </w:p>
+    <w:p>
+      <w:pPr>
+        <w:pStyle w:val="NormalWeb"/>
+        <w:shd w:val="clear" w:color="auto" w:fill="1E1F22"/>
+        <w:spacing w:before="0" w:beforeAutospacing="0" w:after="0" w:afterAutospacing="0"/>
+        <w:rPr>
+          <w:rFonts w:ascii="Consolas" w:hAnsi="Consolas"/>
+          <w:color w:val="CCCCCC"/>
+          <w:sz w:val="20"/>
+          <w:szCs w:val="20"/>
+        </w:rPr>
+      </w:pPr>
+      <w:r>
+        <w:rPr>
+          <w:rFonts w:ascii="Consolas" w:hAnsi="Consolas"/>
+          <w:color w:val="F9FAF4"/>
+          <w:sz w:val="20"/>
+          <w:szCs w:val="20"/>
+        </w:rPr>
+        <w:t>}</w:t>
+      </w:r>
+    </w:p>
+    <w:p>
+      <w:pPr>
+        <w:rPr>
+          <w:b/>
+          <w:bCs/>
+        </w:rPr>
+      </w:pPr>
+      <w:r>
+        <w:rPr>
+          <w:b/>
+          <w:bCs/>
+        </w:rPr>
+        <w:t>DocumentFactory.java</w:t>
+      </w:r>
+    </w:p>
+    <w:p>
+      <w:pPr>
+        <w:pStyle w:val="NormalWeb"/>
+        <w:shd w:val="clear" w:color="auto" w:fill="1E1F22"/>
+        <w:spacing w:before="0" w:beforeAutospacing="0" w:after="0" w:afterAutospacing="0"/>
+        <w:rPr>
+          <w:rFonts w:ascii="Consolas" w:hAnsi="Consolas"/>
+          <w:color w:val="CCCCCC"/>
+          <w:sz w:val="20"/>
+          <w:szCs w:val="20"/>
+        </w:rPr>
+      </w:pPr>
+      <w:r>
+        <w:rPr>
+          <w:rFonts w:ascii="Consolas" w:hAnsi="Consolas"/>
+          <w:color w:val="CC6C1D"/>
+          <w:sz w:val="20"/>
+          <w:szCs w:val="20"/>
+        </w:rPr>
+        <w:t>package</w:t>
+      </w:r>
+      <w:r>
+        <w:rPr>
+          <w:rFonts w:ascii="Consolas" w:hAnsi="Consolas"/>
+          <w:color w:val="D9E8F7"/>
+          <w:sz w:val="20"/>
+          <w:szCs w:val="20"/>
+        </w:rPr>
+        <w:t xml:space="preserve"> </w:t>
+      </w:r>
+      <w:proofErr w:type="spellStart"/>
+      <w:proofErr w:type="gramStart"/>
+      <w:r>
+        <w:rPr>
+          <w:rFonts w:ascii="Consolas" w:hAnsi="Consolas"/>
+          <w:color w:val="D9E8F7"/>
+          <w:sz w:val="20"/>
+          <w:szCs w:val="20"/>
+        </w:rPr>
+        <w:t>com</w:t>
+      </w:r>
+      <w:r>
+        <w:rPr>
+          <w:rFonts w:ascii="Consolas" w:hAnsi="Consolas"/>
+          <w:color w:val="E6E6FA"/>
+          <w:sz w:val="20"/>
+          <w:szCs w:val="20"/>
+        </w:rPr>
+        <w:t>.</w:t>
+      </w:r>
+      <w:r>
+        <w:rPr>
+          <w:rFonts w:ascii="Consolas" w:hAnsi="Consolas"/>
+          <w:color w:val="D9E8F7"/>
+          <w:sz w:val="20"/>
+          <w:szCs w:val="20"/>
+        </w:rPr>
+        <w:t>result</w:t>
+      </w:r>
+      <w:proofErr w:type="gramEnd"/>
+      <w:r>
+        <w:rPr>
+          <w:rFonts w:ascii="Consolas" w:hAnsi="Consolas"/>
+          <w:color w:val="E6E6FA"/>
+          <w:sz w:val="20"/>
+          <w:szCs w:val="20"/>
+        </w:rPr>
+        <w:t>.</w:t>
+      </w:r>
+      <w:r>
+        <w:rPr>
+          <w:rFonts w:ascii="Consolas" w:hAnsi="Consolas"/>
+          <w:color w:val="D9E8F7"/>
+          <w:sz w:val="20"/>
+          <w:szCs w:val="20"/>
+        </w:rPr>
+        <w:t>factory</w:t>
+      </w:r>
+      <w:proofErr w:type="spellEnd"/>
+      <w:r>
+        <w:rPr>
+          <w:rFonts w:ascii="Consolas" w:hAnsi="Consolas"/>
+          <w:color w:val="E6E6FA"/>
+          <w:sz w:val="20"/>
+          <w:szCs w:val="20"/>
+        </w:rPr>
+        <w:t>;</w:t>
+      </w:r>
+    </w:p>
+    <w:p>
+      <w:pPr>
+        <w:pStyle w:val="NormalWeb"/>
+        <w:shd w:val="clear" w:color="auto" w:fill="1E1F22"/>
+        <w:spacing w:before="0" w:beforeAutospacing="0" w:after="0" w:afterAutospacing="0"/>
+        <w:rPr>
+          <w:rFonts w:ascii="Consolas" w:hAnsi="Consolas"/>
+          <w:color w:val="CCCCCC"/>
+          <w:sz w:val="20"/>
+          <w:szCs w:val="20"/>
+        </w:rPr>
+      </w:pPr>
+    </w:p>
+    <w:p>
+      <w:pPr>
+        <w:pStyle w:val="NormalWeb"/>
+        <w:shd w:val="clear" w:color="auto" w:fill="1E1F22"/>
+        <w:spacing w:before="0" w:beforeAutospacing="0" w:after="0" w:afterAutospacing="0"/>
+        <w:rPr>
+          <w:rFonts w:ascii="Consolas" w:hAnsi="Consolas"/>
+          <w:color w:val="CCCCCC"/>
+          <w:sz w:val="20"/>
+          <w:szCs w:val="20"/>
+        </w:rPr>
+      </w:pPr>
+      <w:r>
+        <w:rPr>
+          <w:rFonts w:ascii="Consolas" w:hAnsi="Consolas"/>
+          <w:color w:val="CC6C1D"/>
+          <w:sz w:val="20"/>
+          <w:szCs w:val="20"/>
+        </w:rPr>
+        <w:t>public</w:t>
+      </w:r>
+      <w:r>
+        <w:rPr>
+          <w:rFonts w:ascii="Consolas" w:hAnsi="Consolas"/>
+          <w:color w:val="D9E8F7"/>
+          <w:sz w:val="20"/>
+          <w:szCs w:val="20"/>
+        </w:rPr>
+        <w:t xml:space="preserve"> </w:t>
+      </w:r>
+      <w:r>
+        <w:rPr>
+          <w:rFonts w:ascii="Consolas" w:hAnsi="Consolas"/>
+          <w:color w:val="CC6C1D"/>
+          <w:sz w:val="20"/>
+          <w:szCs w:val="20"/>
+        </w:rPr>
+        <w:t>abstract</w:t>
+      </w:r>
+      <w:r>
+        <w:rPr>
+          <w:rFonts w:ascii="Consolas" w:hAnsi="Consolas"/>
+          <w:color w:val="D9E8F7"/>
+          <w:sz w:val="20"/>
+          <w:szCs w:val="20"/>
+        </w:rPr>
+        <w:t xml:space="preserve"> </w:t>
+      </w:r>
+      <w:r>
+        <w:rPr>
+          <w:rFonts w:ascii="Consolas" w:hAnsi="Consolas"/>
+          <w:color w:val="CC6C1D"/>
+          <w:sz w:val="20"/>
+          <w:szCs w:val="20"/>
+        </w:rPr>
+        <w:t>class</w:t>
+      </w:r>
+      <w:r>
+        <w:rPr>
+          <w:rFonts w:ascii="Consolas" w:hAnsi="Consolas"/>
+          <w:color w:val="D9E8F7"/>
+          <w:sz w:val="20"/>
+          <w:szCs w:val="20"/>
+        </w:rPr>
+        <w:t xml:space="preserve"> </w:t>
+      </w:r>
+      <w:proofErr w:type="spellStart"/>
+      <w:r>
+        <w:rPr>
+          <w:rFonts w:ascii="Consolas" w:hAnsi="Consolas"/>
+          <w:color w:val="3EABE6"/>
+          <w:sz w:val="20"/>
+          <w:szCs w:val="20"/>
+        </w:rPr>
+        <w:t>DocumentFactory</w:t>
+      </w:r>
+      <w:proofErr w:type="spellEnd"/>
+      <w:r>
+        <w:rPr>
+          <w:rFonts w:ascii="Consolas" w:hAnsi="Consolas"/>
+          <w:color w:val="D9E8F7"/>
+          <w:sz w:val="20"/>
+          <w:szCs w:val="20"/>
+        </w:rPr>
+        <w:t xml:space="preserve"> </w:t>
+      </w:r>
+      <w:r>
+        <w:rPr>
+          <w:rFonts w:ascii="Consolas" w:hAnsi="Consolas"/>
+          <w:color w:val="F9FAF4"/>
+          <w:sz w:val="20"/>
+          <w:szCs w:val="20"/>
+        </w:rPr>
+        <w:t>{</w:t>
+      </w:r>
+    </w:p>
+    <w:p>
+      <w:pPr>
+        <w:pStyle w:val="NormalWeb"/>
+        <w:shd w:val="clear" w:color="auto" w:fill="1E1F22"/>
+        <w:spacing w:before="0" w:beforeAutospacing="0" w:after="0" w:afterAutospacing="0"/>
+        <w:rPr>
+          <w:rFonts w:ascii="Consolas" w:hAnsi="Consolas"/>
+          <w:color w:val="CCCCCC"/>
+          <w:sz w:val="20"/>
+          <w:szCs w:val="20"/>
+        </w:rPr>
+      </w:pPr>
+    </w:p>
+    <w:p>
+      <w:pPr>
+        <w:pStyle w:val="NormalWeb"/>
+        <w:shd w:val="clear" w:color="auto" w:fill="1E1F22"/>
+        <w:spacing w:before="0" w:beforeAutospacing="0" w:after="0" w:afterAutospacing="0"/>
+        <w:rPr>
+          <w:rFonts w:ascii="Consolas" w:hAnsi="Consolas"/>
+          <w:color w:val="CCCCCC"/>
+          <w:sz w:val="20"/>
+          <w:szCs w:val="20"/>
+        </w:rPr>
+      </w:pPr>
+      <w:r>
+        <w:rPr>
+          <w:rFonts w:ascii="Consolas" w:hAnsi="Consolas"/>
+          <w:color w:val="D9E8F7"/>
+          <w:sz w:val="20"/>
+          <w:szCs w:val="20"/>
+        </w:rPr>
+        <w:t xml:space="preserve">    </w:t>
+      </w:r>
+      <w:r>
+        <w:rPr>
+          <w:rFonts w:ascii="Consolas" w:hAnsi="Consolas"/>
+          <w:color w:val="CC6C1D"/>
+          <w:sz w:val="20"/>
+          <w:szCs w:val="20"/>
+        </w:rPr>
+        <w:t>public</w:t>
+      </w:r>
+      <w:r>
+        <w:rPr>
+          <w:rFonts w:ascii="Consolas" w:hAnsi="Consolas"/>
+          <w:color w:val="D9E8F7"/>
+          <w:sz w:val="20"/>
+          <w:szCs w:val="20"/>
+        </w:rPr>
+        <w:t xml:space="preserve"> </w:t>
+      </w:r>
+      <w:r>
+        <w:rPr>
+          <w:rFonts w:ascii="Consolas" w:hAnsi="Consolas"/>
+          <w:color w:val="CC6C1D"/>
+          <w:sz w:val="20"/>
+          <w:szCs w:val="20"/>
+        </w:rPr>
+        <w:t>abstract</w:t>
+      </w:r>
+      <w:r>
+        <w:rPr>
+          <w:rFonts w:ascii="Consolas" w:hAnsi="Consolas"/>
+          <w:color w:val="D9E8F7"/>
+          <w:sz w:val="20"/>
+          <w:szCs w:val="20"/>
+        </w:rPr>
+        <w:t xml:space="preserve"> </w:t>
+      </w:r>
+      <w:r>
+        <w:rPr>
+          <w:rFonts w:ascii="Consolas" w:hAnsi="Consolas"/>
+          <w:color w:val="80F2F6"/>
+          <w:sz w:val="20"/>
+          <w:szCs w:val="20"/>
+        </w:rPr>
+        <w:t>Document</w:t>
+      </w:r>
+      <w:r>
+        <w:rPr>
+          <w:rFonts w:ascii="Consolas" w:hAnsi="Consolas"/>
+          <w:color w:val="D9E8F7"/>
+          <w:sz w:val="20"/>
+          <w:szCs w:val="20"/>
+        </w:rPr>
+        <w:t xml:space="preserve"> </w:t>
+      </w:r>
+      <w:proofErr w:type="spellStart"/>
+      <w:proofErr w:type="gramStart"/>
+      <w:r>
+        <w:rPr>
+          <w:rFonts w:ascii="Consolas" w:hAnsi="Consolas"/>
+          <w:color w:val="1EB540"/>
+          <w:sz w:val="20"/>
+          <w:szCs w:val="20"/>
+        </w:rPr>
+        <w:t>createDocument</w:t>
+      </w:r>
+      <w:proofErr w:type="spellEnd"/>
+      <w:r>
+        <w:rPr>
+          <w:rFonts w:ascii="Consolas" w:hAnsi="Consolas"/>
+          <w:color w:val="F9FAF4"/>
+          <w:sz w:val="20"/>
+          <w:szCs w:val="20"/>
+        </w:rPr>
+        <w:t>(</w:t>
+      </w:r>
+      <w:proofErr w:type="gramEnd"/>
+      <w:r>
+        <w:rPr>
+          <w:rFonts w:ascii="Consolas" w:hAnsi="Consolas"/>
+          <w:color w:val="F9FAF4"/>
+          <w:sz w:val="20"/>
+          <w:szCs w:val="20"/>
+        </w:rPr>
+        <w:t>)</w:t>
+      </w:r>
+      <w:r>
+        <w:rPr>
+          <w:rFonts w:ascii="Consolas" w:hAnsi="Consolas"/>
+          <w:color w:val="E6E6FA"/>
+          <w:sz w:val="20"/>
+          <w:szCs w:val="20"/>
+        </w:rPr>
+        <w:t>;</w:t>
+      </w:r>
+      <w:r>
+        <w:rPr>
+          <w:rFonts w:ascii="Consolas" w:hAnsi="Consolas"/>
+          <w:color w:val="F9FAF4"/>
+          <w:sz w:val="20"/>
+          <w:szCs w:val="20"/>
+        </w:rPr>
+        <w:t>}</w:t>
+      </w:r>
+    </w:p>
+    <w:p>
+      <w:pPr>
+        <w:rPr>
+          <w:b/>
+          <w:bCs/>
+        </w:rPr>
+      </w:pPr>
+      <w:r>
+        <w:rPr>
+          <w:b/>
+          <w:bCs/>
+        </w:rPr>
+        <w:lastRenderedPageBreak/>
+        <w:t>ExcelDocument.java</w:t>
+      </w:r>
+    </w:p>
+    <w:p>
+      <w:pPr>
+        <w:pStyle w:val="NormalWeb"/>
+        <w:shd w:val="clear" w:color="auto" w:fill="1E1F22"/>
+        <w:spacing w:before="0" w:beforeAutospacing="0" w:after="0" w:afterAutospacing="0"/>
+        <w:rPr>
+          <w:rFonts w:ascii="Consolas" w:hAnsi="Consolas"/>
+          <w:color w:val="CCCCCC"/>
+          <w:sz w:val="20"/>
+          <w:szCs w:val="20"/>
+        </w:rPr>
+      </w:pPr>
+      <w:r>
+        <w:rPr>
+          <w:rFonts w:ascii="Consolas" w:hAnsi="Consolas"/>
+          <w:color w:val="CC6C1D"/>
+          <w:sz w:val="20"/>
+          <w:szCs w:val="20"/>
+        </w:rPr>
+        <w:t>package</w:t>
+      </w:r>
+      <w:r>
+        <w:rPr>
+          <w:rFonts w:ascii="Consolas" w:hAnsi="Consolas"/>
+          <w:color w:val="D9E8F7"/>
+          <w:sz w:val="20"/>
+          <w:szCs w:val="20"/>
+        </w:rPr>
+        <w:t xml:space="preserve"> </w:t>
+      </w:r>
+      <w:proofErr w:type="spellStart"/>
+      <w:proofErr w:type="gramStart"/>
+      <w:r>
+        <w:rPr>
+          <w:rFonts w:ascii="Consolas" w:hAnsi="Consolas"/>
+          <w:color w:val="D9E8F7"/>
+          <w:sz w:val="20"/>
+          <w:szCs w:val="20"/>
+        </w:rPr>
+        <w:t>com</w:t>
+      </w:r>
+      <w:r>
+        <w:rPr>
+          <w:rFonts w:ascii="Consolas" w:hAnsi="Consolas"/>
+          <w:color w:val="E6E6FA"/>
+          <w:sz w:val="20"/>
+          <w:szCs w:val="20"/>
+        </w:rPr>
+        <w:t>.</w:t>
+      </w:r>
+      <w:r>
+        <w:rPr>
+          <w:rFonts w:ascii="Consolas" w:hAnsi="Consolas"/>
+          <w:color w:val="D9E8F7"/>
+          <w:sz w:val="20"/>
+          <w:szCs w:val="20"/>
+        </w:rPr>
+        <w:t>result</w:t>
+      </w:r>
+      <w:proofErr w:type="gramEnd"/>
+      <w:r>
+        <w:rPr>
+          <w:rFonts w:ascii="Consolas" w:hAnsi="Consolas"/>
+          <w:color w:val="E6E6FA"/>
+          <w:sz w:val="20"/>
+          <w:szCs w:val="20"/>
+        </w:rPr>
+        <w:t>.</w:t>
+      </w:r>
+      <w:r>
+        <w:rPr>
+          <w:rFonts w:ascii="Consolas" w:hAnsi="Consolas"/>
+          <w:color w:val="D9E8F7"/>
+          <w:sz w:val="20"/>
+          <w:szCs w:val="20"/>
+        </w:rPr>
+        <w:t>factory</w:t>
+      </w:r>
+      <w:proofErr w:type="spellEnd"/>
+      <w:r>
+        <w:rPr>
+          <w:rFonts w:ascii="Consolas" w:hAnsi="Consolas"/>
+          <w:color w:val="E6E6FA"/>
+          <w:sz w:val="20"/>
+          <w:szCs w:val="20"/>
+        </w:rPr>
+        <w:t>;</w:t>
+      </w:r>
+    </w:p>
+    <w:p>
+      <w:pPr>
+        <w:pStyle w:val="NormalWeb"/>
+        <w:shd w:val="clear" w:color="auto" w:fill="1E1F22"/>
+        <w:spacing w:before="0" w:beforeAutospacing="0" w:after="0" w:afterAutospacing="0"/>
+        <w:rPr>
+          <w:rFonts w:ascii="Consolas" w:hAnsi="Consolas"/>
+          <w:color w:val="CCCCCC"/>
+          <w:sz w:val="20"/>
+          <w:szCs w:val="20"/>
+        </w:rPr>
+      </w:pPr>
+    </w:p>
+    <w:p>
+      <w:pPr>
+        <w:pStyle w:val="NormalWeb"/>
+        <w:shd w:val="clear" w:color="auto" w:fill="1E1F22"/>
+        <w:spacing w:before="0" w:beforeAutospacing="0" w:after="0" w:afterAutospacing="0"/>
+        <w:rPr>
+          <w:rFonts w:ascii="Consolas" w:hAnsi="Consolas"/>
+          <w:color w:val="CCCCCC"/>
+          <w:sz w:val="20"/>
+          <w:szCs w:val="20"/>
+        </w:rPr>
+      </w:pPr>
+      <w:r>
+        <w:rPr>
+          <w:rFonts w:ascii="Consolas" w:hAnsi="Consolas"/>
+          <w:color w:val="CC6C1D"/>
+          <w:sz w:val="20"/>
+          <w:szCs w:val="20"/>
+        </w:rPr>
+        <w:t>public</w:t>
+      </w:r>
+      <w:r>
+        <w:rPr>
+          <w:rFonts w:ascii="Consolas" w:hAnsi="Consolas"/>
+          <w:color w:val="D9E8F7"/>
+          <w:sz w:val="20"/>
+          <w:szCs w:val="20"/>
+        </w:rPr>
+        <w:t xml:space="preserve"> </w:t>
+      </w:r>
+      <w:r>
+        <w:rPr>
+          <w:rFonts w:ascii="Consolas" w:hAnsi="Consolas"/>
+          <w:color w:val="CC6C1D"/>
+          <w:sz w:val="20"/>
+          <w:szCs w:val="20"/>
+        </w:rPr>
+        <w:t>class</w:t>
+      </w:r>
+      <w:r>
+        <w:rPr>
+          <w:rFonts w:ascii="Consolas" w:hAnsi="Consolas"/>
+          <w:color w:val="D9E8F7"/>
+          <w:sz w:val="20"/>
+          <w:szCs w:val="20"/>
+        </w:rPr>
+        <w:t xml:space="preserve"> </w:t>
+      </w:r>
+      <w:proofErr w:type="spellStart"/>
+      <w:r>
+        <w:rPr>
+          <w:rFonts w:ascii="Consolas" w:hAnsi="Consolas"/>
+          <w:color w:val="1290C3"/>
+          <w:sz w:val="20"/>
+          <w:szCs w:val="20"/>
+        </w:rPr>
+        <w:t>ExcelDocument</w:t>
+      </w:r>
+      <w:proofErr w:type="spellEnd"/>
+      <w:r>
+        <w:rPr>
+          <w:rFonts w:ascii="Consolas" w:hAnsi="Consolas"/>
+          <w:color w:val="D9E8F7"/>
+          <w:sz w:val="20"/>
+          <w:szCs w:val="20"/>
+        </w:rPr>
+        <w:t xml:space="preserve"> </w:t>
+      </w:r>
+      <w:r>
+        <w:rPr>
+          <w:rFonts w:ascii="Consolas" w:hAnsi="Consolas"/>
+          <w:color w:val="CC6C1D"/>
+          <w:sz w:val="20"/>
+          <w:szCs w:val="20"/>
+        </w:rPr>
+        <w:t>implements</w:t>
+      </w:r>
+      <w:r>
+        <w:rPr>
+          <w:rFonts w:ascii="Consolas" w:hAnsi="Consolas"/>
+          <w:color w:val="D9E8F7"/>
+          <w:sz w:val="20"/>
+          <w:szCs w:val="20"/>
+        </w:rPr>
+        <w:t xml:space="preserve"> </w:t>
+      </w:r>
+      <w:r>
+        <w:rPr>
+          <w:rFonts w:ascii="Consolas" w:hAnsi="Consolas"/>
+          <w:color w:val="80F2F6"/>
+          <w:sz w:val="20"/>
+          <w:szCs w:val="20"/>
+        </w:rPr>
+        <w:t>Document</w:t>
+      </w:r>
+      <w:r>
+        <w:rPr>
+          <w:rFonts w:ascii="Consolas" w:hAnsi="Consolas"/>
+          <w:color w:val="D9E8F7"/>
+          <w:sz w:val="20"/>
+          <w:szCs w:val="20"/>
+        </w:rPr>
+        <w:t xml:space="preserve"> </w:t>
+      </w:r>
+      <w:r>
+        <w:rPr>
+          <w:rFonts w:ascii="Consolas" w:hAnsi="Consolas"/>
+          <w:color w:val="F9FAF4"/>
+          <w:sz w:val="20"/>
+          <w:szCs w:val="20"/>
+        </w:rPr>
+        <w:t>{</w:t>
+      </w:r>
+    </w:p>
+    <w:p>
+      <w:pPr>
+        <w:pStyle w:val="NormalWeb"/>
+        <w:shd w:val="clear" w:color="auto" w:fill="1E1F22"/>
+        <w:spacing w:before="0" w:beforeAutospacing="0" w:after="0" w:afterAutospacing="0"/>
+        <w:rPr>
+          <w:rFonts w:ascii="Consolas" w:hAnsi="Consolas"/>
+          <w:color w:val="CCCCCC"/>
+          <w:sz w:val="20"/>
+          <w:szCs w:val="20"/>
+        </w:rPr>
+      </w:pPr>
+    </w:p>
+    <w:p>
+      <w:pPr>
+        <w:pStyle w:val="NormalWeb"/>
+        <w:shd w:val="clear" w:color="auto" w:fill="1E1F22"/>
+        <w:spacing w:before="0" w:beforeAutospacing="0" w:after="0" w:afterAutospacing="0"/>
+        <w:rPr>
+          <w:rFonts w:ascii="Consolas" w:hAnsi="Consolas"/>
+          <w:color w:val="CCCCCC"/>
+          <w:sz w:val="20"/>
+          <w:szCs w:val="20"/>
+        </w:rPr>
+      </w:pPr>
+      <w:r>
+        <w:rPr>
+          <w:rFonts w:ascii="Consolas" w:hAnsi="Consolas"/>
+          <w:color w:val="D9E8F7"/>
+          <w:sz w:val="20"/>
+          <w:szCs w:val="20"/>
+        </w:rPr>
+        <w:t xml:space="preserve">    </w:t>
+      </w:r>
+      <w:r>
+        <w:rPr>
+          <w:rFonts w:ascii="Consolas" w:hAnsi="Consolas"/>
+          <w:i/>
+          <w:iCs/>
+          <w:color w:val="A0A0A0"/>
+          <w:sz w:val="20"/>
+          <w:szCs w:val="20"/>
+        </w:rPr>
+        <w:t>@Override</w:t>
+      </w:r>
+    </w:p>
+    <w:p>
+      <w:pPr>
+        <w:pStyle w:val="NormalWeb"/>
+        <w:shd w:val="clear" w:color="auto" w:fill="1E1F22"/>
+        <w:spacing w:before="0" w:beforeAutospacing="0" w:after="0" w:afterAutospacing="0"/>
+        <w:rPr>
+          <w:rFonts w:ascii="Consolas" w:hAnsi="Consolas"/>
+          <w:color w:val="CCCCCC"/>
+          <w:sz w:val="20"/>
+          <w:szCs w:val="20"/>
+        </w:rPr>
+      </w:pPr>
+      <w:r>
+        <w:rPr>
+          <w:rFonts w:ascii="Consolas" w:hAnsi="Consolas"/>
+          <w:color w:val="D9E8F7"/>
+          <w:sz w:val="20"/>
+          <w:szCs w:val="20"/>
+        </w:rPr>
+        <w:t xml:space="preserve">    </w:t>
+      </w:r>
+      <w:r>
+        <w:rPr>
+          <w:rFonts w:ascii="Consolas" w:hAnsi="Consolas"/>
+          <w:color w:val="CC6C1D"/>
+          <w:sz w:val="20"/>
+          <w:szCs w:val="20"/>
+        </w:rPr>
+        <w:t>public</w:t>
+      </w:r>
+      <w:r>
+        <w:rPr>
+          <w:rFonts w:ascii="Consolas" w:hAnsi="Consolas"/>
+          <w:color w:val="D9E8F7"/>
+          <w:sz w:val="20"/>
+          <w:szCs w:val="20"/>
+        </w:rPr>
+        <w:t xml:space="preserve"> </w:t>
+      </w:r>
+      <w:r>
+        <w:rPr>
+          <w:rFonts w:ascii="Consolas" w:hAnsi="Consolas"/>
+          <w:color w:val="CC6C1D"/>
+          <w:sz w:val="20"/>
+          <w:szCs w:val="20"/>
+        </w:rPr>
+        <w:t>void</w:t>
+      </w:r>
+      <w:r>
+        <w:rPr>
+          <w:rFonts w:ascii="Consolas" w:hAnsi="Consolas"/>
+          <w:color w:val="D9E8F7"/>
+          <w:sz w:val="20"/>
+          <w:szCs w:val="20"/>
+        </w:rPr>
+        <w:t xml:space="preserve"> </w:t>
+      </w:r>
+      <w:proofErr w:type="gramStart"/>
+      <w:r>
+        <w:rPr>
+          <w:rFonts w:ascii="Consolas" w:hAnsi="Consolas"/>
+          <w:color w:val="1EB540"/>
+          <w:sz w:val="20"/>
+          <w:szCs w:val="20"/>
+        </w:rPr>
+        <w:t>open</w:t>
+      </w:r>
+      <w:r>
+        <w:rPr>
+          <w:rFonts w:ascii="Consolas" w:hAnsi="Consolas"/>
+          <w:color w:val="F9FAF4"/>
+          <w:sz w:val="20"/>
+          <w:szCs w:val="20"/>
+        </w:rPr>
+        <w:t>(</w:t>
+      </w:r>
+      <w:proofErr w:type="gramEnd"/>
+      <w:r>
+        <w:rPr>
+          <w:rFonts w:ascii="Consolas" w:hAnsi="Consolas"/>
+          <w:color w:val="F9FAF4"/>
+          <w:sz w:val="20"/>
+          <w:szCs w:val="20"/>
+        </w:rPr>
+        <w:t>)</w:t>
+      </w:r>
+      <w:r>
+        <w:rPr>
+          <w:rFonts w:ascii="Consolas" w:hAnsi="Consolas"/>
+          <w:color w:val="D9E8F7"/>
+          <w:sz w:val="20"/>
+          <w:szCs w:val="20"/>
+        </w:rPr>
+        <w:t xml:space="preserve"> </w:t>
+      </w:r>
+      <w:r>
+        <w:rPr>
+          <w:rFonts w:ascii="Consolas" w:hAnsi="Consolas"/>
+          <w:color w:val="F9FAF4"/>
+          <w:sz w:val="20"/>
+          <w:szCs w:val="20"/>
+        </w:rPr>
+        <w:t>{</w:t>
+      </w:r>
+    </w:p>
+    <w:p>
+      <w:pPr>
+        <w:pStyle w:val="NormalWeb"/>
+        <w:shd w:val="clear" w:color="auto" w:fill="1E1F22"/>
+        <w:spacing w:before="0" w:beforeAutospacing="0" w:after="0" w:afterAutospacing="0"/>
+        <w:rPr>
+          <w:rFonts w:ascii="Consolas" w:hAnsi="Consolas"/>
+          <w:color w:val="CCCCCC"/>
+          <w:sz w:val="20"/>
+          <w:szCs w:val="20"/>
+        </w:rPr>
+      </w:pPr>
+      <w:r>
+        <w:rPr>
+          <w:rFonts w:ascii="Consolas" w:hAnsi="Consolas"/>
+          <w:color w:val="D9E8F7"/>
+          <w:sz w:val="20"/>
+          <w:szCs w:val="20"/>
+        </w:rPr>
+        <w:t xml:space="preserve">        </w:t>
+      </w:r>
+      <w:proofErr w:type="spellStart"/>
+      <w:r>
+        <w:rPr>
+          <w:rFonts w:ascii="Consolas" w:hAnsi="Consolas"/>
+          <w:color w:val="1290C3"/>
+          <w:sz w:val="20"/>
+          <w:szCs w:val="20"/>
+        </w:rPr>
+        <w:t>System</w:t>
+      </w:r>
+      <w:r>
+        <w:rPr>
+          <w:rFonts w:ascii="Consolas" w:hAnsi="Consolas"/>
+          <w:color w:val="E6E6FA"/>
+          <w:sz w:val="20"/>
+          <w:szCs w:val="20"/>
+        </w:rPr>
+        <w:t>.</w:t>
+      </w:r>
+      <w:r>
+        <w:rPr>
+          <w:rFonts w:ascii="Consolas" w:hAnsi="Consolas"/>
+          <w:b/>
+          <w:bCs/>
+          <w:i/>
+          <w:iCs/>
+          <w:color w:val="8DDAF8"/>
+          <w:sz w:val="20"/>
+          <w:szCs w:val="20"/>
+        </w:rPr>
+        <w:t>out</w:t>
+      </w:r>
+      <w:r>
+        <w:rPr>
+          <w:rFonts w:ascii="Consolas" w:hAnsi="Consolas"/>
+          <w:color w:val="E6E6FA"/>
+          <w:sz w:val="20"/>
+          <w:szCs w:val="20"/>
+        </w:rPr>
+        <w:t>.</w:t>
+      </w:r>
+      <w:r>
+        <w:rPr>
+          <w:rFonts w:ascii="Consolas" w:hAnsi="Consolas"/>
+          <w:color w:val="A7EC21"/>
+          <w:sz w:val="20"/>
+          <w:szCs w:val="20"/>
+        </w:rPr>
+        <w:t>println</w:t>
+      </w:r>
+      <w:proofErr w:type="spellEnd"/>
+      <w:r>
+        <w:rPr>
+          <w:rFonts w:ascii="Consolas" w:hAnsi="Consolas"/>
+          <w:color w:val="F9FAF4"/>
+          <w:sz w:val="20"/>
+          <w:szCs w:val="20"/>
+        </w:rPr>
+        <w:t>(</w:t>
+      </w:r>
+      <w:r>
+        <w:rPr>
+          <w:rFonts w:ascii="Consolas" w:hAnsi="Consolas"/>
+          <w:color w:val="17C6A3"/>
+          <w:sz w:val="20"/>
+          <w:szCs w:val="20"/>
+        </w:rPr>
+        <w:t>"Opening Excel Document"</w:t>
+      </w:r>
+      <w:r>
+        <w:rPr>
+          <w:rFonts w:ascii="Consolas" w:hAnsi="Consolas"/>
+          <w:color w:val="F9FAF4"/>
+          <w:sz w:val="20"/>
+          <w:szCs w:val="20"/>
+        </w:rPr>
+        <w:t>)</w:t>
+      </w:r>
+      <w:r>
+        <w:rPr>
+          <w:rFonts w:ascii="Consolas" w:hAnsi="Consolas"/>
+          <w:color w:val="E6E6FA"/>
+          <w:sz w:val="20"/>
+          <w:szCs w:val="20"/>
+        </w:rPr>
+        <w:t>;</w:t>
+      </w:r>
+    </w:p>
+    <w:p>
+      <w:pPr>
+        <w:pStyle w:val="NormalWeb"/>
+        <w:shd w:val="clear" w:color="auto" w:fill="1E1F22"/>
+        <w:spacing w:before="0" w:beforeAutospacing="0" w:after="0" w:afterAutospacing="0"/>
+        <w:rPr>
+          <w:rFonts w:ascii="Consolas" w:hAnsi="Consolas"/>
+          <w:color w:val="CCCCCC"/>
+          <w:sz w:val="20"/>
+          <w:szCs w:val="20"/>
+        </w:rPr>
+      </w:pPr>
+      <w:r>
+        <w:rPr>
+          <w:rFonts w:ascii="Consolas" w:hAnsi="Consolas"/>
+          <w:color w:val="D9E8F7"/>
+          <w:sz w:val="20"/>
+          <w:szCs w:val="20"/>
+        </w:rPr>
+        <w:t xml:space="preserve">    </w:t>
+      </w:r>
+      <w:r>
+        <w:rPr>
+          <w:rFonts w:ascii="Consolas" w:hAnsi="Consolas"/>
+          <w:color w:val="F9FAF4"/>
+          <w:sz w:val="20"/>
+          <w:szCs w:val="20"/>
+        </w:rPr>
+        <w:t>}</w:t>
+      </w:r>
+    </w:p>
+    <w:p>
+      <w:pPr>
+        <w:pStyle w:val="NormalWeb"/>
+        <w:shd w:val="clear" w:color="auto" w:fill="1E1F22"/>
+        <w:spacing w:before="0" w:beforeAutospacing="0" w:after="0" w:afterAutospacing="0"/>
+        <w:rPr>
+          <w:rFonts w:ascii="Consolas" w:hAnsi="Consolas"/>
+          <w:color w:val="CCCCCC"/>
+          <w:sz w:val="20"/>
+          <w:szCs w:val="20"/>
+        </w:rPr>
+      </w:pPr>
+      <w:r>
+        <w:rPr>
+          <w:rFonts w:ascii="Consolas" w:hAnsi="Consolas"/>
+          <w:color w:val="F9FAF4"/>
+          <w:sz w:val="20"/>
+          <w:szCs w:val="20"/>
+        </w:rPr>
+        <w:t>}</w:t>
+      </w:r>
+    </w:p>
+    <w:p>
+      <w:pPr>
+        <w:rPr>
+          <w:b/>
+          <w:bCs/>
+        </w:rPr>
+      </w:pPr>
+    </w:p>
+    <w:p>
+      <w:pPr>
+        <w:rPr>
+          <w:b/>
+          <w:bCs/>
+        </w:rPr>
+      </w:pPr>
+      <w:r>
+        <w:rPr>
+          <w:b/>
+          <w:bCs/>
+        </w:rPr>
+        <w:t>ExcelFactory.java</w:t>
+      </w:r>
+    </w:p>
+    <w:p>
+      <w:pPr>
+        <w:pStyle w:val="NormalWeb"/>
+        <w:shd w:val="clear" w:color="auto" w:fill="1E1F22"/>
+        <w:spacing w:before="0" w:beforeAutospacing="0" w:after="0" w:afterAutospacing="0"/>
+        <w:rPr>
+          <w:rFonts w:ascii="Consolas" w:hAnsi="Consolas"/>
+          <w:color w:val="CCCCCC"/>
+          <w:sz w:val="20"/>
+          <w:szCs w:val="20"/>
+        </w:rPr>
+      </w:pPr>
+      <w:r>
+        <w:rPr>
+          <w:rFonts w:ascii="Consolas" w:hAnsi="Consolas"/>
+          <w:color w:val="CC6C1D"/>
+          <w:sz w:val="20"/>
+          <w:szCs w:val="20"/>
+        </w:rPr>
+        <w:t>package</w:t>
+      </w:r>
+      <w:r>
+        <w:rPr>
+          <w:rFonts w:ascii="Consolas" w:hAnsi="Consolas"/>
+          <w:color w:val="D9E8F7"/>
+          <w:sz w:val="20"/>
+          <w:szCs w:val="20"/>
+        </w:rPr>
+        <w:t xml:space="preserve"> </w:t>
+      </w:r>
+      <w:proofErr w:type="spellStart"/>
+      <w:proofErr w:type="gramStart"/>
+      <w:r>
+        <w:rPr>
+          <w:rFonts w:ascii="Consolas" w:hAnsi="Consolas"/>
+          <w:color w:val="D9E8F7"/>
+          <w:sz w:val="20"/>
+          <w:szCs w:val="20"/>
+        </w:rPr>
+        <w:t>com</w:t>
+      </w:r>
+      <w:r>
+        <w:rPr>
+          <w:rFonts w:ascii="Consolas" w:hAnsi="Consolas"/>
+          <w:color w:val="E6E6FA"/>
+          <w:sz w:val="20"/>
+          <w:szCs w:val="20"/>
+        </w:rPr>
+        <w:t>.</w:t>
+      </w:r>
+      <w:r>
+        <w:rPr>
+          <w:rFonts w:ascii="Consolas" w:hAnsi="Consolas"/>
+          <w:color w:val="D9E8F7"/>
+          <w:sz w:val="20"/>
+          <w:szCs w:val="20"/>
+        </w:rPr>
+        <w:t>result</w:t>
+      </w:r>
+      <w:proofErr w:type="gramEnd"/>
+      <w:r>
+        <w:rPr>
+          <w:rFonts w:ascii="Consolas" w:hAnsi="Consolas"/>
+          <w:color w:val="E6E6FA"/>
+          <w:sz w:val="20"/>
+          <w:szCs w:val="20"/>
+        </w:rPr>
+        <w:t>.</w:t>
+      </w:r>
+      <w:r>
+        <w:rPr>
+          <w:rFonts w:ascii="Consolas" w:hAnsi="Consolas"/>
+          <w:color w:val="D9E8F7"/>
+          <w:sz w:val="20"/>
+          <w:szCs w:val="20"/>
+        </w:rPr>
+        <w:t>factory</w:t>
+      </w:r>
+      <w:proofErr w:type="spellEnd"/>
+      <w:r>
+        <w:rPr>
+          <w:rFonts w:ascii="Consolas" w:hAnsi="Consolas"/>
+          <w:color w:val="E6E6FA"/>
+          <w:sz w:val="20"/>
+          <w:szCs w:val="20"/>
+        </w:rPr>
+        <w:t>;</w:t>
+      </w:r>
+    </w:p>
+    <w:p>
+      <w:pPr>
+        <w:pStyle w:val="NormalWeb"/>
+        <w:shd w:val="clear" w:color="auto" w:fill="1E1F22"/>
+        <w:spacing w:before="0" w:beforeAutospacing="0" w:after="0" w:afterAutospacing="0"/>
+        <w:rPr>
+          <w:rFonts w:ascii="Consolas" w:hAnsi="Consolas"/>
+          <w:color w:val="CCCCCC"/>
+          <w:sz w:val="20"/>
+          <w:szCs w:val="20"/>
+        </w:rPr>
+      </w:pPr>
+    </w:p>
+    <w:p>
+      <w:pPr>
+        <w:pStyle w:val="NormalWeb"/>
+        <w:shd w:val="clear" w:color="auto" w:fill="1E1F22"/>
+        <w:spacing w:before="0" w:beforeAutospacing="0" w:after="0" w:afterAutospacing="0"/>
+        <w:rPr>
+          <w:rFonts w:ascii="Consolas" w:hAnsi="Consolas"/>
+          <w:color w:val="CCCCCC"/>
+          <w:sz w:val="20"/>
+          <w:szCs w:val="20"/>
+        </w:rPr>
+      </w:pPr>
+      <w:r>
+        <w:rPr>
+          <w:rFonts w:ascii="Consolas" w:hAnsi="Consolas"/>
+          <w:color w:val="CC6C1D"/>
+          <w:sz w:val="20"/>
+          <w:szCs w:val="20"/>
+        </w:rPr>
+        <w:t>public</w:t>
+      </w:r>
+      <w:r>
+        <w:rPr>
+          <w:rFonts w:ascii="Consolas" w:hAnsi="Consolas"/>
+          <w:color w:val="D9E8F7"/>
+          <w:sz w:val="20"/>
+          <w:szCs w:val="20"/>
+        </w:rPr>
+        <w:t xml:space="preserve"> </w:t>
+      </w:r>
+      <w:r>
+        <w:rPr>
+          <w:rFonts w:ascii="Consolas" w:hAnsi="Consolas"/>
+          <w:color w:val="CC6C1D"/>
+          <w:sz w:val="20"/>
+          <w:szCs w:val="20"/>
+        </w:rPr>
+        <w:t>class</w:t>
+      </w:r>
+      <w:r>
+        <w:rPr>
+          <w:rFonts w:ascii="Consolas" w:hAnsi="Consolas"/>
+          <w:color w:val="D9E8F7"/>
+          <w:sz w:val="20"/>
+          <w:szCs w:val="20"/>
+        </w:rPr>
+        <w:t xml:space="preserve"> </w:t>
+      </w:r>
+      <w:proofErr w:type="spellStart"/>
+      <w:r>
+        <w:rPr>
+          <w:rFonts w:ascii="Consolas" w:hAnsi="Consolas"/>
+          <w:color w:val="1290C3"/>
+          <w:sz w:val="20"/>
+          <w:szCs w:val="20"/>
+        </w:rPr>
+        <w:t>ExcelFactory</w:t>
+      </w:r>
+      <w:proofErr w:type="spellEnd"/>
+      <w:r>
+        <w:rPr>
+          <w:rFonts w:ascii="Consolas" w:hAnsi="Consolas"/>
+          <w:color w:val="D9E8F7"/>
+          <w:sz w:val="20"/>
+          <w:szCs w:val="20"/>
+        </w:rPr>
+        <w:t xml:space="preserve"> </w:t>
+      </w:r>
+      <w:r>
+        <w:rPr>
+          <w:rFonts w:ascii="Consolas" w:hAnsi="Consolas"/>
+          <w:color w:val="CC6C1D"/>
+          <w:sz w:val="20"/>
+          <w:szCs w:val="20"/>
+        </w:rPr>
+        <w:t>extends</w:t>
+      </w:r>
+      <w:r>
+        <w:rPr>
+          <w:rFonts w:ascii="Consolas" w:hAnsi="Consolas"/>
+          <w:color w:val="D9E8F7"/>
+          <w:sz w:val="20"/>
+          <w:szCs w:val="20"/>
+        </w:rPr>
+        <w:t xml:space="preserve"> </w:t>
+      </w:r>
+      <w:proofErr w:type="spellStart"/>
+      <w:r>
+        <w:rPr>
+          <w:rFonts w:ascii="Consolas" w:hAnsi="Consolas"/>
+          <w:color w:val="3EABE6"/>
+          <w:sz w:val="20"/>
+          <w:szCs w:val="20"/>
+        </w:rPr>
+        <w:t>DocumentFactory</w:t>
+      </w:r>
+      <w:proofErr w:type="spellEnd"/>
+      <w:r>
+        <w:rPr>
+          <w:rFonts w:ascii="Consolas" w:hAnsi="Consolas"/>
+          <w:color w:val="D9E8F7"/>
+          <w:sz w:val="20"/>
+          <w:szCs w:val="20"/>
+        </w:rPr>
+        <w:t xml:space="preserve"> </w:t>
+      </w:r>
+      <w:r>
+        <w:rPr>
+          <w:rFonts w:ascii="Consolas" w:hAnsi="Consolas"/>
+          <w:color w:val="F9FAF4"/>
+          <w:sz w:val="20"/>
+          <w:szCs w:val="20"/>
+        </w:rPr>
+        <w:t>{</w:t>
+      </w:r>
+    </w:p>
+    <w:p>
+      <w:pPr>
+        <w:pStyle w:val="NormalWeb"/>
+        <w:shd w:val="clear" w:color="auto" w:fill="1E1F22"/>
+        <w:spacing w:before="0" w:beforeAutospacing="0" w:after="0" w:afterAutospacing="0"/>
+        <w:rPr>
+          <w:rFonts w:ascii="Consolas" w:hAnsi="Consolas"/>
+          <w:color w:val="CCCCCC"/>
+          <w:sz w:val="20"/>
+          <w:szCs w:val="20"/>
+        </w:rPr>
+      </w:pPr>
+    </w:p>
+    <w:p>
+      <w:pPr>
+        <w:pStyle w:val="NormalWeb"/>
+        <w:shd w:val="clear" w:color="auto" w:fill="1E1F22"/>
+        <w:spacing w:before="0" w:beforeAutospacing="0" w:after="0" w:afterAutospacing="0"/>
+        <w:rPr>
+          <w:rFonts w:ascii="Consolas" w:hAnsi="Consolas"/>
+          <w:color w:val="CCCCCC"/>
+          <w:sz w:val="20"/>
+          <w:szCs w:val="20"/>
+        </w:rPr>
+      </w:pPr>
+      <w:r>
+        <w:rPr>
+          <w:rFonts w:ascii="Consolas" w:hAnsi="Consolas"/>
+          <w:color w:val="D9E8F7"/>
+          <w:sz w:val="20"/>
+          <w:szCs w:val="20"/>
+        </w:rPr>
+        <w:t xml:space="preserve">    </w:t>
+      </w:r>
+      <w:r>
+        <w:rPr>
+          <w:rFonts w:ascii="Consolas" w:hAnsi="Consolas"/>
+          <w:i/>
+          <w:iCs/>
+          <w:color w:val="A0A0A0"/>
+          <w:sz w:val="20"/>
+          <w:szCs w:val="20"/>
+        </w:rPr>
+        <w:t>@Override</w:t>
+      </w:r>
+    </w:p>
+    <w:p>
+      <w:pPr>
+        <w:pStyle w:val="NormalWeb"/>
+        <w:shd w:val="clear" w:color="auto" w:fill="1E1F22"/>
+        <w:spacing w:before="0" w:beforeAutospacing="0" w:after="0" w:afterAutospacing="0"/>
+        <w:rPr>
+          <w:rFonts w:ascii="Consolas" w:hAnsi="Consolas"/>
+          <w:color w:val="CCCCCC"/>
+          <w:sz w:val="20"/>
+          <w:szCs w:val="20"/>
+        </w:rPr>
+      </w:pPr>
+      <w:r>
+        <w:rPr>
+          <w:rFonts w:ascii="Consolas" w:hAnsi="Consolas"/>
+          <w:color w:val="D9E8F7"/>
+          <w:sz w:val="20"/>
+          <w:szCs w:val="20"/>
+        </w:rPr>
+        <w:t xml:space="preserve">    </w:t>
+      </w:r>
+      <w:r>
+        <w:rPr>
+          <w:rFonts w:ascii="Consolas" w:hAnsi="Consolas"/>
+          <w:color w:val="CC6C1D"/>
+          <w:sz w:val="20"/>
+          <w:szCs w:val="20"/>
+        </w:rPr>
+        <w:t>public</w:t>
+      </w:r>
+      <w:r>
+        <w:rPr>
+          <w:rFonts w:ascii="Consolas" w:hAnsi="Consolas"/>
+          <w:color w:val="D9E8F7"/>
+          <w:sz w:val="20"/>
+          <w:szCs w:val="20"/>
+        </w:rPr>
+        <w:t xml:space="preserve"> </w:t>
+      </w:r>
+      <w:r>
+        <w:rPr>
+          <w:rFonts w:ascii="Consolas" w:hAnsi="Consolas"/>
+          <w:color w:val="80F2F6"/>
+          <w:sz w:val="20"/>
+          <w:szCs w:val="20"/>
+        </w:rPr>
+        <w:t>Document</w:t>
+      </w:r>
+      <w:r>
+        <w:rPr>
+          <w:rFonts w:ascii="Consolas" w:hAnsi="Consolas"/>
+          <w:color w:val="D9E8F7"/>
+          <w:sz w:val="20"/>
+          <w:szCs w:val="20"/>
+        </w:rPr>
+        <w:t xml:space="preserve"> </w:t>
+      </w:r>
+      <w:proofErr w:type="spellStart"/>
+      <w:proofErr w:type="gramStart"/>
+      <w:r>
+        <w:rPr>
+          <w:rFonts w:ascii="Consolas" w:hAnsi="Consolas"/>
+          <w:color w:val="1EB540"/>
+          <w:sz w:val="20"/>
+          <w:szCs w:val="20"/>
+        </w:rPr>
+        <w:t>createDocument</w:t>
+      </w:r>
+      <w:proofErr w:type="spellEnd"/>
+      <w:r>
+        <w:rPr>
+          <w:rFonts w:ascii="Consolas" w:hAnsi="Consolas"/>
+          <w:color w:val="F9FAF4"/>
+          <w:sz w:val="20"/>
+          <w:szCs w:val="20"/>
+        </w:rPr>
+        <w:t>(</w:t>
+      </w:r>
+      <w:proofErr w:type="gramEnd"/>
+      <w:r>
+        <w:rPr>
+          <w:rFonts w:ascii="Consolas" w:hAnsi="Consolas"/>
+          <w:color w:val="F9FAF4"/>
+          <w:sz w:val="20"/>
+          <w:szCs w:val="20"/>
+        </w:rPr>
+        <w:t>)</w:t>
+      </w:r>
+      <w:r>
+        <w:rPr>
+          <w:rFonts w:ascii="Consolas" w:hAnsi="Consolas"/>
+          <w:color w:val="D9E8F7"/>
+          <w:sz w:val="20"/>
+          <w:szCs w:val="20"/>
+        </w:rPr>
+        <w:t xml:space="preserve"> </w:t>
+      </w:r>
+      <w:r>
+        <w:rPr>
+          <w:rFonts w:ascii="Consolas" w:hAnsi="Consolas"/>
+          <w:color w:val="F9FAF4"/>
+          <w:sz w:val="20"/>
+          <w:szCs w:val="20"/>
+        </w:rPr>
+        <w:t>{</w:t>
+      </w:r>
+    </w:p>
+    <w:p>
+      <w:pPr>
+        <w:pStyle w:val="NormalWeb"/>
+        <w:shd w:val="clear" w:color="auto" w:fill="1E1F22"/>
+        <w:spacing w:before="0" w:beforeAutospacing="0" w:after="0" w:afterAutospacing="0"/>
+        <w:rPr>
+          <w:rFonts w:ascii="Consolas" w:hAnsi="Consolas"/>
+          <w:color w:val="CCCCCC"/>
+          <w:sz w:val="20"/>
+          <w:szCs w:val="20"/>
+        </w:rPr>
+      </w:pPr>
+      <w:r>
+        <w:rPr>
+          <w:rFonts w:ascii="Consolas" w:hAnsi="Consolas"/>
+          <w:color w:val="D9E8F7"/>
+          <w:sz w:val="20"/>
+          <w:szCs w:val="20"/>
+        </w:rPr>
+        <w:t xml:space="preserve">        </w:t>
+      </w:r>
+      <w:r>
+        <w:rPr>
+          <w:rFonts w:ascii="Consolas" w:hAnsi="Consolas"/>
+          <w:color w:val="CC6C1D"/>
+          <w:sz w:val="20"/>
+          <w:szCs w:val="20"/>
+        </w:rPr>
+        <w:t>return</w:t>
+      </w:r>
+      <w:r>
+        <w:rPr>
+          <w:rFonts w:ascii="Consolas" w:hAnsi="Consolas"/>
+          <w:color w:val="D9E8F7"/>
+          <w:sz w:val="20"/>
+          <w:szCs w:val="20"/>
+        </w:rPr>
+        <w:t xml:space="preserve"> </w:t>
+      </w:r>
+      <w:r>
+        <w:rPr>
+          <w:rFonts w:ascii="Consolas" w:hAnsi="Consolas"/>
+          <w:color w:val="CC6C1D"/>
+          <w:sz w:val="20"/>
+          <w:szCs w:val="20"/>
+        </w:rPr>
+        <w:t>new</w:t>
+      </w:r>
+      <w:r>
+        <w:rPr>
+          <w:rFonts w:ascii="Consolas" w:hAnsi="Consolas"/>
+          <w:color w:val="D9E8F7"/>
+          <w:sz w:val="20"/>
+          <w:szCs w:val="20"/>
+        </w:rPr>
+        <w:t xml:space="preserve"> </w:t>
+      </w:r>
+      <w:proofErr w:type="spellStart"/>
+      <w:proofErr w:type="gramStart"/>
+      <w:r>
+        <w:rPr>
+          <w:rFonts w:ascii="Consolas" w:hAnsi="Consolas"/>
+          <w:color w:val="A7EC21"/>
+          <w:sz w:val="20"/>
+          <w:szCs w:val="20"/>
+        </w:rPr>
+        <w:t>ExcelDocument</w:t>
+      </w:r>
+      <w:proofErr w:type="spellEnd"/>
+      <w:r>
+        <w:rPr>
+          <w:rFonts w:ascii="Consolas" w:hAnsi="Consolas"/>
+          <w:color w:val="F9FAF4"/>
+          <w:sz w:val="20"/>
+          <w:szCs w:val="20"/>
+        </w:rPr>
+        <w:t>(</w:t>
+      </w:r>
+      <w:proofErr w:type="gramEnd"/>
+      <w:r>
+        <w:rPr>
+          <w:rFonts w:ascii="Consolas" w:hAnsi="Consolas"/>
+          <w:color w:val="F9FAF4"/>
+          <w:sz w:val="20"/>
+          <w:szCs w:val="20"/>
+        </w:rPr>
+        <w:t>)</w:t>
+      </w:r>
+      <w:r>
+        <w:rPr>
+          <w:rFonts w:ascii="Consolas" w:hAnsi="Consolas"/>
+          <w:color w:val="E6E6FA"/>
+          <w:sz w:val="20"/>
+          <w:szCs w:val="20"/>
+        </w:rPr>
+        <w:t>;</w:t>
+      </w:r>
+    </w:p>
+    <w:p>
+      <w:pPr>
+        <w:pStyle w:val="NormalWeb"/>
+        <w:shd w:val="clear" w:color="auto" w:fill="1E1F22"/>
+        <w:spacing w:before="0" w:beforeAutospacing="0" w:after="0" w:afterAutospacing="0"/>
+        <w:rPr>
+          <w:rFonts w:ascii="Consolas" w:hAnsi="Consolas"/>
+          <w:color w:val="CCCCCC"/>
+          <w:sz w:val="20"/>
+          <w:szCs w:val="20"/>
+        </w:rPr>
+      </w:pPr>
+      <w:r>
+        <w:rPr>
+          <w:rFonts w:ascii="Consolas" w:hAnsi="Consolas"/>
+          <w:color w:val="D9E8F7"/>
+          <w:sz w:val="20"/>
+          <w:szCs w:val="20"/>
+        </w:rPr>
+        <w:t xml:space="preserve">    </w:t>
+      </w:r>
+      <w:r>
+        <w:rPr>
+          <w:rFonts w:ascii="Consolas" w:hAnsi="Consolas"/>
+          <w:color w:val="F9FAF4"/>
+          <w:sz w:val="20"/>
+          <w:szCs w:val="20"/>
+        </w:rPr>
+        <w:t>}</w:t>
+      </w:r>
+    </w:p>
+    <w:p>
+      <w:pPr>
+        <w:pStyle w:val="NormalWeb"/>
+        <w:shd w:val="clear" w:color="auto" w:fill="1E1F22"/>
+        <w:spacing w:before="0" w:beforeAutospacing="0" w:after="0" w:afterAutospacing="0"/>
+        <w:rPr>
+          <w:rFonts w:ascii="Consolas" w:hAnsi="Consolas"/>
+          <w:color w:val="CCCCCC"/>
+          <w:sz w:val="20"/>
+          <w:szCs w:val="20"/>
+        </w:rPr>
+      </w:pPr>
+      <w:r>
+        <w:rPr>
+          <w:rFonts w:ascii="Consolas" w:hAnsi="Consolas"/>
+          <w:color w:val="F9FAF4"/>
+          <w:sz w:val="20"/>
+          <w:szCs w:val="20"/>
+        </w:rPr>
+        <w:t>}</w:t>
+      </w:r>
+    </w:p>
+    <w:p>
+      <w:pPr>
+        <w:rPr>
+          <w:b/>
+          <w:bCs/>
+        </w:rPr>
+      </w:pPr>
+    </w:p>
+    <w:p>
+      <w:pPr>
+        <w:rPr>
+          <w:b/>
+          <w:bCs/>
+        </w:rPr>
+      </w:pPr>
+      <w:r>
+        <w:rPr>
+          <w:b/>
+          <w:bCs/>
+        </w:rPr>
+        <w:t>PdfDocument.java</w:t>
+      </w:r>
+    </w:p>
+    <w:p>
+      <w:pPr>
+        <w:pStyle w:val="NormalWeb"/>
+        <w:shd w:val="clear" w:color="auto" w:fill="1E1F22"/>
+        <w:spacing w:before="0" w:beforeAutospacing="0" w:after="0" w:afterAutospacing="0"/>
+        <w:rPr>
+          <w:rFonts w:ascii="Consolas" w:hAnsi="Consolas"/>
+          <w:color w:val="CCCCCC"/>
+          <w:sz w:val="20"/>
+          <w:szCs w:val="20"/>
+        </w:rPr>
+      </w:pPr>
+      <w:r>
+        <w:rPr>
+          <w:rFonts w:ascii="Consolas" w:hAnsi="Consolas"/>
+          <w:color w:val="CC6C1D"/>
+          <w:sz w:val="20"/>
+          <w:szCs w:val="20"/>
+        </w:rPr>
+        <w:t>package</w:t>
+      </w:r>
+      <w:r>
+        <w:rPr>
+          <w:rFonts w:ascii="Consolas" w:hAnsi="Consolas"/>
+          <w:color w:val="D9E8F7"/>
+          <w:sz w:val="20"/>
+          <w:szCs w:val="20"/>
+        </w:rPr>
+        <w:t xml:space="preserve"> </w:t>
+      </w:r>
+      <w:proofErr w:type="spellStart"/>
+      <w:proofErr w:type="gramStart"/>
+      <w:r>
+        <w:rPr>
+          <w:rFonts w:ascii="Consolas" w:hAnsi="Consolas"/>
+          <w:color w:val="D9E8F7"/>
+          <w:sz w:val="20"/>
+          <w:szCs w:val="20"/>
+        </w:rPr>
+        <w:t>com</w:t>
+      </w:r>
+      <w:r>
+        <w:rPr>
+          <w:rFonts w:ascii="Consolas" w:hAnsi="Consolas"/>
+          <w:color w:val="E6E6FA"/>
+          <w:sz w:val="20"/>
+          <w:szCs w:val="20"/>
+        </w:rPr>
+        <w:t>.</w:t>
+      </w:r>
+      <w:r>
+        <w:rPr>
+          <w:rFonts w:ascii="Consolas" w:hAnsi="Consolas"/>
+          <w:color w:val="D9E8F7"/>
+          <w:sz w:val="20"/>
+          <w:szCs w:val="20"/>
+        </w:rPr>
+        <w:t>result</w:t>
+      </w:r>
+      <w:proofErr w:type="gramEnd"/>
+      <w:r>
+        <w:rPr>
+          <w:rFonts w:ascii="Consolas" w:hAnsi="Consolas"/>
+          <w:color w:val="E6E6FA"/>
+          <w:sz w:val="20"/>
+          <w:szCs w:val="20"/>
+        </w:rPr>
+        <w:t>.</w:t>
+      </w:r>
+      <w:r>
+        <w:rPr>
+          <w:rFonts w:ascii="Consolas" w:hAnsi="Consolas"/>
+          <w:color w:val="D9E8F7"/>
+          <w:sz w:val="20"/>
+          <w:szCs w:val="20"/>
+        </w:rPr>
+        <w:t>factory</w:t>
+      </w:r>
+      <w:proofErr w:type="spellEnd"/>
+      <w:r>
+        <w:rPr>
+          <w:rFonts w:ascii="Consolas" w:hAnsi="Consolas"/>
+          <w:color w:val="E6E6FA"/>
+          <w:sz w:val="20"/>
+          <w:szCs w:val="20"/>
+        </w:rPr>
+        <w:t>;</w:t>
+      </w:r>
+    </w:p>
+    <w:p>
+      <w:pPr>
+        <w:pStyle w:val="NormalWeb"/>
+        <w:shd w:val="clear" w:color="auto" w:fill="1E1F22"/>
+        <w:spacing w:before="0" w:beforeAutospacing="0" w:after="0" w:afterAutospacing="0"/>
+        <w:rPr>
+          <w:rFonts w:ascii="Consolas" w:hAnsi="Consolas"/>
+          <w:color w:val="CCCCCC"/>
+          <w:sz w:val="20"/>
+          <w:szCs w:val="20"/>
+        </w:rPr>
+      </w:pPr>
+    </w:p>
+    <w:p>
+      <w:pPr>
+        <w:pStyle w:val="NormalWeb"/>
+        <w:shd w:val="clear" w:color="auto" w:fill="1E1F22"/>
+        <w:spacing w:before="0" w:beforeAutospacing="0" w:after="0" w:afterAutospacing="0"/>
+        <w:rPr>
+          <w:rFonts w:ascii="Consolas" w:hAnsi="Consolas"/>
+          <w:color w:val="CCCCCC"/>
+          <w:sz w:val="20"/>
+          <w:szCs w:val="20"/>
+        </w:rPr>
+      </w:pPr>
+      <w:r>
+        <w:rPr>
+          <w:rFonts w:ascii="Consolas" w:hAnsi="Consolas"/>
+          <w:color w:val="CC6C1D"/>
+          <w:sz w:val="20"/>
+          <w:szCs w:val="20"/>
+        </w:rPr>
+        <w:t>public</w:t>
+      </w:r>
+      <w:r>
+        <w:rPr>
+          <w:rFonts w:ascii="Consolas" w:hAnsi="Consolas"/>
+          <w:color w:val="D9E8F7"/>
+          <w:sz w:val="20"/>
+          <w:szCs w:val="20"/>
+        </w:rPr>
+        <w:t xml:space="preserve"> </w:t>
+      </w:r>
+      <w:r>
+        <w:rPr>
+          <w:rFonts w:ascii="Consolas" w:hAnsi="Consolas"/>
+          <w:color w:val="CC6C1D"/>
+          <w:sz w:val="20"/>
+          <w:szCs w:val="20"/>
+        </w:rPr>
+        <w:t>class</w:t>
+      </w:r>
+      <w:r>
+        <w:rPr>
+          <w:rFonts w:ascii="Consolas" w:hAnsi="Consolas"/>
+          <w:color w:val="D9E8F7"/>
+          <w:sz w:val="20"/>
+          <w:szCs w:val="20"/>
+        </w:rPr>
+        <w:t xml:space="preserve"> </w:t>
+      </w:r>
+      <w:proofErr w:type="spellStart"/>
+      <w:r>
+        <w:rPr>
+          <w:rFonts w:ascii="Consolas" w:hAnsi="Consolas"/>
+          <w:color w:val="1290C3"/>
+          <w:sz w:val="20"/>
+          <w:szCs w:val="20"/>
+        </w:rPr>
+        <w:t>PdfDocument</w:t>
+      </w:r>
+      <w:proofErr w:type="spellEnd"/>
+      <w:r>
+        <w:rPr>
+          <w:rFonts w:ascii="Consolas" w:hAnsi="Consolas"/>
+          <w:color w:val="D9E8F7"/>
+          <w:sz w:val="20"/>
+          <w:szCs w:val="20"/>
+        </w:rPr>
+        <w:t xml:space="preserve"> </w:t>
+      </w:r>
+      <w:r>
+        <w:rPr>
+          <w:rFonts w:ascii="Consolas" w:hAnsi="Consolas"/>
+          <w:color w:val="CC6C1D"/>
+          <w:sz w:val="20"/>
+          <w:szCs w:val="20"/>
+        </w:rPr>
+        <w:t>implements</w:t>
+      </w:r>
+      <w:r>
+        <w:rPr>
+          <w:rFonts w:ascii="Consolas" w:hAnsi="Consolas"/>
+          <w:color w:val="D9E8F7"/>
+          <w:sz w:val="20"/>
+          <w:szCs w:val="20"/>
+        </w:rPr>
+        <w:t xml:space="preserve"> </w:t>
+      </w:r>
+      <w:r>
+        <w:rPr>
+          <w:rFonts w:ascii="Consolas" w:hAnsi="Consolas"/>
+          <w:color w:val="80F2F6"/>
+          <w:sz w:val="20"/>
+          <w:szCs w:val="20"/>
+        </w:rPr>
+        <w:t>Document</w:t>
+      </w:r>
+      <w:r>
+        <w:rPr>
+          <w:rFonts w:ascii="Consolas" w:hAnsi="Consolas"/>
+          <w:color w:val="D9E8F7"/>
+          <w:sz w:val="20"/>
+          <w:szCs w:val="20"/>
+        </w:rPr>
+        <w:t xml:space="preserve"> </w:t>
+      </w:r>
+      <w:r>
+        <w:rPr>
+          <w:rFonts w:ascii="Consolas" w:hAnsi="Consolas"/>
+          <w:color w:val="F9FAF4"/>
+          <w:sz w:val="20"/>
+          <w:szCs w:val="20"/>
+        </w:rPr>
+        <w:t>{</w:t>
+      </w:r>
+    </w:p>
+    <w:p>
+      <w:pPr>
+        <w:pStyle w:val="NormalWeb"/>
+        <w:shd w:val="clear" w:color="auto" w:fill="1E1F22"/>
+        <w:spacing w:before="0" w:beforeAutospacing="0" w:after="0" w:afterAutospacing="0"/>
+        <w:rPr>
+          <w:rFonts w:ascii="Consolas" w:hAnsi="Consolas"/>
+          <w:color w:val="CCCCCC"/>
+          <w:sz w:val="20"/>
+          <w:szCs w:val="20"/>
+        </w:rPr>
+      </w:pPr>
+    </w:p>
+    <w:p>
+      <w:pPr>
+        <w:pStyle w:val="NormalWeb"/>
+        <w:shd w:val="clear" w:color="auto" w:fill="1E1F22"/>
+        <w:spacing w:before="0" w:beforeAutospacing="0" w:after="0" w:afterAutospacing="0"/>
+        <w:rPr>
+          <w:rFonts w:ascii="Consolas" w:hAnsi="Consolas"/>
+          <w:color w:val="CCCCCC"/>
+          <w:sz w:val="20"/>
+          <w:szCs w:val="20"/>
+        </w:rPr>
+      </w:pPr>
+      <w:r>
+        <w:rPr>
+          <w:rFonts w:ascii="Consolas" w:hAnsi="Consolas"/>
+          <w:color w:val="D9E8F7"/>
+          <w:sz w:val="20"/>
+          <w:szCs w:val="20"/>
+        </w:rPr>
+        <w:t xml:space="preserve">    </w:t>
+      </w:r>
+      <w:r>
+        <w:rPr>
+          <w:rFonts w:ascii="Consolas" w:hAnsi="Consolas"/>
+          <w:i/>
+          <w:iCs/>
+          <w:color w:val="A0A0A0"/>
+          <w:sz w:val="20"/>
+          <w:szCs w:val="20"/>
+        </w:rPr>
+        <w:t>@Override</w:t>
+      </w:r>
+    </w:p>
+    <w:p>
+      <w:pPr>
+        <w:pStyle w:val="NormalWeb"/>
+        <w:shd w:val="clear" w:color="auto" w:fill="1E1F22"/>
+        <w:spacing w:before="0" w:beforeAutospacing="0" w:after="0" w:afterAutospacing="0"/>
+        <w:rPr>
+          <w:rFonts w:ascii="Consolas" w:hAnsi="Consolas"/>
+          <w:color w:val="CCCCCC"/>
+          <w:sz w:val="20"/>
+          <w:szCs w:val="20"/>
+        </w:rPr>
+      </w:pPr>
+      <w:r>
+        <w:rPr>
+          <w:rFonts w:ascii="Consolas" w:hAnsi="Consolas"/>
+          <w:color w:val="D9E8F7"/>
+          <w:sz w:val="20"/>
+          <w:szCs w:val="20"/>
+        </w:rPr>
+        <w:t xml:space="preserve">    </w:t>
+      </w:r>
+      <w:r>
+        <w:rPr>
+          <w:rFonts w:ascii="Consolas" w:hAnsi="Consolas"/>
+          <w:color w:val="CC6C1D"/>
+          <w:sz w:val="20"/>
+          <w:szCs w:val="20"/>
+        </w:rPr>
+        <w:t>public</w:t>
+      </w:r>
+      <w:r>
+        <w:rPr>
+          <w:rFonts w:ascii="Consolas" w:hAnsi="Consolas"/>
+          <w:color w:val="D9E8F7"/>
+          <w:sz w:val="20"/>
+          <w:szCs w:val="20"/>
+        </w:rPr>
+        <w:t xml:space="preserve"> </w:t>
+      </w:r>
+      <w:r>
+        <w:rPr>
+          <w:rFonts w:ascii="Consolas" w:hAnsi="Consolas"/>
+          <w:color w:val="CC6C1D"/>
+          <w:sz w:val="20"/>
+          <w:szCs w:val="20"/>
+        </w:rPr>
+        <w:t>void</w:t>
+      </w:r>
+      <w:r>
+        <w:rPr>
+          <w:rFonts w:ascii="Consolas" w:hAnsi="Consolas"/>
+          <w:color w:val="D9E8F7"/>
+          <w:sz w:val="20"/>
+          <w:szCs w:val="20"/>
+        </w:rPr>
+        <w:t xml:space="preserve"> </w:t>
+      </w:r>
+      <w:proofErr w:type="gramStart"/>
+      <w:r>
+        <w:rPr>
+          <w:rFonts w:ascii="Consolas" w:hAnsi="Consolas"/>
+          <w:color w:val="1EB540"/>
+          <w:sz w:val="20"/>
+          <w:szCs w:val="20"/>
+        </w:rPr>
+        <w:t>open</w:t>
+      </w:r>
+      <w:r>
+        <w:rPr>
+          <w:rFonts w:ascii="Consolas" w:hAnsi="Consolas"/>
+          <w:color w:val="F9FAF4"/>
+          <w:sz w:val="20"/>
+          <w:szCs w:val="20"/>
+        </w:rPr>
+        <w:t>(</w:t>
+      </w:r>
+      <w:proofErr w:type="gramEnd"/>
+      <w:r>
+        <w:rPr>
+          <w:rFonts w:ascii="Consolas" w:hAnsi="Consolas"/>
+          <w:color w:val="F9FAF4"/>
+          <w:sz w:val="20"/>
+          <w:szCs w:val="20"/>
+        </w:rPr>
+        <w:t>)</w:t>
+      </w:r>
+      <w:r>
+        <w:rPr>
+          <w:rFonts w:ascii="Consolas" w:hAnsi="Consolas"/>
+          <w:color w:val="D9E8F7"/>
+          <w:sz w:val="20"/>
+          <w:szCs w:val="20"/>
+        </w:rPr>
+        <w:t xml:space="preserve"> </w:t>
+      </w:r>
+      <w:r>
+        <w:rPr>
+          <w:rFonts w:ascii="Consolas" w:hAnsi="Consolas"/>
+          <w:color w:val="F9FAF4"/>
+          <w:sz w:val="20"/>
+          <w:szCs w:val="20"/>
+        </w:rPr>
+        <w:t>{</w:t>
+      </w:r>
+    </w:p>
+    <w:p>
+      <w:pPr>
+        <w:pStyle w:val="NormalWeb"/>
+        <w:shd w:val="clear" w:color="auto" w:fill="1E1F22"/>
+        <w:spacing w:before="0" w:beforeAutospacing="0" w:after="0" w:afterAutospacing="0"/>
+        <w:rPr>
+          <w:rFonts w:ascii="Consolas" w:hAnsi="Consolas"/>
+          <w:color w:val="CCCCCC"/>
+          <w:sz w:val="20"/>
+          <w:szCs w:val="20"/>
+        </w:rPr>
+      </w:pPr>
+      <w:r>
+        <w:rPr>
+          <w:rFonts w:ascii="Consolas" w:hAnsi="Consolas"/>
+          <w:color w:val="D9E8F7"/>
+          <w:sz w:val="20"/>
+          <w:szCs w:val="20"/>
+        </w:rPr>
+        <w:t xml:space="preserve">        </w:t>
+      </w:r>
+      <w:proofErr w:type="spellStart"/>
+      <w:r>
+        <w:rPr>
+          <w:rFonts w:ascii="Consolas" w:hAnsi="Consolas"/>
+          <w:color w:val="1290C3"/>
+          <w:sz w:val="20"/>
+          <w:szCs w:val="20"/>
+        </w:rPr>
+        <w:t>System</w:t>
+      </w:r>
+      <w:r>
+        <w:rPr>
+          <w:rFonts w:ascii="Consolas" w:hAnsi="Consolas"/>
+          <w:color w:val="E6E6FA"/>
+          <w:sz w:val="20"/>
+          <w:szCs w:val="20"/>
+        </w:rPr>
+        <w:t>.</w:t>
+      </w:r>
+      <w:r>
+        <w:rPr>
+          <w:rFonts w:ascii="Consolas" w:hAnsi="Consolas"/>
+          <w:b/>
+          <w:bCs/>
+          <w:i/>
+          <w:iCs/>
+          <w:color w:val="8DDAF8"/>
+          <w:sz w:val="20"/>
+          <w:szCs w:val="20"/>
+        </w:rPr>
+        <w:t>out</w:t>
+      </w:r>
+      <w:r>
+        <w:rPr>
+          <w:rFonts w:ascii="Consolas" w:hAnsi="Consolas"/>
+          <w:color w:val="E6E6FA"/>
+          <w:sz w:val="20"/>
+          <w:szCs w:val="20"/>
+        </w:rPr>
+        <w:t>.</w:t>
+      </w:r>
+      <w:r>
+        <w:rPr>
+          <w:rFonts w:ascii="Consolas" w:hAnsi="Consolas"/>
+          <w:color w:val="A7EC21"/>
+          <w:sz w:val="20"/>
+          <w:szCs w:val="20"/>
+        </w:rPr>
+        <w:t>println</w:t>
+      </w:r>
+      <w:proofErr w:type="spellEnd"/>
+      <w:r>
+        <w:rPr>
+          <w:rFonts w:ascii="Consolas" w:hAnsi="Consolas"/>
+          <w:color w:val="F9FAF4"/>
+          <w:sz w:val="20"/>
+          <w:szCs w:val="20"/>
+        </w:rPr>
+        <w:t>(</w:t>
+      </w:r>
+      <w:r>
+        <w:rPr>
+          <w:rFonts w:ascii="Consolas" w:hAnsi="Consolas"/>
+          <w:color w:val="17C6A3"/>
+          <w:sz w:val="20"/>
+          <w:szCs w:val="20"/>
+        </w:rPr>
+        <w:t>"Opening PDF Document"</w:t>
+      </w:r>
+      <w:r>
+        <w:rPr>
+          <w:rFonts w:ascii="Consolas" w:hAnsi="Consolas"/>
+          <w:color w:val="F9FAF4"/>
+          <w:sz w:val="20"/>
+          <w:szCs w:val="20"/>
+        </w:rPr>
+        <w:t>)</w:t>
+      </w:r>
+      <w:r>
+        <w:rPr>
+          <w:rFonts w:ascii="Consolas" w:hAnsi="Consolas"/>
+          <w:color w:val="E6E6FA"/>
+          <w:sz w:val="20"/>
+          <w:szCs w:val="20"/>
+        </w:rPr>
+        <w:t>;</w:t>
+      </w:r>
+    </w:p>
+    <w:p>
+      <w:pPr>
+        <w:pStyle w:val="NormalWeb"/>
+        <w:shd w:val="clear" w:color="auto" w:fill="1E1F22"/>
+        <w:spacing w:before="0" w:beforeAutospacing="0" w:after="0" w:afterAutospacing="0"/>
+        <w:rPr>
+          <w:rFonts w:ascii="Consolas" w:hAnsi="Consolas"/>
+          <w:color w:val="CCCCCC"/>
+          <w:sz w:val="20"/>
+          <w:szCs w:val="20"/>
+        </w:rPr>
+      </w:pPr>
+      <w:r>
+        <w:rPr>
+          <w:rFonts w:ascii="Consolas" w:hAnsi="Consolas"/>
+          <w:color w:val="D9E8F7"/>
+          <w:sz w:val="20"/>
+          <w:szCs w:val="20"/>
+        </w:rPr>
+        <w:t xml:space="preserve">    </w:t>
+      </w:r>
+      <w:r>
+        <w:rPr>
+          <w:rFonts w:ascii="Consolas" w:hAnsi="Consolas"/>
+          <w:color w:val="F9FAF4"/>
+          <w:sz w:val="20"/>
+          <w:szCs w:val="20"/>
+        </w:rPr>
+        <w:t>}</w:t>
+      </w:r>
+    </w:p>
+    <w:p>
+      <w:pPr>
+        <w:pStyle w:val="NormalWeb"/>
+        <w:shd w:val="clear" w:color="auto" w:fill="1E1F22"/>
+        <w:spacing w:before="0" w:beforeAutospacing="0" w:after="0" w:afterAutospacing="0"/>
+        <w:rPr>
+          <w:rFonts w:ascii="Consolas" w:hAnsi="Consolas"/>
+          <w:color w:val="CCCCCC"/>
+          <w:sz w:val="20"/>
+          <w:szCs w:val="20"/>
+        </w:rPr>
+      </w:pPr>
+      <w:r>
+        <w:rPr>
+          <w:rFonts w:ascii="Consolas" w:hAnsi="Consolas"/>
+          <w:color w:val="F9FAF4"/>
+          <w:sz w:val="20"/>
+          <w:szCs w:val="20"/>
+        </w:rPr>
+        <w:t>}</w:t>
+      </w:r>
+    </w:p>
+    <w:p>
+      <w:pPr>
+        <w:rPr>
+          <w:b/>
+          <w:bCs/>
+        </w:rPr>
+      </w:pPr>
+    </w:p>
+    <w:p>
+      <w:pPr>
+        <w:rPr>
+          <w:b/>
+          <w:bCs/>
+        </w:rPr>
+      </w:pPr>
+      <w:r>
+        <w:rPr>
+          <w:b/>
+          <w:bCs/>
+        </w:rPr>
+        <w:t>PdfFactory.java</w:t>
+      </w:r>
+    </w:p>
+    <w:p>
+      <w:pPr>
+        <w:pStyle w:val="NormalWeb"/>
+        <w:shd w:val="clear" w:color="auto" w:fill="1E1F22"/>
+        <w:spacing w:before="0" w:beforeAutospacing="0" w:after="0" w:afterAutospacing="0"/>
+        <w:rPr>
+          <w:rFonts w:ascii="Consolas" w:hAnsi="Consolas"/>
+          <w:color w:val="CCCCCC"/>
+          <w:sz w:val="20"/>
+          <w:szCs w:val="20"/>
+        </w:rPr>
+      </w:pPr>
+      <w:r>
+        <w:rPr>
+          <w:rFonts w:ascii="Consolas" w:hAnsi="Consolas"/>
+          <w:color w:val="CC6C1D"/>
+          <w:sz w:val="20"/>
+          <w:szCs w:val="20"/>
+        </w:rPr>
+        <w:t>package</w:t>
+      </w:r>
+      <w:r>
+        <w:rPr>
+          <w:rFonts w:ascii="Consolas" w:hAnsi="Consolas"/>
+          <w:color w:val="D9E8F7"/>
+          <w:sz w:val="20"/>
+          <w:szCs w:val="20"/>
+        </w:rPr>
+        <w:t xml:space="preserve"> </w:t>
+      </w:r>
+      <w:proofErr w:type="spellStart"/>
+      <w:proofErr w:type="gramStart"/>
+      <w:r>
+        <w:rPr>
+          <w:rFonts w:ascii="Consolas" w:hAnsi="Consolas"/>
+          <w:color w:val="D9E8F7"/>
+          <w:sz w:val="20"/>
+          <w:szCs w:val="20"/>
+        </w:rPr>
+        <w:t>com</w:t>
+      </w:r>
+      <w:r>
+        <w:rPr>
+          <w:rFonts w:ascii="Consolas" w:hAnsi="Consolas"/>
+          <w:color w:val="E6E6FA"/>
+          <w:sz w:val="20"/>
+          <w:szCs w:val="20"/>
+        </w:rPr>
+        <w:t>.</w:t>
+      </w:r>
+      <w:r>
+        <w:rPr>
+          <w:rFonts w:ascii="Consolas" w:hAnsi="Consolas"/>
+          <w:color w:val="D9E8F7"/>
+          <w:sz w:val="20"/>
+          <w:szCs w:val="20"/>
+        </w:rPr>
+        <w:t>result</w:t>
+      </w:r>
+      <w:proofErr w:type="gramEnd"/>
+      <w:r>
+        <w:rPr>
+          <w:rFonts w:ascii="Consolas" w:hAnsi="Consolas"/>
+          <w:color w:val="E6E6FA"/>
+          <w:sz w:val="20"/>
+          <w:szCs w:val="20"/>
+        </w:rPr>
+        <w:t>.</w:t>
+      </w:r>
+      <w:r>
+        <w:rPr>
+          <w:rFonts w:ascii="Consolas" w:hAnsi="Consolas"/>
+          <w:color w:val="D9E8F7"/>
+          <w:sz w:val="20"/>
+          <w:szCs w:val="20"/>
+        </w:rPr>
+        <w:t>factory</w:t>
+      </w:r>
+      <w:proofErr w:type="spellEnd"/>
+      <w:r>
+        <w:rPr>
+          <w:rFonts w:ascii="Consolas" w:hAnsi="Consolas"/>
+          <w:color w:val="E6E6FA"/>
+          <w:sz w:val="20"/>
+          <w:szCs w:val="20"/>
+        </w:rPr>
+        <w:t>;</w:t>
+      </w:r>
+    </w:p>
+    <w:p>
+      <w:pPr>
+        <w:pStyle w:val="NormalWeb"/>
+        <w:shd w:val="clear" w:color="auto" w:fill="1E1F22"/>
+        <w:spacing w:before="0" w:beforeAutospacing="0" w:after="0" w:afterAutospacing="0"/>
+        <w:rPr>
+          <w:rFonts w:ascii="Consolas" w:hAnsi="Consolas"/>
+          <w:color w:val="CCCCCC"/>
+          <w:sz w:val="20"/>
+          <w:szCs w:val="20"/>
+        </w:rPr>
+      </w:pPr>
+    </w:p>
+    <w:p>
+      <w:pPr>
+        <w:pStyle w:val="NormalWeb"/>
+        <w:shd w:val="clear" w:color="auto" w:fill="1E1F22"/>
+        <w:spacing w:before="0" w:beforeAutospacing="0" w:after="0" w:afterAutospacing="0"/>
+        <w:rPr>
+          <w:rFonts w:ascii="Consolas" w:hAnsi="Consolas"/>
+          <w:color w:val="CCCCCC"/>
+          <w:sz w:val="20"/>
+          <w:szCs w:val="20"/>
+        </w:rPr>
+      </w:pPr>
+      <w:r>
+        <w:rPr>
+          <w:rFonts w:ascii="Consolas" w:hAnsi="Consolas"/>
+          <w:color w:val="CC6C1D"/>
+          <w:sz w:val="20"/>
+          <w:szCs w:val="20"/>
+        </w:rPr>
+        <w:t>public</w:t>
+      </w:r>
+      <w:r>
+        <w:rPr>
+          <w:rFonts w:ascii="Consolas" w:hAnsi="Consolas"/>
+          <w:color w:val="D9E8F7"/>
+          <w:sz w:val="20"/>
+          <w:szCs w:val="20"/>
+        </w:rPr>
+        <w:t xml:space="preserve"> </w:t>
+      </w:r>
+      <w:r>
+        <w:rPr>
+          <w:rFonts w:ascii="Consolas" w:hAnsi="Consolas"/>
+          <w:color w:val="CC6C1D"/>
+          <w:sz w:val="20"/>
+          <w:szCs w:val="20"/>
+        </w:rPr>
+        <w:t>class</w:t>
+      </w:r>
+      <w:r>
+        <w:rPr>
+          <w:rFonts w:ascii="Consolas" w:hAnsi="Consolas"/>
+          <w:color w:val="D9E8F7"/>
+          <w:sz w:val="20"/>
+          <w:szCs w:val="20"/>
+        </w:rPr>
+        <w:t xml:space="preserve"> </w:t>
+      </w:r>
+      <w:proofErr w:type="spellStart"/>
+      <w:r>
+        <w:rPr>
+          <w:rFonts w:ascii="Consolas" w:hAnsi="Consolas"/>
+          <w:color w:val="1290C3"/>
+          <w:sz w:val="20"/>
+          <w:szCs w:val="20"/>
+        </w:rPr>
+        <w:t>PdfFactory</w:t>
+      </w:r>
+      <w:proofErr w:type="spellEnd"/>
+      <w:r>
+        <w:rPr>
+          <w:rFonts w:ascii="Consolas" w:hAnsi="Consolas"/>
+          <w:color w:val="D9E8F7"/>
+          <w:sz w:val="20"/>
+          <w:szCs w:val="20"/>
+        </w:rPr>
+        <w:t xml:space="preserve"> </w:t>
+      </w:r>
+      <w:r>
+        <w:rPr>
+          <w:rFonts w:ascii="Consolas" w:hAnsi="Consolas"/>
+          <w:color w:val="CC6C1D"/>
+          <w:sz w:val="20"/>
+          <w:szCs w:val="20"/>
+        </w:rPr>
+        <w:t>extends</w:t>
+      </w:r>
+      <w:r>
+        <w:rPr>
+          <w:rFonts w:ascii="Consolas" w:hAnsi="Consolas"/>
+          <w:color w:val="D9E8F7"/>
+          <w:sz w:val="20"/>
+          <w:szCs w:val="20"/>
+        </w:rPr>
+        <w:t xml:space="preserve"> </w:t>
+      </w:r>
+      <w:proofErr w:type="spellStart"/>
+      <w:r>
+        <w:rPr>
+          <w:rFonts w:ascii="Consolas" w:hAnsi="Consolas"/>
+          <w:color w:val="3EABE6"/>
+          <w:sz w:val="20"/>
+          <w:szCs w:val="20"/>
+        </w:rPr>
+        <w:t>DocumentFactory</w:t>
+      </w:r>
+      <w:proofErr w:type="spellEnd"/>
+      <w:r>
+        <w:rPr>
+          <w:rFonts w:ascii="Consolas" w:hAnsi="Consolas"/>
+          <w:color w:val="D9E8F7"/>
+          <w:sz w:val="20"/>
+          <w:szCs w:val="20"/>
+        </w:rPr>
+        <w:t xml:space="preserve"> </w:t>
+      </w:r>
+      <w:r>
+        <w:rPr>
+          <w:rFonts w:ascii="Consolas" w:hAnsi="Consolas"/>
+          <w:color w:val="F9FAF4"/>
+          <w:sz w:val="20"/>
+          <w:szCs w:val="20"/>
+        </w:rPr>
+        <w:t>{</w:t>
+      </w:r>
+    </w:p>
+    <w:p>
+      <w:pPr>
+        <w:pStyle w:val="NormalWeb"/>
+        <w:shd w:val="clear" w:color="auto" w:fill="1E1F22"/>
+        <w:spacing w:before="0" w:beforeAutospacing="0" w:after="0" w:afterAutospacing="0"/>
+        <w:rPr>
+          <w:rFonts w:ascii="Consolas" w:hAnsi="Consolas"/>
+          <w:color w:val="CCCCCC"/>
+          <w:sz w:val="20"/>
+          <w:szCs w:val="20"/>
+        </w:rPr>
+      </w:pPr>
+    </w:p>
+    <w:p>
+      <w:pPr>
+        <w:pStyle w:val="NormalWeb"/>
+        <w:shd w:val="clear" w:color="auto" w:fill="1E1F22"/>
+        <w:spacing w:before="0" w:beforeAutospacing="0" w:after="0" w:afterAutospacing="0"/>
+        <w:rPr>
+          <w:rFonts w:ascii="Consolas" w:hAnsi="Consolas"/>
+          <w:color w:val="CCCCCC"/>
+          <w:sz w:val="20"/>
+          <w:szCs w:val="20"/>
+        </w:rPr>
+      </w:pPr>
+      <w:r>
+        <w:rPr>
+          <w:rFonts w:ascii="Consolas" w:hAnsi="Consolas"/>
+          <w:color w:val="D9E8F7"/>
+          <w:sz w:val="20"/>
+          <w:szCs w:val="20"/>
+        </w:rPr>
+        <w:t xml:space="preserve">    </w:t>
+      </w:r>
+      <w:r>
+        <w:rPr>
+          <w:rFonts w:ascii="Consolas" w:hAnsi="Consolas"/>
+          <w:i/>
+          <w:iCs/>
+          <w:color w:val="A0A0A0"/>
+          <w:sz w:val="20"/>
+          <w:szCs w:val="20"/>
+        </w:rPr>
+        <w:t>@Override</w:t>
+      </w:r>
+    </w:p>
+    <w:p>
+      <w:pPr>
+        <w:pStyle w:val="NormalWeb"/>
+        <w:shd w:val="clear" w:color="auto" w:fill="1E1F22"/>
+        <w:spacing w:before="0" w:beforeAutospacing="0" w:after="0" w:afterAutospacing="0"/>
+        <w:rPr>
+          <w:rFonts w:ascii="Consolas" w:hAnsi="Consolas"/>
+          <w:color w:val="CCCCCC"/>
+          <w:sz w:val="20"/>
+          <w:szCs w:val="20"/>
+        </w:rPr>
+      </w:pPr>
+      <w:r>
+        <w:rPr>
+          <w:rFonts w:ascii="Consolas" w:hAnsi="Consolas"/>
+          <w:color w:val="D9E8F7"/>
+          <w:sz w:val="20"/>
+          <w:szCs w:val="20"/>
+        </w:rPr>
+        <w:t xml:space="preserve">    </w:t>
+      </w:r>
+      <w:r>
+        <w:rPr>
+          <w:rFonts w:ascii="Consolas" w:hAnsi="Consolas"/>
+          <w:color w:val="CC6C1D"/>
+          <w:sz w:val="20"/>
+          <w:szCs w:val="20"/>
+        </w:rPr>
+        <w:t>public</w:t>
+      </w:r>
+      <w:r>
+        <w:rPr>
+          <w:rFonts w:ascii="Consolas" w:hAnsi="Consolas"/>
+          <w:color w:val="D9E8F7"/>
+          <w:sz w:val="20"/>
+          <w:szCs w:val="20"/>
+        </w:rPr>
+        <w:t xml:space="preserve"> </w:t>
+      </w:r>
+      <w:r>
+        <w:rPr>
+          <w:rFonts w:ascii="Consolas" w:hAnsi="Consolas"/>
+          <w:color w:val="80F2F6"/>
+          <w:sz w:val="20"/>
+          <w:szCs w:val="20"/>
+        </w:rPr>
+        <w:t>Document</w:t>
+      </w:r>
+      <w:r>
+        <w:rPr>
+          <w:rFonts w:ascii="Consolas" w:hAnsi="Consolas"/>
+          <w:color w:val="D9E8F7"/>
+          <w:sz w:val="20"/>
+          <w:szCs w:val="20"/>
+        </w:rPr>
+        <w:t xml:space="preserve"> </w:t>
+      </w:r>
+      <w:proofErr w:type="spellStart"/>
+      <w:proofErr w:type="gramStart"/>
+      <w:r>
+        <w:rPr>
+          <w:rFonts w:ascii="Consolas" w:hAnsi="Consolas"/>
+          <w:color w:val="1EB540"/>
+          <w:sz w:val="20"/>
+          <w:szCs w:val="20"/>
+        </w:rPr>
+        <w:t>createDocument</w:t>
+      </w:r>
+      <w:proofErr w:type="spellEnd"/>
+      <w:r>
+        <w:rPr>
+          <w:rFonts w:ascii="Consolas" w:hAnsi="Consolas"/>
+          <w:color w:val="F9FAF4"/>
+          <w:sz w:val="20"/>
+          <w:szCs w:val="20"/>
+        </w:rPr>
+        <w:t>(</w:t>
+      </w:r>
+      <w:proofErr w:type="gramEnd"/>
+      <w:r>
+        <w:rPr>
+          <w:rFonts w:ascii="Consolas" w:hAnsi="Consolas"/>
+          <w:color w:val="F9FAF4"/>
+          <w:sz w:val="20"/>
+          <w:szCs w:val="20"/>
+        </w:rPr>
+        <w:t>)</w:t>
+      </w:r>
+      <w:r>
+        <w:rPr>
+          <w:rFonts w:ascii="Consolas" w:hAnsi="Consolas"/>
+          <w:color w:val="D9E8F7"/>
+          <w:sz w:val="20"/>
+          <w:szCs w:val="20"/>
+        </w:rPr>
+        <w:t xml:space="preserve"> </w:t>
+      </w:r>
+      <w:r>
+        <w:rPr>
+          <w:rFonts w:ascii="Consolas" w:hAnsi="Consolas"/>
+          <w:color w:val="F9FAF4"/>
+          <w:sz w:val="20"/>
+          <w:szCs w:val="20"/>
+        </w:rPr>
+        <w:t>{</w:t>
+      </w:r>
+    </w:p>
+    <w:p>
+      <w:pPr>
+        <w:pStyle w:val="NormalWeb"/>
+        <w:shd w:val="clear" w:color="auto" w:fill="1E1F22"/>
+        <w:spacing w:before="0" w:beforeAutospacing="0" w:after="0" w:afterAutospacing="0"/>
+        <w:rPr>
+          <w:rFonts w:ascii="Consolas" w:hAnsi="Consolas"/>
+          <w:color w:val="CCCCCC"/>
+          <w:sz w:val="20"/>
+          <w:szCs w:val="20"/>
+        </w:rPr>
+      </w:pPr>
+      <w:r>
+        <w:rPr>
+          <w:rFonts w:ascii="Consolas" w:hAnsi="Consolas"/>
+          <w:color w:val="D9E8F7"/>
+          <w:sz w:val="20"/>
+          <w:szCs w:val="20"/>
+        </w:rPr>
+        <w:t xml:space="preserve">        </w:t>
+      </w:r>
+      <w:r>
+        <w:rPr>
+          <w:rFonts w:ascii="Consolas" w:hAnsi="Consolas"/>
+          <w:color w:val="CC6C1D"/>
+          <w:sz w:val="20"/>
+          <w:szCs w:val="20"/>
+        </w:rPr>
+        <w:t>return</w:t>
+      </w:r>
+      <w:r>
+        <w:rPr>
+          <w:rFonts w:ascii="Consolas" w:hAnsi="Consolas"/>
+          <w:color w:val="D9E8F7"/>
+          <w:sz w:val="20"/>
+          <w:szCs w:val="20"/>
+        </w:rPr>
+        <w:t xml:space="preserve"> </w:t>
+      </w:r>
+      <w:r>
+        <w:rPr>
+          <w:rFonts w:ascii="Consolas" w:hAnsi="Consolas"/>
+          <w:color w:val="CC6C1D"/>
+          <w:sz w:val="20"/>
+          <w:szCs w:val="20"/>
+        </w:rPr>
+        <w:t>new</w:t>
+      </w:r>
+      <w:r>
+        <w:rPr>
+          <w:rFonts w:ascii="Consolas" w:hAnsi="Consolas"/>
+          <w:color w:val="D9E8F7"/>
+          <w:sz w:val="20"/>
+          <w:szCs w:val="20"/>
+        </w:rPr>
+        <w:t xml:space="preserve"> </w:t>
+      </w:r>
+      <w:proofErr w:type="spellStart"/>
+      <w:proofErr w:type="gramStart"/>
+      <w:r>
+        <w:rPr>
+          <w:rFonts w:ascii="Consolas" w:hAnsi="Consolas"/>
+          <w:color w:val="A7EC21"/>
+          <w:sz w:val="20"/>
+          <w:szCs w:val="20"/>
+        </w:rPr>
+        <w:t>PdfDocument</w:t>
+      </w:r>
+      <w:proofErr w:type="spellEnd"/>
+      <w:r>
+        <w:rPr>
+          <w:rFonts w:ascii="Consolas" w:hAnsi="Consolas"/>
+          <w:color w:val="F9FAF4"/>
+          <w:sz w:val="20"/>
+          <w:szCs w:val="20"/>
+        </w:rPr>
+        <w:t>(</w:t>
+      </w:r>
+      <w:proofErr w:type="gramEnd"/>
+      <w:r>
+        <w:rPr>
+          <w:rFonts w:ascii="Consolas" w:hAnsi="Consolas"/>
+          <w:color w:val="F9FAF4"/>
+          <w:sz w:val="20"/>
+          <w:szCs w:val="20"/>
+        </w:rPr>
+        <w:t>)</w:t>
+      </w:r>
+      <w:r>
+        <w:rPr>
+          <w:rFonts w:ascii="Consolas" w:hAnsi="Consolas"/>
+          <w:color w:val="E6E6FA"/>
+          <w:sz w:val="20"/>
+          <w:szCs w:val="20"/>
+        </w:rPr>
+        <w:t>;</w:t>
+      </w:r>
+    </w:p>
+    <w:p>
+      <w:pPr>
+        <w:pStyle w:val="NormalWeb"/>
+        <w:shd w:val="clear" w:color="auto" w:fill="1E1F22"/>
+        <w:spacing w:before="0" w:beforeAutospacing="0" w:after="0" w:afterAutospacing="0"/>
+        <w:rPr>
+          <w:rFonts w:ascii="Consolas" w:hAnsi="Consolas"/>
+          <w:color w:val="CCCCCC"/>
+          <w:sz w:val="20"/>
+          <w:szCs w:val="20"/>
+        </w:rPr>
+      </w:pPr>
+      <w:r>
+        <w:rPr>
+          <w:rFonts w:ascii="Consolas" w:hAnsi="Consolas"/>
+          <w:color w:val="D9E8F7"/>
+          <w:sz w:val="20"/>
+          <w:szCs w:val="20"/>
+        </w:rPr>
+        <w:t xml:space="preserve">    </w:t>
+      </w:r>
+      <w:r>
+        <w:rPr>
+          <w:rFonts w:ascii="Consolas" w:hAnsi="Consolas"/>
+          <w:color w:val="F9FAF4"/>
+          <w:sz w:val="20"/>
+          <w:szCs w:val="20"/>
+        </w:rPr>
+        <w:t>}</w:t>
+      </w:r>
+    </w:p>
+    <w:p>
+      <w:pPr>
+        <w:pStyle w:val="NormalWeb"/>
+        <w:shd w:val="clear" w:color="auto" w:fill="1E1F22"/>
+        <w:spacing w:before="0" w:beforeAutospacing="0" w:after="0" w:afterAutospacing="0"/>
+        <w:rPr>
+          <w:rFonts w:ascii="Consolas" w:hAnsi="Consolas"/>
+          <w:color w:val="CCCCCC"/>
+          <w:sz w:val="20"/>
+          <w:szCs w:val="20"/>
+        </w:rPr>
+      </w:pPr>
+      <w:r>
+        <w:rPr>
+          <w:rFonts w:ascii="Consolas" w:hAnsi="Consolas"/>
+          <w:color w:val="F9FAF4"/>
+          <w:sz w:val="20"/>
+          <w:szCs w:val="20"/>
+        </w:rPr>
+        <w:t>}</w:t>
+      </w:r>
+    </w:p>
+    <w:p>
+      <w:pPr>
+        <w:rPr>
+          <w:b/>
+          <w:bCs/>
+        </w:rPr>
+      </w:pPr>
+    </w:p>
+    <w:p>
+      <w:pPr>
+        <w:rPr>
+          <w:b/>
+          <w:bCs/>
+        </w:rPr>
+      </w:pPr>
+    </w:p>
+    <w:p>
+      <w:pPr>
+        <w:rPr>
+          <w:b/>
+          <w:bCs/>
+        </w:rPr>
+      </w:pPr>
+    </w:p>
+    <w:p>
+      <w:pPr>
+        <w:rPr>
+          <w:b/>
+          <w:bCs/>
+        </w:rPr>
+      </w:pPr>
+      <w:r>
+        <w:rPr>
+          <w:b/>
+          <w:bCs/>
+        </w:rPr>
+        <w:lastRenderedPageBreak/>
+        <w:t>WordDocument.java</w:t>
+      </w:r>
+    </w:p>
+    <w:p>
+      <w:pPr>
+        <w:pStyle w:val="NormalWeb"/>
+        <w:shd w:val="clear" w:color="auto" w:fill="1E1F22"/>
+        <w:spacing w:before="0" w:beforeAutospacing="0" w:after="0" w:afterAutospacing="0"/>
+        <w:rPr>
+          <w:rFonts w:ascii="Consolas" w:hAnsi="Consolas"/>
+          <w:color w:val="CCCCCC"/>
+          <w:sz w:val="20"/>
+          <w:szCs w:val="20"/>
+        </w:rPr>
+      </w:pPr>
+      <w:r>
+        <w:rPr>
+          <w:rFonts w:ascii="Consolas" w:hAnsi="Consolas"/>
+          <w:color w:val="CC6C1D"/>
+          <w:sz w:val="20"/>
+          <w:szCs w:val="20"/>
+        </w:rPr>
+        <w:t>package</w:t>
+      </w:r>
+      <w:r>
+        <w:rPr>
+          <w:rFonts w:ascii="Consolas" w:hAnsi="Consolas"/>
+          <w:color w:val="D9E8F7"/>
+          <w:sz w:val="20"/>
+          <w:szCs w:val="20"/>
+        </w:rPr>
+        <w:t xml:space="preserve"> </w:t>
+      </w:r>
+      <w:proofErr w:type="spellStart"/>
+      <w:proofErr w:type="gramStart"/>
+      <w:r>
+        <w:rPr>
+          <w:rFonts w:ascii="Consolas" w:hAnsi="Consolas"/>
+          <w:color w:val="D9E8F7"/>
+          <w:sz w:val="20"/>
+          <w:szCs w:val="20"/>
+        </w:rPr>
+        <w:t>com</w:t>
+      </w:r>
+      <w:r>
+        <w:rPr>
+          <w:rFonts w:ascii="Consolas" w:hAnsi="Consolas"/>
+          <w:color w:val="E6E6FA"/>
+          <w:sz w:val="20"/>
+          <w:szCs w:val="20"/>
+        </w:rPr>
+        <w:t>.</w:t>
+      </w:r>
+      <w:r>
+        <w:rPr>
+          <w:rFonts w:ascii="Consolas" w:hAnsi="Consolas"/>
+          <w:color w:val="D9E8F7"/>
+          <w:sz w:val="20"/>
+          <w:szCs w:val="20"/>
+        </w:rPr>
+        <w:t>result</w:t>
+      </w:r>
+      <w:proofErr w:type="gramEnd"/>
+      <w:r>
+        <w:rPr>
+          <w:rFonts w:ascii="Consolas" w:hAnsi="Consolas"/>
+          <w:color w:val="E6E6FA"/>
+          <w:sz w:val="20"/>
+          <w:szCs w:val="20"/>
+        </w:rPr>
+        <w:t>.</w:t>
+      </w:r>
+      <w:r>
+        <w:rPr>
+          <w:rFonts w:ascii="Consolas" w:hAnsi="Consolas"/>
+          <w:color w:val="D9E8F7"/>
+          <w:sz w:val="20"/>
+          <w:szCs w:val="20"/>
+        </w:rPr>
+        <w:t>factory</w:t>
+      </w:r>
+      <w:proofErr w:type="spellEnd"/>
+      <w:r>
+        <w:rPr>
+          <w:rFonts w:ascii="Consolas" w:hAnsi="Consolas"/>
+          <w:color w:val="E6E6FA"/>
+          <w:sz w:val="20"/>
+          <w:szCs w:val="20"/>
+        </w:rPr>
+        <w:t>;</w:t>
+      </w:r>
+    </w:p>
+    <w:p>
+      <w:pPr>
+        <w:pStyle w:val="NormalWeb"/>
+        <w:shd w:val="clear" w:color="auto" w:fill="1E1F22"/>
+        <w:spacing w:before="0" w:beforeAutospacing="0" w:after="0" w:afterAutospacing="0"/>
+        <w:rPr>
+          <w:rFonts w:ascii="Consolas" w:hAnsi="Consolas"/>
+          <w:color w:val="CCCCCC"/>
+          <w:sz w:val="20"/>
+          <w:szCs w:val="20"/>
+        </w:rPr>
+      </w:pPr>
+    </w:p>
+    <w:p>
+      <w:pPr>
+        <w:pStyle w:val="NormalWeb"/>
+        <w:shd w:val="clear" w:color="auto" w:fill="1E1F22"/>
+        <w:spacing w:before="0" w:beforeAutospacing="0" w:after="0" w:afterAutospacing="0"/>
+        <w:rPr>
+          <w:rFonts w:ascii="Consolas" w:hAnsi="Consolas"/>
+          <w:color w:val="CCCCCC"/>
+          <w:sz w:val="20"/>
+          <w:szCs w:val="20"/>
+        </w:rPr>
+      </w:pPr>
+      <w:r>
+        <w:rPr>
+          <w:rFonts w:ascii="Consolas" w:hAnsi="Consolas"/>
+          <w:color w:val="CC6C1D"/>
+          <w:sz w:val="20"/>
+          <w:szCs w:val="20"/>
+        </w:rPr>
+        <w:t>public</w:t>
+      </w:r>
+      <w:r>
+        <w:rPr>
+          <w:rFonts w:ascii="Consolas" w:hAnsi="Consolas"/>
+          <w:color w:val="D9E8F7"/>
+          <w:sz w:val="20"/>
+          <w:szCs w:val="20"/>
+        </w:rPr>
+        <w:t xml:space="preserve"> </w:t>
+      </w:r>
+      <w:r>
+        <w:rPr>
+          <w:rFonts w:ascii="Consolas" w:hAnsi="Consolas"/>
+          <w:color w:val="CC6C1D"/>
+          <w:sz w:val="20"/>
+          <w:szCs w:val="20"/>
+        </w:rPr>
+        <w:t>class</w:t>
+      </w:r>
+      <w:r>
+        <w:rPr>
+          <w:rFonts w:ascii="Consolas" w:hAnsi="Consolas"/>
+          <w:color w:val="D9E8F7"/>
+          <w:sz w:val="20"/>
+          <w:szCs w:val="20"/>
+        </w:rPr>
+        <w:t xml:space="preserve"> </w:t>
+      </w:r>
+      <w:proofErr w:type="spellStart"/>
+      <w:r>
+        <w:rPr>
+          <w:rFonts w:ascii="Consolas" w:hAnsi="Consolas"/>
+          <w:color w:val="1290C3"/>
+          <w:sz w:val="20"/>
+          <w:szCs w:val="20"/>
+        </w:rPr>
+        <w:t>WordDocument</w:t>
+      </w:r>
+      <w:proofErr w:type="spellEnd"/>
+      <w:r>
+        <w:rPr>
+          <w:rFonts w:ascii="Consolas" w:hAnsi="Consolas"/>
+          <w:color w:val="D9E8F7"/>
+          <w:sz w:val="20"/>
+          <w:szCs w:val="20"/>
+        </w:rPr>
+        <w:t xml:space="preserve"> </w:t>
+      </w:r>
+      <w:r>
+        <w:rPr>
+          <w:rFonts w:ascii="Consolas" w:hAnsi="Consolas"/>
+          <w:color w:val="CC6C1D"/>
+          <w:sz w:val="20"/>
+          <w:szCs w:val="20"/>
+        </w:rPr>
+        <w:t>implements</w:t>
+      </w:r>
+      <w:r>
+        <w:rPr>
+          <w:rFonts w:ascii="Consolas" w:hAnsi="Consolas"/>
+          <w:color w:val="D9E8F7"/>
+          <w:sz w:val="20"/>
+          <w:szCs w:val="20"/>
+        </w:rPr>
+        <w:t xml:space="preserve"> </w:t>
+      </w:r>
+      <w:r>
+        <w:rPr>
+          <w:rFonts w:ascii="Consolas" w:hAnsi="Consolas"/>
+          <w:color w:val="80F2F6"/>
+          <w:sz w:val="20"/>
+          <w:szCs w:val="20"/>
+        </w:rPr>
+        <w:t>Document</w:t>
+      </w:r>
+      <w:r>
+        <w:rPr>
+          <w:rFonts w:ascii="Consolas" w:hAnsi="Consolas"/>
+          <w:color w:val="D9E8F7"/>
+          <w:sz w:val="20"/>
+          <w:szCs w:val="20"/>
+        </w:rPr>
+        <w:t xml:space="preserve"> </w:t>
+      </w:r>
+      <w:r>
+        <w:rPr>
+          <w:rFonts w:ascii="Consolas" w:hAnsi="Consolas"/>
+          <w:color w:val="F9FAF4"/>
+          <w:sz w:val="20"/>
+          <w:szCs w:val="20"/>
+        </w:rPr>
+        <w:t>{</w:t>
+      </w:r>
+    </w:p>
+    <w:p>
+      <w:pPr>
+        <w:pStyle w:val="NormalWeb"/>
+        <w:shd w:val="clear" w:color="auto" w:fill="1E1F22"/>
+        <w:spacing w:before="0" w:beforeAutospacing="0" w:after="0" w:afterAutospacing="0"/>
+        <w:rPr>
+          <w:rFonts w:ascii="Consolas" w:hAnsi="Consolas"/>
+          <w:color w:val="CCCCCC"/>
+          <w:sz w:val="20"/>
+          <w:szCs w:val="20"/>
+        </w:rPr>
+      </w:pPr>
+    </w:p>
+    <w:p>
+      <w:pPr>
+        <w:pStyle w:val="NormalWeb"/>
+        <w:shd w:val="clear" w:color="auto" w:fill="1E1F22"/>
+        <w:spacing w:before="0" w:beforeAutospacing="0" w:after="0" w:afterAutospacing="0"/>
+        <w:rPr>
+          <w:rFonts w:ascii="Consolas" w:hAnsi="Consolas"/>
+          <w:color w:val="CCCCCC"/>
+          <w:sz w:val="20"/>
+          <w:szCs w:val="20"/>
+        </w:rPr>
+      </w:pPr>
+      <w:r>
+        <w:rPr>
+          <w:rFonts w:ascii="Consolas" w:hAnsi="Consolas"/>
+          <w:color w:val="D9E8F7"/>
+          <w:sz w:val="20"/>
+          <w:szCs w:val="20"/>
+        </w:rPr>
+        <w:t xml:space="preserve">    </w:t>
+      </w:r>
+      <w:r>
+        <w:rPr>
+          <w:rFonts w:ascii="Consolas" w:hAnsi="Consolas"/>
+          <w:i/>
+          <w:iCs/>
+          <w:color w:val="A0A0A0"/>
+          <w:sz w:val="20"/>
+          <w:szCs w:val="20"/>
+        </w:rPr>
+        <w:t>@Override</w:t>
+      </w:r>
+    </w:p>
+    <w:p>
+      <w:pPr>
+        <w:pStyle w:val="NormalWeb"/>
+        <w:shd w:val="clear" w:color="auto" w:fill="1E1F22"/>
+        <w:spacing w:before="0" w:beforeAutospacing="0" w:after="0" w:afterAutospacing="0"/>
+        <w:rPr>
+          <w:rFonts w:ascii="Consolas" w:hAnsi="Consolas"/>
+          <w:color w:val="CCCCCC"/>
+          <w:sz w:val="20"/>
+          <w:szCs w:val="20"/>
+        </w:rPr>
+      </w:pPr>
+      <w:r>
+        <w:rPr>
+          <w:rFonts w:ascii="Consolas" w:hAnsi="Consolas"/>
+          <w:color w:val="D9E8F7"/>
+          <w:sz w:val="20"/>
+          <w:szCs w:val="20"/>
+        </w:rPr>
+        <w:t xml:space="preserve">    </w:t>
+      </w:r>
+      <w:r>
+        <w:rPr>
+          <w:rFonts w:ascii="Consolas" w:hAnsi="Consolas"/>
+          <w:color w:val="CC6C1D"/>
+          <w:sz w:val="20"/>
+          <w:szCs w:val="20"/>
+        </w:rPr>
+        <w:t>public</w:t>
+      </w:r>
+      <w:r>
+        <w:rPr>
+          <w:rFonts w:ascii="Consolas" w:hAnsi="Consolas"/>
+          <w:color w:val="D9E8F7"/>
+          <w:sz w:val="20"/>
+          <w:szCs w:val="20"/>
+        </w:rPr>
+        <w:t xml:space="preserve"> </w:t>
+      </w:r>
+      <w:r>
+        <w:rPr>
+          <w:rFonts w:ascii="Consolas" w:hAnsi="Consolas"/>
+          <w:color w:val="CC6C1D"/>
+          <w:sz w:val="20"/>
+          <w:szCs w:val="20"/>
+        </w:rPr>
+        <w:t>void</w:t>
+      </w:r>
+      <w:r>
+        <w:rPr>
+          <w:rFonts w:ascii="Consolas" w:hAnsi="Consolas"/>
+          <w:color w:val="D9E8F7"/>
+          <w:sz w:val="20"/>
+          <w:szCs w:val="20"/>
+        </w:rPr>
+        <w:t xml:space="preserve"> </w:t>
+      </w:r>
+      <w:proofErr w:type="gramStart"/>
+      <w:r>
+        <w:rPr>
+          <w:rFonts w:ascii="Consolas" w:hAnsi="Consolas"/>
+          <w:color w:val="1EB540"/>
+          <w:sz w:val="20"/>
+          <w:szCs w:val="20"/>
+        </w:rPr>
+        <w:t>open</w:t>
+      </w:r>
+      <w:r>
+        <w:rPr>
+          <w:rFonts w:ascii="Consolas" w:hAnsi="Consolas"/>
+          <w:color w:val="F9FAF4"/>
+          <w:sz w:val="20"/>
+          <w:szCs w:val="20"/>
+        </w:rPr>
+        <w:t>(</w:t>
+      </w:r>
+      <w:proofErr w:type="gramEnd"/>
+      <w:r>
+        <w:rPr>
+          <w:rFonts w:ascii="Consolas" w:hAnsi="Consolas"/>
+          <w:color w:val="F9FAF4"/>
+          <w:sz w:val="20"/>
+          <w:szCs w:val="20"/>
+        </w:rPr>
+        <w:t>)</w:t>
+      </w:r>
+      <w:r>
+        <w:rPr>
+          <w:rFonts w:ascii="Consolas" w:hAnsi="Consolas"/>
+          <w:color w:val="D9E8F7"/>
+          <w:sz w:val="20"/>
+          <w:szCs w:val="20"/>
+        </w:rPr>
+        <w:t xml:space="preserve"> </w:t>
+      </w:r>
+      <w:r>
+        <w:rPr>
+          <w:rFonts w:ascii="Consolas" w:hAnsi="Consolas"/>
+          <w:color w:val="F9FAF4"/>
+          <w:sz w:val="20"/>
+          <w:szCs w:val="20"/>
+        </w:rPr>
+        <w:t>{</w:t>
+      </w:r>
+    </w:p>
+    <w:p>
+      <w:pPr>
+        <w:pStyle w:val="NormalWeb"/>
+        <w:shd w:val="clear" w:color="auto" w:fill="1E1F22"/>
+        <w:spacing w:before="0" w:beforeAutospacing="0" w:after="0" w:afterAutospacing="0"/>
+        <w:rPr>
+          <w:rFonts w:ascii="Consolas" w:hAnsi="Consolas"/>
+          <w:color w:val="CCCCCC"/>
+          <w:sz w:val="20"/>
+          <w:szCs w:val="20"/>
+        </w:rPr>
+      </w:pPr>
+      <w:r>
+        <w:rPr>
+          <w:rFonts w:ascii="Consolas" w:hAnsi="Consolas"/>
+          <w:color w:val="D9E8F7"/>
+          <w:sz w:val="20"/>
+          <w:szCs w:val="20"/>
+        </w:rPr>
+        <w:t xml:space="preserve">        </w:t>
+      </w:r>
+      <w:proofErr w:type="spellStart"/>
+      <w:r>
+        <w:rPr>
+          <w:rFonts w:ascii="Consolas" w:hAnsi="Consolas"/>
+          <w:color w:val="1290C3"/>
+          <w:sz w:val="20"/>
+          <w:szCs w:val="20"/>
+        </w:rPr>
+        <w:t>System</w:t>
+      </w:r>
+      <w:r>
+        <w:rPr>
+          <w:rFonts w:ascii="Consolas" w:hAnsi="Consolas"/>
+          <w:color w:val="E6E6FA"/>
+          <w:sz w:val="20"/>
+          <w:szCs w:val="20"/>
+        </w:rPr>
+        <w:t>.</w:t>
+      </w:r>
+      <w:r>
+        <w:rPr>
+          <w:rFonts w:ascii="Consolas" w:hAnsi="Consolas"/>
+          <w:b/>
+          <w:bCs/>
+          <w:i/>
+          <w:iCs/>
+          <w:color w:val="8DDAF8"/>
+          <w:sz w:val="20"/>
+          <w:szCs w:val="20"/>
+        </w:rPr>
+        <w:t>out</w:t>
+      </w:r>
+      <w:r>
+        <w:rPr>
+          <w:rFonts w:ascii="Consolas" w:hAnsi="Consolas"/>
+          <w:color w:val="E6E6FA"/>
+          <w:sz w:val="20"/>
+          <w:szCs w:val="20"/>
+        </w:rPr>
+        <w:t>.</w:t>
+      </w:r>
+      <w:r>
+        <w:rPr>
+          <w:rFonts w:ascii="Consolas" w:hAnsi="Consolas"/>
+          <w:color w:val="A7EC21"/>
+          <w:sz w:val="20"/>
+          <w:szCs w:val="20"/>
+        </w:rPr>
+        <w:t>println</w:t>
+      </w:r>
+      <w:proofErr w:type="spellEnd"/>
+      <w:r>
+        <w:rPr>
+          <w:rFonts w:ascii="Consolas" w:hAnsi="Consolas"/>
+          <w:color w:val="F9FAF4"/>
+          <w:sz w:val="20"/>
+          <w:szCs w:val="20"/>
+        </w:rPr>
+        <w:t>(</w:t>
+      </w:r>
+      <w:r>
+        <w:rPr>
+          <w:rFonts w:ascii="Consolas" w:hAnsi="Consolas"/>
+          <w:color w:val="17C6A3"/>
+          <w:sz w:val="20"/>
+          <w:szCs w:val="20"/>
+        </w:rPr>
+        <w:t>"Opening Word Document"</w:t>
+      </w:r>
+      <w:r>
+        <w:rPr>
+          <w:rFonts w:ascii="Consolas" w:hAnsi="Consolas"/>
+          <w:color w:val="F9FAF4"/>
+          <w:sz w:val="20"/>
+          <w:szCs w:val="20"/>
+        </w:rPr>
+        <w:t>)</w:t>
+      </w:r>
+      <w:r>
+        <w:rPr>
+          <w:rFonts w:ascii="Consolas" w:hAnsi="Consolas"/>
+          <w:color w:val="E6E6FA"/>
+          <w:sz w:val="20"/>
+          <w:szCs w:val="20"/>
+        </w:rPr>
+        <w:t>;</w:t>
+      </w:r>
+    </w:p>
+    <w:p>
+      <w:pPr>
+        <w:pStyle w:val="NormalWeb"/>
+        <w:shd w:val="clear" w:color="auto" w:fill="1E1F22"/>
+        <w:spacing w:before="0" w:beforeAutospacing="0" w:after="0" w:afterAutospacing="0"/>
+        <w:rPr>
+          <w:rFonts w:ascii="Consolas" w:hAnsi="Consolas"/>
+          <w:color w:val="CCCCCC"/>
+          <w:sz w:val="20"/>
+          <w:szCs w:val="20"/>
+        </w:rPr>
+      </w:pPr>
+      <w:r>
+        <w:rPr>
+          <w:rFonts w:ascii="Consolas" w:hAnsi="Consolas"/>
+          <w:color w:val="D9E8F7"/>
+          <w:sz w:val="20"/>
+          <w:szCs w:val="20"/>
+        </w:rPr>
+        <w:t xml:space="preserve">    </w:t>
+      </w:r>
+      <w:r>
+        <w:rPr>
+          <w:rFonts w:ascii="Consolas" w:hAnsi="Consolas"/>
+          <w:color w:val="F9FAF4"/>
+          <w:sz w:val="20"/>
+          <w:szCs w:val="20"/>
+        </w:rPr>
+        <w:t>}</w:t>
+      </w:r>
+    </w:p>
+    <w:p>
+      <w:pPr>
+        <w:pStyle w:val="NormalWeb"/>
+        <w:shd w:val="clear" w:color="auto" w:fill="1E1F22"/>
+        <w:spacing w:before="0" w:beforeAutospacing="0" w:after="0" w:afterAutospacing="0"/>
+        <w:rPr>
+          <w:rFonts w:ascii="Consolas" w:hAnsi="Consolas"/>
+          <w:color w:val="CCCCCC"/>
+          <w:sz w:val="20"/>
+          <w:szCs w:val="20"/>
+        </w:rPr>
+      </w:pPr>
+      <w:r>
+        <w:rPr>
+          <w:rFonts w:ascii="Consolas" w:hAnsi="Consolas"/>
+          <w:color w:val="F9FAF4"/>
+          <w:sz w:val="20"/>
+          <w:szCs w:val="20"/>
+        </w:rPr>
+        <w:t>}</w:t>
+      </w:r>
+    </w:p>
+    <w:p>
+      <w:pPr>
+        <w:rPr>
+          <w:b/>
+          <w:bCs/>
+        </w:rPr>
+      </w:pPr>
+    </w:p>
+    <w:p>
+      <w:pPr>
+        <w:rPr>
+          <w:b/>
+          <w:bCs/>
+        </w:rPr>
+      </w:pPr>
+      <w:r>
+        <w:rPr>
+          <w:b/>
+          <w:bCs/>
+        </w:rPr>
+        <w:t>WordFactory.java</w:t>
+      </w:r>
+    </w:p>
+    <w:p>
+      <w:pPr>
+        <w:pStyle w:val="NormalWeb"/>
+        <w:shd w:val="clear" w:color="auto" w:fill="1E1F22"/>
+        <w:spacing w:before="0" w:beforeAutospacing="0" w:after="0" w:afterAutospacing="0"/>
+        <w:rPr>
+          <w:rFonts w:ascii="Consolas" w:hAnsi="Consolas"/>
+          <w:color w:val="CCCCCC"/>
+          <w:sz w:val="20"/>
+          <w:szCs w:val="20"/>
+        </w:rPr>
+      </w:pPr>
+      <w:r>
+        <w:rPr>
+          <w:rFonts w:ascii="Consolas" w:hAnsi="Consolas"/>
+          <w:color w:val="CC6C1D"/>
+          <w:sz w:val="20"/>
+          <w:szCs w:val="20"/>
+        </w:rPr>
+        <w:t>package</w:t>
+      </w:r>
+      <w:r>
+        <w:rPr>
+          <w:rFonts w:ascii="Consolas" w:hAnsi="Consolas"/>
+          <w:color w:val="D9E8F7"/>
+          <w:sz w:val="20"/>
+          <w:szCs w:val="20"/>
+        </w:rPr>
+        <w:t xml:space="preserve"> </w:t>
+      </w:r>
+      <w:proofErr w:type="spellStart"/>
+      <w:proofErr w:type="gramStart"/>
+      <w:r>
+        <w:rPr>
+          <w:rFonts w:ascii="Consolas" w:hAnsi="Consolas"/>
+          <w:color w:val="D9E8F7"/>
+          <w:sz w:val="20"/>
+          <w:szCs w:val="20"/>
+        </w:rPr>
+        <w:t>com</w:t>
+      </w:r>
+      <w:r>
+        <w:rPr>
+          <w:rFonts w:ascii="Consolas" w:hAnsi="Consolas"/>
+          <w:color w:val="E6E6FA"/>
+          <w:sz w:val="20"/>
+          <w:szCs w:val="20"/>
+        </w:rPr>
+        <w:t>.</w:t>
+      </w:r>
+      <w:r>
+        <w:rPr>
+          <w:rFonts w:ascii="Consolas" w:hAnsi="Consolas"/>
+          <w:color w:val="D9E8F7"/>
+          <w:sz w:val="20"/>
+          <w:szCs w:val="20"/>
+        </w:rPr>
+        <w:t>result</w:t>
+      </w:r>
+      <w:proofErr w:type="gramEnd"/>
+      <w:r>
+        <w:rPr>
+          <w:rFonts w:ascii="Consolas" w:hAnsi="Consolas"/>
+          <w:color w:val="E6E6FA"/>
+          <w:sz w:val="20"/>
+          <w:szCs w:val="20"/>
+        </w:rPr>
+        <w:t>.</w:t>
+      </w:r>
+      <w:r>
+        <w:rPr>
+          <w:rFonts w:ascii="Consolas" w:hAnsi="Consolas"/>
+          <w:color w:val="D9E8F7"/>
+          <w:sz w:val="20"/>
+          <w:szCs w:val="20"/>
+        </w:rPr>
+        <w:t>factory</w:t>
+      </w:r>
+      <w:proofErr w:type="spellEnd"/>
+      <w:r>
+        <w:rPr>
+          <w:rFonts w:ascii="Consolas" w:hAnsi="Consolas"/>
+          <w:color w:val="E6E6FA"/>
+          <w:sz w:val="20"/>
+          <w:szCs w:val="20"/>
+        </w:rPr>
+        <w:t>;</w:t>
+      </w:r>
+    </w:p>
+    <w:p>
+      <w:pPr>
+        <w:pStyle w:val="NormalWeb"/>
+        <w:shd w:val="clear" w:color="auto" w:fill="1E1F22"/>
+        <w:spacing w:before="0" w:beforeAutospacing="0" w:after="0" w:afterAutospacing="0"/>
+        <w:rPr>
+          <w:rFonts w:ascii="Consolas" w:hAnsi="Consolas"/>
+          <w:color w:val="CCCCCC"/>
+          <w:sz w:val="20"/>
+          <w:szCs w:val="20"/>
+        </w:rPr>
+      </w:pPr>
+    </w:p>
+    <w:p>
+      <w:pPr>
+        <w:pStyle w:val="NormalWeb"/>
+        <w:shd w:val="clear" w:color="auto" w:fill="1E1F22"/>
+        <w:spacing w:before="0" w:beforeAutospacing="0" w:after="0" w:afterAutospacing="0"/>
+        <w:rPr>
+          <w:rFonts w:ascii="Consolas" w:hAnsi="Consolas"/>
+          <w:color w:val="CCCCCC"/>
+          <w:sz w:val="20"/>
+          <w:szCs w:val="20"/>
+        </w:rPr>
+      </w:pPr>
+      <w:r>
+        <w:rPr>
+          <w:rFonts w:ascii="Consolas" w:hAnsi="Consolas"/>
+          <w:color w:val="CC6C1D"/>
+          <w:sz w:val="20"/>
+          <w:szCs w:val="20"/>
+        </w:rPr>
+        <w:t>public</w:t>
+      </w:r>
+      <w:r>
+        <w:rPr>
+          <w:rFonts w:ascii="Consolas" w:hAnsi="Consolas"/>
+          <w:color w:val="D9E8F7"/>
+          <w:sz w:val="20"/>
+          <w:szCs w:val="20"/>
+        </w:rPr>
+        <w:t xml:space="preserve"> </w:t>
+      </w:r>
+      <w:r>
+        <w:rPr>
+          <w:rFonts w:ascii="Consolas" w:hAnsi="Consolas"/>
+          <w:color w:val="CC6C1D"/>
+          <w:sz w:val="20"/>
+          <w:szCs w:val="20"/>
+        </w:rPr>
+        <w:t>class</w:t>
+      </w:r>
+      <w:r>
+        <w:rPr>
+          <w:rFonts w:ascii="Consolas" w:hAnsi="Consolas"/>
+          <w:color w:val="D9E8F7"/>
+          <w:sz w:val="20"/>
+          <w:szCs w:val="20"/>
+        </w:rPr>
+        <w:t xml:space="preserve"> </w:t>
+      </w:r>
+      <w:proofErr w:type="spellStart"/>
+      <w:r>
+        <w:rPr>
+          <w:rFonts w:ascii="Consolas" w:hAnsi="Consolas"/>
+          <w:color w:val="1290C3"/>
+          <w:sz w:val="20"/>
+          <w:szCs w:val="20"/>
+        </w:rPr>
+        <w:t>WordFactory</w:t>
+      </w:r>
+      <w:proofErr w:type="spellEnd"/>
+      <w:r>
+        <w:rPr>
+          <w:rFonts w:ascii="Consolas" w:hAnsi="Consolas"/>
+          <w:color w:val="D9E8F7"/>
+          <w:sz w:val="20"/>
+          <w:szCs w:val="20"/>
+        </w:rPr>
+        <w:t xml:space="preserve"> </w:t>
+      </w:r>
+      <w:r>
+        <w:rPr>
+          <w:rFonts w:ascii="Consolas" w:hAnsi="Consolas"/>
+          <w:color w:val="CC6C1D"/>
+          <w:sz w:val="20"/>
+          <w:szCs w:val="20"/>
+        </w:rPr>
+        <w:t>extends</w:t>
+      </w:r>
+      <w:r>
+        <w:rPr>
+          <w:rFonts w:ascii="Consolas" w:hAnsi="Consolas"/>
+          <w:color w:val="D9E8F7"/>
+          <w:sz w:val="20"/>
+          <w:szCs w:val="20"/>
+        </w:rPr>
+        <w:t xml:space="preserve"> </w:t>
+      </w:r>
+      <w:proofErr w:type="spellStart"/>
+      <w:r>
+        <w:rPr>
+          <w:rFonts w:ascii="Consolas" w:hAnsi="Consolas"/>
+          <w:color w:val="3EABE6"/>
+          <w:sz w:val="20"/>
+          <w:szCs w:val="20"/>
+        </w:rPr>
+        <w:t>DocumentFactory</w:t>
+      </w:r>
+      <w:proofErr w:type="spellEnd"/>
+      <w:r>
+        <w:rPr>
+          <w:rFonts w:ascii="Consolas" w:hAnsi="Consolas"/>
+          <w:color w:val="D9E8F7"/>
+          <w:sz w:val="20"/>
+          <w:szCs w:val="20"/>
+        </w:rPr>
+        <w:t xml:space="preserve"> </w:t>
+      </w:r>
+      <w:r>
+        <w:rPr>
+          <w:rFonts w:ascii="Consolas" w:hAnsi="Consolas"/>
+          <w:color w:val="F9FAF4"/>
+          <w:sz w:val="20"/>
+          <w:szCs w:val="20"/>
+        </w:rPr>
+        <w:t>{</w:t>
+      </w:r>
+    </w:p>
+    <w:p>
+      <w:pPr>
+        <w:pStyle w:val="NormalWeb"/>
+        <w:shd w:val="clear" w:color="auto" w:fill="1E1F22"/>
+        <w:spacing w:before="0" w:beforeAutospacing="0" w:after="0" w:afterAutospacing="0"/>
+        <w:rPr>
+          <w:rFonts w:ascii="Consolas" w:hAnsi="Consolas"/>
+          <w:color w:val="CCCCCC"/>
+          <w:sz w:val="20"/>
+          <w:szCs w:val="20"/>
+        </w:rPr>
+      </w:pPr>
+    </w:p>
+    <w:p>
+      <w:pPr>
+        <w:pStyle w:val="NormalWeb"/>
+        <w:shd w:val="clear" w:color="auto" w:fill="1E1F22"/>
+        <w:spacing w:before="0" w:beforeAutospacing="0" w:after="0" w:afterAutospacing="0"/>
+        <w:rPr>
+          <w:rFonts w:ascii="Consolas" w:hAnsi="Consolas"/>
+          <w:color w:val="CCCCCC"/>
+          <w:sz w:val="20"/>
+          <w:szCs w:val="20"/>
+        </w:rPr>
+      </w:pPr>
+      <w:r>
+        <w:rPr>
+          <w:rFonts w:ascii="Consolas" w:hAnsi="Consolas"/>
+          <w:color w:val="D9E8F7"/>
+          <w:sz w:val="20"/>
+          <w:szCs w:val="20"/>
+        </w:rPr>
+        <w:t xml:space="preserve">    </w:t>
+      </w:r>
+      <w:r>
+        <w:rPr>
+          <w:rFonts w:ascii="Consolas" w:hAnsi="Consolas"/>
+          <w:i/>
+          <w:iCs/>
+          <w:color w:val="A0A0A0"/>
+          <w:sz w:val="20"/>
+          <w:szCs w:val="20"/>
+        </w:rPr>
+        <w:t>@Override</w:t>
+      </w:r>
+    </w:p>
+    <w:p>
+      <w:pPr>
+        <w:pStyle w:val="NormalWeb"/>
+        <w:shd w:val="clear" w:color="auto" w:fill="1E1F22"/>
+        <w:spacing w:before="0" w:beforeAutospacing="0" w:after="0" w:afterAutospacing="0"/>
+        <w:rPr>
+          <w:rFonts w:ascii="Consolas" w:hAnsi="Consolas"/>
+          <w:color w:val="CCCCCC"/>
+          <w:sz w:val="20"/>
+          <w:szCs w:val="20"/>
+        </w:rPr>
+      </w:pPr>
+      <w:r>
+        <w:rPr>
+          <w:rFonts w:ascii="Consolas" w:hAnsi="Consolas"/>
+          <w:color w:val="D9E8F7"/>
+          <w:sz w:val="20"/>
+          <w:szCs w:val="20"/>
+        </w:rPr>
+        <w:t xml:space="preserve">    </w:t>
+      </w:r>
+      <w:r>
+        <w:rPr>
+          <w:rFonts w:ascii="Consolas" w:hAnsi="Consolas"/>
+          <w:color w:val="CC6C1D"/>
+          <w:sz w:val="20"/>
+          <w:szCs w:val="20"/>
+        </w:rPr>
+        <w:t>public</w:t>
+      </w:r>
+      <w:r>
+        <w:rPr>
+          <w:rFonts w:ascii="Consolas" w:hAnsi="Consolas"/>
+          <w:color w:val="D9E8F7"/>
+          <w:sz w:val="20"/>
+          <w:szCs w:val="20"/>
+        </w:rPr>
+        <w:t xml:space="preserve"> </w:t>
+      </w:r>
+      <w:r>
+        <w:rPr>
+          <w:rFonts w:ascii="Consolas" w:hAnsi="Consolas"/>
+          <w:color w:val="80F2F6"/>
+          <w:sz w:val="20"/>
+          <w:szCs w:val="20"/>
+        </w:rPr>
+        <w:t>Document</w:t>
+      </w:r>
+      <w:r>
+        <w:rPr>
+          <w:rFonts w:ascii="Consolas" w:hAnsi="Consolas"/>
+          <w:color w:val="D9E8F7"/>
+          <w:sz w:val="20"/>
+          <w:szCs w:val="20"/>
+        </w:rPr>
+        <w:t xml:space="preserve"> </w:t>
+      </w:r>
+      <w:proofErr w:type="spellStart"/>
+      <w:proofErr w:type="gramStart"/>
+      <w:r>
+        <w:rPr>
+          <w:rFonts w:ascii="Consolas" w:hAnsi="Consolas"/>
+          <w:color w:val="1EB540"/>
+          <w:sz w:val="20"/>
+          <w:szCs w:val="20"/>
+        </w:rPr>
+        <w:t>createDocument</w:t>
+      </w:r>
+      <w:proofErr w:type="spellEnd"/>
+      <w:r>
+        <w:rPr>
+          <w:rFonts w:ascii="Consolas" w:hAnsi="Consolas"/>
+          <w:color w:val="F9FAF4"/>
+          <w:sz w:val="20"/>
+          <w:szCs w:val="20"/>
+        </w:rPr>
+        <w:t>(</w:t>
+      </w:r>
+      <w:proofErr w:type="gramEnd"/>
+      <w:r>
+        <w:rPr>
+          <w:rFonts w:ascii="Consolas" w:hAnsi="Consolas"/>
+          <w:color w:val="F9FAF4"/>
+          <w:sz w:val="20"/>
+          <w:szCs w:val="20"/>
+        </w:rPr>
+        <w:t>)</w:t>
+      </w:r>
+      <w:r>
+        <w:rPr>
+          <w:rFonts w:ascii="Consolas" w:hAnsi="Consolas"/>
+          <w:color w:val="D9E8F7"/>
+          <w:sz w:val="20"/>
+          <w:szCs w:val="20"/>
+        </w:rPr>
+        <w:t xml:space="preserve"> </w:t>
+      </w:r>
+      <w:r>
+        <w:rPr>
+          <w:rFonts w:ascii="Consolas" w:hAnsi="Consolas"/>
+          <w:color w:val="F9FAF4"/>
+          <w:sz w:val="20"/>
+          <w:szCs w:val="20"/>
+        </w:rPr>
+        <w:t>{</w:t>
+      </w:r>
+    </w:p>
+    <w:p>
+      <w:pPr>
+        <w:pStyle w:val="NormalWeb"/>
+        <w:shd w:val="clear" w:color="auto" w:fill="1E1F22"/>
+        <w:spacing w:before="0" w:beforeAutospacing="0" w:after="0" w:afterAutospacing="0"/>
+        <w:rPr>
+          <w:rFonts w:ascii="Consolas" w:hAnsi="Consolas"/>
+          <w:color w:val="CCCCCC"/>
+          <w:sz w:val="20"/>
+          <w:szCs w:val="20"/>
+        </w:rPr>
+      </w:pPr>
+      <w:r>
+        <w:rPr>
+          <w:rFonts w:ascii="Consolas" w:hAnsi="Consolas"/>
+          <w:color w:val="D9E8F7"/>
+          <w:sz w:val="20"/>
+          <w:szCs w:val="20"/>
+        </w:rPr>
+        <w:t xml:space="preserve">        </w:t>
+      </w:r>
+      <w:r>
+        <w:rPr>
+          <w:rFonts w:ascii="Consolas" w:hAnsi="Consolas"/>
+          <w:color w:val="CC6C1D"/>
+          <w:sz w:val="20"/>
+          <w:szCs w:val="20"/>
+        </w:rPr>
+        <w:t>return</w:t>
+      </w:r>
+      <w:r>
+        <w:rPr>
+          <w:rFonts w:ascii="Consolas" w:hAnsi="Consolas"/>
+          <w:color w:val="D9E8F7"/>
+          <w:sz w:val="20"/>
+          <w:szCs w:val="20"/>
+        </w:rPr>
+        <w:t xml:space="preserve"> </w:t>
+      </w:r>
+      <w:r>
+        <w:rPr>
+          <w:rFonts w:ascii="Consolas" w:hAnsi="Consolas"/>
+          <w:color w:val="CC6C1D"/>
+          <w:sz w:val="20"/>
+          <w:szCs w:val="20"/>
+        </w:rPr>
+        <w:t>new</w:t>
+      </w:r>
+      <w:r>
+        <w:rPr>
+          <w:rFonts w:ascii="Consolas" w:hAnsi="Consolas"/>
+          <w:color w:val="D9E8F7"/>
+          <w:sz w:val="20"/>
+          <w:szCs w:val="20"/>
+        </w:rPr>
+        <w:t xml:space="preserve"> </w:t>
+      </w:r>
+      <w:proofErr w:type="spellStart"/>
+      <w:proofErr w:type="gramStart"/>
+      <w:r>
+        <w:rPr>
+          <w:rFonts w:ascii="Consolas" w:hAnsi="Consolas"/>
+          <w:color w:val="A7EC21"/>
+          <w:sz w:val="20"/>
+          <w:szCs w:val="20"/>
+        </w:rPr>
+        <w:t>WordDocument</w:t>
+      </w:r>
+      <w:proofErr w:type="spellEnd"/>
+      <w:r>
+        <w:rPr>
+          <w:rFonts w:ascii="Consolas" w:hAnsi="Consolas"/>
+          <w:color w:val="F9FAF4"/>
+          <w:sz w:val="20"/>
+          <w:szCs w:val="20"/>
+        </w:rPr>
+        <w:t>(</w:t>
+      </w:r>
+      <w:proofErr w:type="gramEnd"/>
+      <w:r>
+        <w:rPr>
+          <w:rFonts w:ascii="Consolas" w:hAnsi="Consolas"/>
+          <w:color w:val="F9FAF4"/>
+          <w:sz w:val="20"/>
+          <w:szCs w:val="20"/>
+        </w:rPr>
+        <w:t>)</w:t>
+      </w:r>
+      <w:r>
+        <w:rPr>
+          <w:rFonts w:ascii="Consolas" w:hAnsi="Consolas"/>
+          <w:color w:val="E6E6FA"/>
+          <w:sz w:val="20"/>
+          <w:szCs w:val="20"/>
+        </w:rPr>
+        <w:t>;</w:t>
+      </w:r>
+    </w:p>
+    <w:p>
+      <w:pPr>
+        <w:pStyle w:val="NormalWeb"/>
+        <w:shd w:val="clear" w:color="auto" w:fill="1E1F22"/>
+        <w:spacing w:before="0" w:beforeAutospacing="0" w:after="0" w:afterAutospacing="0"/>
+        <w:rPr>
+          <w:rFonts w:ascii="Consolas" w:hAnsi="Consolas"/>
+          <w:color w:val="CCCCCC"/>
+          <w:sz w:val="20"/>
+          <w:szCs w:val="20"/>
+        </w:rPr>
+      </w:pPr>
+      <w:r>
+        <w:rPr>
+          <w:rFonts w:ascii="Consolas" w:hAnsi="Consolas"/>
+          <w:color w:val="D9E8F7"/>
+          <w:sz w:val="20"/>
+          <w:szCs w:val="20"/>
+        </w:rPr>
+        <w:t xml:space="preserve">    </w:t>
+      </w:r>
+      <w:r>
+        <w:rPr>
+          <w:rFonts w:ascii="Consolas" w:hAnsi="Consolas"/>
+          <w:color w:val="F9FAF4"/>
+          <w:sz w:val="20"/>
+          <w:szCs w:val="20"/>
+        </w:rPr>
+        <w:t>}</w:t>
+      </w:r>
+    </w:p>
+    <w:p>
+      <w:pPr>
+        <w:pStyle w:val="NormalWeb"/>
+        <w:shd w:val="clear" w:color="auto" w:fill="1E1F22"/>
+        <w:spacing w:before="0" w:beforeAutospacing="0" w:after="0" w:afterAutospacing="0"/>
+        <w:rPr>
+          <w:rFonts w:ascii="Consolas" w:hAnsi="Consolas"/>
+          <w:color w:val="CCCCCC"/>
+          <w:sz w:val="20"/>
+          <w:szCs w:val="20"/>
+        </w:rPr>
+      </w:pPr>
+      <w:r>
+        <w:rPr>
+          <w:rFonts w:ascii="Consolas" w:hAnsi="Consolas"/>
+          <w:color w:val="F9FAF4"/>
+          <w:sz w:val="20"/>
+          <w:szCs w:val="20"/>
+        </w:rPr>
+        <w:t>}</w:t>
+      </w:r>
+    </w:p>
+    <w:p>
+      <w:pPr>
+        <w:rPr>
+          <w:b/>
+          <w:bCs/>
+        </w:rPr>
+      </w:pPr>
+    </w:p>
+    <w:p>
+      <w:pPr>
+        <w:rPr>
+          <w:b/>
+          <w:bCs/>
+        </w:rPr>
+      </w:pPr>
+    </w:p>
+    <w:p>
+      <w:pPr>
+        <w:rPr>
+          <w:b/>
+          <w:bCs/>
+        </w:rPr>
+      </w:pPr>
     </w:p>
     <w:sectPr>
       <w:pgSz w:w="12240" w:h="15840"/>
@@ -4136,7 +8142,6 @@
     <w:name w:val="Normal (Web)"/>
     <w:basedOn w:val="Normal"/>
     <w:uiPriority w:val="99"/>
-    <w:semiHidden/>
     <w:unhideWhenUsed/>
     <w:rsid w:val="004826F5"/>
     <w:pPr>

</xml_diff>

<commit_message>
Updated Output of Exercise 2: Implementing the Factory Method Pattern
</commit_message>
<xml_diff>
--- a/Engineering Concepts/Design Pattern & Principles.docx
+++ b/Engineering Concepts/Design Pattern & Principles.docx
@@ -100,18 +100,7 @@
           <w:sz w:val="20"/>
           <w:szCs w:val="20"/>
         </w:rPr>
-        <w:t xml:space="preserve"> </w:t>
-      </w:r>
-      <w:proofErr w:type="spellStart"/>
-      <w:proofErr w:type="gramStart"/>
-      <w:r>
-        <w:rPr>
-          <w:rFonts w:ascii="Consolas" w:hAnsi="Consolas"/>
-          <w:color w:val="D9E8F7"/>
-          <w:sz w:val="20"/>
-          <w:szCs w:val="20"/>
-        </w:rPr>
-        <w:t>com</w:t>
+        <w:t xml:space="preserve"> com</w:t>
       </w:r>
       <w:r>
         <w:rPr>
@@ -131,7 +120,6 @@
         </w:rPr>
         <w:t>result</w:t>
       </w:r>
-      <w:proofErr w:type="gramEnd"/>
       <w:r>
         <w:rPr>
           <w:rFonts w:ascii="Consolas" w:hAnsi="Consolas"/>
@@ -150,7 +138,6 @@
         </w:rPr>
         <w:t>Singleton</w:t>
       </w:r>
-      <w:proofErr w:type="spellEnd"/>
       <w:r>
         <w:rPr>
           <w:rFonts w:ascii="Consolas" w:hAnsi="Consolas"/>
@@ -209,7 +196,6 @@
         </w:rPr>
         <w:t xml:space="preserve"> </w:t>
       </w:r>
-      <w:proofErr w:type="spellStart"/>
       <w:r>
         <w:rPr>
           <w:rFonts w:ascii="Consolas" w:hAnsi="Consolas"/>
@@ -219,7 +205,6 @@
         </w:rPr>
         <w:t>SingletonTest</w:t>
       </w:r>
-      <w:proofErr w:type="spellEnd"/>
       <w:r>
         <w:rPr>
           <w:rFonts w:ascii="Consolas" w:hAnsi="Consolas"/>
@@ -327,7 +312,6 @@
         </w:rPr>
         <w:t xml:space="preserve"> </w:t>
       </w:r>
-      <w:proofErr w:type="gramStart"/>
       <w:r>
         <w:rPr>
           <w:rFonts w:ascii="Consolas" w:hAnsi="Consolas"/>
@@ -362,28 +346,17 @@
           <w:sz w:val="20"/>
           <w:szCs w:val="20"/>
         </w:rPr>
-        <w:t>[</w:t>
-      </w:r>
-      <w:proofErr w:type="gramEnd"/>
-      <w:r>
-        <w:rPr>
-          <w:rFonts w:ascii="Consolas" w:hAnsi="Consolas"/>
-          <w:color w:val="F9FAF4"/>
-          <w:sz w:val="20"/>
-          <w:szCs w:val="20"/>
-        </w:rPr>
-        <w:t>]</w:t>
-      </w:r>
-      <w:r>
-        <w:rPr>
-          <w:rFonts w:ascii="Consolas" w:hAnsi="Consolas"/>
-          <w:color w:val="D9E8F7"/>
-          <w:sz w:val="20"/>
-          <w:szCs w:val="20"/>
-        </w:rPr>
-        <w:t xml:space="preserve"> </w:t>
-      </w:r>
-      <w:proofErr w:type="spellStart"/>
+        <w:t>[]</w:t>
+      </w:r>
+      <w:r>
+        <w:rPr>
+          <w:rFonts w:ascii="Consolas" w:hAnsi="Consolas"/>
+          <w:color w:val="D9E8F7"/>
+          <w:sz w:val="20"/>
+          <w:szCs w:val="20"/>
+        </w:rPr>
+        <w:t xml:space="preserve"> </w:t>
+      </w:r>
       <w:r>
         <w:rPr>
           <w:rFonts w:ascii="Consolas" w:hAnsi="Consolas"/>
@@ -393,7 +366,6 @@
         </w:rPr>
         <w:t>args</w:t>
       </w:r>
-      <w:proofErr w:type="spellEnd"/>
       <w:r>
         <w:rPr>
           <w:rFonts w:ascii="Consolas" w:hAnsi="Consolas"/>
@@ -541,7 +513,6 @@
         </w:rPr>
         <w:t xml:space="preserve"> </w:t>
       </w:r>
-      <w:proofErr w:type="spellStart"/>
       <w:r>
         <w:rPr>
           <w:rFonts w:ascii="Consolas" w:hAnsi="Consolas"/>
@@ -571,7 +542,6 @@
         </w:rPr>
         <w:t>getInstance</w:t>
       </w:r>
-      <w:proofErr w:type="spellEnd"/>
       <w:r>
         <w:rPr>
           <w:rFonts w:ascii="Consolas" w:hAnsi="Consolas"/>
@@ -656,7 +626,6 @@
         </w:rPr>
         <w:t xml:space="preserve">        </w:t>
       </w:r>
-      <w:proofErr w:type="gramStart"/>
       <w:r>
         <w:rPr>
           <w:rFonts w:ascii="Consolas" w:hAnsi="Consolas"/>
@@ -693,7 +662,6 @@
         </w:rPr>
         <w:t>(</w:t>
       </w:r>
-      <w:proofErr w:type="gramEnd"/>
       <w:r>
         <w:rPr>
           <w:rFonts w:ascii="Consolas" w:hAnsi="Consolas"/>
@@ -841,7 +809,6 @@
         </w:rPr>
         <w:t xml:space="preserve"> </w:t>
       </w:r>
-      <w:proofErr w:type="spellStart"/>
       <w:r>
         <w:rPr>
           <w:rFonts w:ascii="Consolas" w:hAnsi="Consolas"/>
@@ -871,7 +838,6 @@
         </w:rPr>
         <w:t>getInstance</w:t>
       </w:r>
-      <w:proofErr w:type="spellEnd"/>
       <w:r>
         <w:rPr>
           <w:rFonts w:ascii="Consolas" w:hAnsi="Consolas"/>
@@ -925,7 +891,6 @@
         </w:rPr>
         <w:t xml:space="preserve">        </w:t>
       </w:r>
-      <w:proofErr w:type="gramStart"/>
       <w:r>
         <w:rPr>
           <w:rFonts w:ascii="Consolas" w:hAnsi="Consolas"/>
@@ -962,7 +927,6 @@
         </w:rPr>
         <w:t>(</w:t>
       </w:r>
-      <w:proofErr w:type="gramEnd"/>
       <w:r>
         <w:rPr>
           <w:rFonts w:ascii="Consolas" w:hAnsi="Consolas"/>
@@ -1177,7 +1141,6 @@
         </w:rPr>
         <w:t xml:space="preserve">            </w:t>
       </w:r>
-      <w:proofErr w:type="spellStart"/>
       <w:r>
         <w:rPr>
           <w:rFonts w:ascii="Consolas" w:hAnsi="Consolas"/>
@@ -1227,7 +1190,6 @@
         </w:rPr>
         <w:t>println</w:t>
       </w:r>
-      <w:proofErr w:type="spellEnd"/>
       <w:r>
         <w:rPr>
           <w:rFonts w:ascii="Consolas" w:hAnsi="Consolas"/>
@@ -1353,7 +1315,6 @@
         </w:rPr>
         <w:t xml:space="preserve">            </w:t>
       </w:r>
-      <w:proofErr w:type="spellStart"/>
       <w:r>
         <w:rPr>
           <w:rFonts w:ascii="Consolas" w:hAnsi="Consolas"/>
@@ -1403,7 +1364,6 @@
         </w:rPr>
         <w:t>println</w:t>
       </w:r>
-      <w:proofErr w:type="spellEnd"/>
       <w:r>
         <w:rPr>
           <w:rFonts w:ascii="Consolas" w:hAnsi="Consolas"/>
@@ -1576,18 +1536,7 @@
           <w:sz w:val="20"/>
           <w:szCs w:val="20"/>
         </w:rPr>
-        <w:t xml:space="preserve"> </w:t>
-      </w:r>
-      <w:proofErr w:type="spellStart"/>
-      <w:proofErr w:type="gramStart"/>
-      <w:r>
-        <w:rPr>
-          <w:rFonts w:ascii="Consolas" w:hAnsi="Consolas"/>
-          <w:color w:val="D9E8F7"/>
-          <w:sz w:val="20"/>
-          <w:szCs w:val="20"/>
-        </w:rPr>
-        <w:t>com</w:t>
+        <w:t xml:space="preserve"> com</w:t>
       </w:r>
       <w:r>
         <w:rPr>
@@ -1607,7 +1556,6 @@
         </w:rPr>
         <w:t>result</w:t>
       </w:r>
-      <w:proofErr w:type="gramEnd"/>
       <w:r>
         <w:rPr>
           <w:rFonts w:ascii="Consolas" w:hAnsi="Consolas"/>
@@ -1626,7 +1574,6 @@
         </w:rPr>
         <w:t>Singleton</w:t>
       </w:r>
-      <w:proofErr w:type="spellEnd"/>
       <w:r>
         <w:rPr>
           <w:rFonts w:ascii="Consolas" w:hAnsi="Consolas"/>
@@ -1918,7 +1865,6 @@
         </w:rPr>
         <w:t xml:space="preserve"> </w:t>
       </w:r>
-      <w:proofErr w:type="gramStart"/>
       <w:r>
         <w:rPr>
           <w:rFonts w:ascii="Consolas" w:hAnsi="Consolas"/>
@@ -1935,17 +1881,7 @@
           <w:sz w:val="20"/>
           <w:szCs w:val="20"/>
         </w:rPr>
-        <w:t>(</w:t>
-      </w:r>
-      <w:proofErr w:type="gramEnd"/>
-      <w:r>
-        <w:rPr>
-          <w:rFonts w:ascii="Consolas" w:hAnsi="Consolas"/>
-          <w:color w:val="F9FAF4"/>
-          <w:sz w:val="20"/>
-          <w:szCs w:val="20"/>
-        </w:rPr>
-        <w:t>)</w:t>
+        <w:t>()</w:t>
       </w:r>
       <w:r>
         <w:rPr>
@@ -1987,7 +1923,6 @@
         </w:rPr>
         <w:t xml:space="preserve">        </w:t>
       </w:r>
-      <w:proofErr w:type="spellStart"/>
       <w:r>
         <w:rPr>
           <w:rFonts w:ascii="Consolas" w:hAnsi="Consolas"/>
@@ -2037,7 +1972,6 @@
         </w:rPr>
         <w:t>println</w:t>
       </w:r>
-      <w:proofErr w:type="spellEnd"/>
       <w:r>
         <w:rPr>
           <w:rFonts w:ascii="Consolas" w:hAnsi="Consolas"/>
@@ -2225,8 +2159,6 @@
         </w:rPr>
         <w:t xml:space="preserve"> </w:t>
       </w:r>
-      <w:proofErr w:type="spellStart"/>
-      <w:proofErr w:type="gramStart"/>
       <w:r>
         <w:rPr>
           <w:rFonts w:ascii="Consolas" w:hAnsi="Consolas"/>
@@ -2236,25 +2168,14 @@
         </w:rPr>
         <w:t>getInstance</w:t>
       </w:r>
-      <w:proofErr w:type="spellEnd"/>
-      <w:r>
-        <w:rPr>
-          <w:rFonts w:ascii="Consolas" w:hAnsi="Consolas"/>
-          <w:color w:val="F9FAF4"/>
-          <w:sz w:val="20"/>
-          <w:szCs w:val="20"/>
-        </w:rPr>
-        <w:t>(</w:t>
-      </w:r>
-      <w:proofErr w:type="gramEnd"/>
-      <w:r>
-        <w:rPr>
-          <w:rFonts w:ascii="Consolas" w:hAnsi="Consolas"/>
-          <w:color w:val="F9FAF4"/>
-          <w:sz w:val="20"/>
-          <w:szCs w:val="20"/>
-        </w:rPr>
-        <w:t>)</w:t>
+      <w:r>
+        <w:rPr>
+          <w:rFonts w:ascii="Consolas" w:hAnsi="Consolas"/>
+          <w:color w:val="F9FAF4"/>
+          <w:sz w:val="20"/>
+          <w:szCs w:val="20"/>
+        </w:rPr>
+        <w:t>()</w:t>
       </w:r>
       <w:r>
         <w:rPr>
@@ -2475,7 +2396,6 @@
         </w:rPr>
         <w:t xml:space="preserve"> </w:t>
       </w:r>
-      <w:proofErr w:type="gramStart"/>
       <w:r>
         <w:rPr>
           <w:rFonts w:ascii="Consolas" w:hAnsi="Consolas"/>
@@ -2492,17 +2412,7 @@
           <w:sz w:val="20"/>
           <w:szCs w:val="20"/>
         </w:rPr>
-        <w:t>(</w:t>
-      </w:r>
-      <w:proofErr w:type="gramEnd"/>
-      <w:r>
-        <w:rPr>
-          <w:rFonts w:ascii="Consolas" w:hAnsi="Consolas"/>
-          <w:color w:val="F9FAF4"/>
-          <w:sz w:val="20"/>
-          <w:szCs w:val="20"/>
-        </w:rPr>
-        <w:t>)</w:t>
+        <w:t>()</w:t>
       </w:r>
       <w:r>
         <w:rPr>
@@ -2738,7 +2648,6 @@
         </w:rPr>
         <w:t xml:space="preserve"> </w:t>
       </w:r>
-      <w:proofErr w:type="gramStart"/>
       <w:r>
         <w:rPr>
           <w:rFonts w:ascii="Consolas" w:hAnsi="Consolas"/>
@@ -2757,7 +2666,6 @@
         </w:rPr>
         <w:t>(</w:t>
       </w:r>
-      <w:proofErr w:type="gramEnd"/>
       <w:r>
         <w:rPr>
           <w:rFonts w:ascii="Consolas" w:hAnsi="Consolas"/>
@@ -2834,7 +2742,6 @@
         </w:rPr>
         <w:t xml:space="preserve">        </w:t>
       </w:r>
-      <w:proofErr w:type="spellStart"/>
       <w:r>
         <w:rPr>
           <w:rFonts w:ascii="Consolas" w:hAnsi="Consolas"/>
@@ -2884,7 +2791,6 @@
         </w:rPr>
         <w:t>println</w:t>
       </w:r>
-      <w:proofErr w:type="spellEnd"/>
       <w:r>
         <w:rPr>
           <w:rFonts w:ascii="Consolas" w:hAnsi="Consolas"/>
@@ -3153,18 +3059,7 @@
           <w:sz w:val="20"/>
           <w:szCs w:val="20"/>
         </w:rPr>
-        <w:t xml:space="preserve"> </w:t>
-      </w:r>
-      <w:proofErr w:type="spellStart"/>
-      <w:proofErr w:type="gramStart"/>
-      <w:r>
-        <w:rPr>
-          <w:rFonts w:ascii="Consolas" w:hAnsi="Consolas"/>
-          <w:color w:val="D9E8F7"/>
-          <w:sz w:val="20"/>
-          <w:szCs w:val="20"/>
-        </w:rPr>
-        <w:t>com</w:t>
+        <w:t xml:space="preserve"> com</w:t>
       </w:r>
       <w:r>
         <w:rPr>
@@ -3184,7 +3079,6 @@
         </w:rPr>
         <w:t>result</w:t>
       </w:r>
-      <w:proofErr w:type="gramEnd"/>
       <w:r>
         <w:rPr>
           <w:rFonts w:ascii="Consolas" w:hAnsi="Consolas"/>
@@ -3203,7 +3097,6 @@
         </w:rPr>
         <w:t>factory</w:t>
       </w:r>
-      <w:proofErr w:type="spellEnd"/>
       <w:r>
         <w:rPr>
           <w:rFonts w:ascii="Consolas" w:hAnsi="Consolas"/>
@@ -3342,7 +3235,6 @@
         </w:rPr>
         <w:t xml:space="preserve"> </w:t>
       </w:r>
-      <w:proofErr w:type="gramStart"/>
       <w:r>
         <w:rPr>
           <w:rFonts w:ascii="Consolas" w:hAnsi="Consolas"/>
@@ -3359,17 +3251,7 @@
           <w:sz w:val="20"/>
           <w:szCs w:val="20"/>
         </w:rPr>
-        <w:t>(</w:t>
-      </w:r>
-      <w:proofErr w:type="gramEnd"/>
-      <w:r>
-        <w:rPr>
-          <w:rFonts w:ascii="Consolas" w:hAnsi="Consolas"/>
-          <w:color w:val="F9FAF4"/>
-          <w:sz w:val="20"/>
-          <w:szCs w:val="20"/>
-        </w:rPr>
-        <w:t>)</w:t>
+        <w:t>()</w:t>
       </w:r>
       <w:r>
         <w:rPr>
@@ -3446,18 +3328,7 @@
           <w:sz w:val="20"/>
           <w:szCs w:val="20"/>
         </w:rPr>
-        <w:t xml:space="preserve"> </w:t>
-      </w:r>
-      <w:proofErr w:type="spellStart"/>
-      <w:proofErr w:type="gramStart"/>
-      <w:r>
-        <w:rPr>
-          <w:rFonts w:ascii="Consolas" w:hAnsi="Consolas"/>
-          <w:color w:val="D9E8F7"/>
-          <w:sz w:val="20"/>
-          <w:szCs w:val="20"/>
-        </w:rPr>
-        <w:t>com</w:t>
+        <w:t xml:space="preserve"> com</w:t>
       </w:r>
       <w:r>
         <w:rPr>
@@ -3477,7 +3348,6 @@
         </w:rPr>
         <w:t>result</w:t>
       </w:r>
-      <w:proofErr w:type="gramEnd"/>
       <w:r>
         <w:rPr>
           <w:rFonts w:ascii="Consolas" w:hAnsi="Consolas"/>
@@ -3496,7 +3366,6 @@
         </w:rPr>
         <w:t>factory</w:t>
       </w:r>
-      <w:proofErr w:type="spellEnd"/>
       <w:r>
         <w:rPr>
           <w:rFonts w:ascii="Consolas" w:hAnsi="Consolas"/>
@@ -3586,7 +3455,6 @@
         </w:rPr>
         <w:t xml:space="preserve"> </w:t>
       </w:r>
-      <w:proofErr w:type="spellStart"/>
       <w:r>
         <w:rPr>
           <w:rFonts w:ascii="Consolas" w:hAnsi="Consolas"/>
@@ -3596,7 +3464,6 @@
         </w:rPr>
         <w:t>DocumentFactory</w:t>
       </w:r>
-      <w:proofErr w:type="spellEnd"/>
       <w:r>
         <w:rPr>
           <w:rFonts w:ascii="Consolas" w:hAnsi="Consolas"/>
@@ -3704,8 +3571,6 @@
         </w:rPr>
         <w:t xml:space="preserve"> </w:t>
       </w:r>
-      <w:proofErr w:type="spellStart"/>
-      <w:proofErr w:type="gramStart"/>
       <w:r>
         <w:rPr>
           <w:rFonts w:ascii="Consolas" w:hAnsi="Consolas"/>
@@ -3715,25 +3580,14 @@
         </w:rPr>
         <w:t>createDocument</w:t>
       </w:r>
-      <w:proofErr w:type="spellEnd"/>
-      <w:r>
-        <w:rPr>
-          <w:rFonts w:ascii="Consolas" w:hAnsi="Consolas"/>
-          <w:color w:val="F9FAF4"/>
-          <w:sz w:val="20"/>
-          <w:szCs w:val="20"/>
-        </w:rPr>
-        <w:t>(</w:t>
-      </w:r>
-      <w:proofErr w:type="gramEnd"/>
-      <w:r>
-        <w:rPr>
-          <w:rFonts w:ascii="Consolas" w:hAnsi="Consolas"/>
-          <w:color w:val="F9FAF4"/>
-          <w:sz w:val="20"/>
-          <w:szCs w:val="20"/>
-        </w:rPr>
-        <w:t>)</w:t>
+      <w:r>
+        <w:rPr>
+          <w:rFonts w:ascii="Consolas" w:hAnsi="Consolas"/>
+          <w:color w:val="F9FAF4"/>
+          <w:sz w:val="20"/>
+          <w:szCs w:val="20"/>
+        </w:rPr>
+        <w:t>()</w:t>
       </w:r>
       <w:r>
         <w:rPr>
@@ -3798,18 +3652,7 @@
           <w:sz w:val="20"/>
           <w:szCs w:val="20"/>
         </w:rPr>
-        <w:t xml:space="preserve"> </w:t>
-      </w:r>
-      <w:proofErr w:type="spellStart"/>
-      <w:proofErr w:type="gramStart"/>
-      <w:r>
-        <w:rPr>
-          <w:rFonts w:ascii="Consolas" w:hAnsi="Consolas"/>
-          <w:color w:val="D9E8F7"/>
-          <w:sz w:val="20"/>
-          <w:szCs w:val="20"/>
-        </w:rPr>
-        <w:t>com</w:t>
+        <w:t xml:space="preserve"> com</w:t>
       </w:r>
       <w:r>
         <w:rPr>
@@ -3829,7 +3672,6 @@
         </w:rPr>
         <w:t>result</w:t>
       </w:r>
-      <w:proofErr w:type="gramEnd"/>
       <w:r>
         <w:rPr>
           <w:rFonts w:ascii="Consolas" w:hAnsi="Consolas"/>
@@ -3848,7 +3690,6 @@
         </w:rPr>
         <w:t>factory</w:t>
       </w:r>
-      <w:proofErr w:type="spellEnd"/>
       <w:r>
         <w:rPr>
           <w:rFonts w:ascii="Consolas" w:hAnsi="Consolas"/>
@@ -3920,7 +3761,6 @@
         </w:rPr>
         <w:t xml:space="preserve"> </w:t>
       </w:r>
-      <w:proofErr w:type="spellStart"/>
       <w:r>
         <w:rPr>
           <w:rFonts w:ascii="Consolas" w:hAnsi="Consolas"/>
@@ -3930,7 +3770,6 @@
         </w:rPr>
         <w:t>ExcelDocument</w:t>
       </w:r>
-      <w:proofErr w:type="spellEnd"/>
       <w:r>
         <w:rPr>
           <w:rFonts w:ascii="Consolas" w:hAnsi="Consolas"/>
@@ -4089,7 +3928,6 @@
         </w:rPr>
         <w:t xml:space="preserve"> </w:t>
       </w:r>
-      <w:proofErr w:type="gramStart"/>
       <w:r>
         <w:rPr>
           <w:rFonts w:ascii="Consolas" w:hAnsi="Consolas"/>
@@ -4106,17 +3944,7 @@
           <w:sz w:val="20"/>
           <w:szCs w:val="20"/>
         </w:rPr>
-        <w:t>(</w:t>
-      </w:r>
-      <w:proofErr w:type="gramEnd"/>
-      <w:r>
-        <w:rPr>
-          <w:rFonts w:ascii="Consolas" w:hAnsi="Consolas"/>
-          <w:color w:val="F9FAF4"/>
-          <w:sz w:val="20"/>
-          <w:szCs w:val="20"/>
-        </w:rPr>
-        <w:t>)</w:t>
+        <w:t>()</w:t>
       </w:r>
       <w:r>
         <w:rPr>
@@ -4158,7 +3986,6 @@
         </w:rPr>
         <w:t xml:space="preserve">        </w:t>
       </w:r>
-      <w:proofErr w:type="spellStart"/>
       <w:r>
         <w:rPr>
           <w:rFonts w:ascii="Consolas" w:hAnsi="Consolas"/>
@@ -4208,7 +4035,6 @@
         </w:rPr>
         <w:t>println</w:t>
       </w:r>
-      <w:proofErr w:type="spellEnd"/>
       <w:r>
         <w:rPr>
           <w:rFonts w:ascii="Consolas" w:hAnsi="Consolas"/>
@@ -4350,18 +4176,7 @@
           <w:sz w:val="20"/>
           <w:szCs w:val="20"/>
         </w:rPr>
-        <w:t xml:space="preserve"> </w:t>
-      </w:r>
-      <w:proofErr w:type="spellStart"/>
-      <w:proofErr w:type="gramStart"/>
-      <w:r>
-        <w:rPr>
-          <w:rFonts w:ascii="Consolas" w:hAnsi="Consolas"/>
-          <w:color w:val="D9E8F7"/>
-          <w:sz w:val="20"/>
-          <w:szCs w:val="20"/>
-        </w:rPr>
-        <w:t>com</w:t>
+        <w:t xml:space="preserve"> com</w:t>
       </w:r>
       <w:r>
         <w:rPr>
@@ -4381,7 +4196,6 @@
         </w:rPr>
         <w:t>result</w:t>
       </w:r>
-      <w:proofErr w:type="gramEnd"/>
       <w:r>
         <w:rPr>
           <w:rFonts w:ascii="Consolas" w:hAnsi="Consolas"/>
@@ -4400,7 +4214,6 @@
         </w:rPr>
         <w:t>factory</w:t>
       </w:r>
-      <w:proofErr w:type="spellEnd"/>
       <w:r>
         <w:rPr>
           <w:rFonts w:ascii="Consolas" w:hAnsi="Consolas"/>
@@ -4472,7 +4285,6 @@
         </w:rPr>
         <w:t xml:space="preserve"> </w:t>
       </w:r>
-      <w:proofErr w:type="spellStart"/>
       <w:r>
         <w:rPr>
           <w:rFonts w:ascii="Consolas" w:hAnsi="Consolas"/>
@@ -4482,7 +4294,6 @@
         </w:rPr>
         <w:t>ExcelFactory</w:t>
       </w:r>
-      <w:proofErr w:type="spellEnd"/>
       <w:r>
         <w:rPr>
           <w:rFonts w:ascii="Consolas" w:hAnsi="Consolas"/>
@@ -4510,7 +4321,6 @@
         </w:rPr>
         <w:t xml:space="preserve"> </w:t>
       </w:r>
-      <w:proofErr w:type="spellStart"/>
       <w:r>
         <w:rPr>
           <w:rFonts w:ascii="Consolas" w:hAnsi="Consolas"/>
@@ -4520,7 +4330,6 @@
         </w:rPr>
         <w:t>DocumentFactory</w:t>
       </w:r>
-      <w:proofErr w:type="spellEnd"/>
       <w:r>
         <w:rPr>
           <w:rFonts w:ascii="Consolas" w:hAnsi="Consolas"/>
@@ -4643,8 +4452,6 @@
         </w:rPr>
         <w:t xml:space="preserve"> </w:t>
       </w:r>
-      <w:proofErr w:type="spellStart"/>
-      <w:proofErr w:type="gramStart"/>
       <w:r>
         <w:rPr>
           <w:rFonts w:ascii="Consolas" w:hAnsi="Consolas"/>
@@ -4654,25 +4461,14 @@
         </w:rPr>
         <w:t>createDocument</w:t>
       </w:r>
-      <w:proofErr w:type="spellEnd"/>
-      <w:r>
-        <w:rPr>
-          <w:rFonts w:ascii="Consolas" w:hAnsi="Consolas"/>
-          <w:color w:val="F9FAF4"/>
-          <w:sz w:val="20"/>
-          <w:szCs w:val="20"/>
-        </w:rPr>
-        <w:t>(</w:t>
-      </w:r>
-      <w:proofErr w:type="gramEnd"/>
-      <w:r>
-        <w:rPr>
-          <w:rFonts w:ascii="Consolas" w:hAnsi="Consolas"/>
-          <w:color w:val="F9FAF4"/>
-          <w:sz w:val="20"/>
-          <w:szCs w:val="20"/>
-        </w:rPr>
-        <w:t>)</w:t>
+      <w:r>
+        <w:rPr>
+          <w:rFonts w:ascii="Consolas" w:hAnsi="Consolas"/>
+          <w:color w:val="F9FAF4"/>
+          <w:sz w:val="20"/>
+          <w:szCs w:val="20"/>
+        </w:rPr>
+        <w:t>()</w:t>
       </w:r>
       <w:r>
         <w:rPr>
@@ -4750,8 +4546,6 @@
         </w:rPr>
         <w:t xml:space="preserve"> </w:t>
       </w:r>
-      <w:proofErr w:type="spellStart"/>
-      <w:proofErr w:type="gramStart"/>
       <w:r>
         <w:rPr>
           <w:rFonts w:ascii="Consolas" w:hAnsi="Consolas"/>
@@ -4761,25 +4555,14 @@
         </w:rPr>
         <w:t>ExcelDocument</w:t>
       </w:r>
-      <w:proofErr w:type="spellEnd"/>
-      <w:r>
-        <w:rPr>
-          <w:rFonts w:ascii="Consolas" w:hAnsi="Consolas"/>
-          <w:color w:val="F9FAF4"/>
-          <w:sz w:val="20"/>
-          <w:szCs w:val="20"/>
-        </w:rPr>
-        <w:t>(</w:t>
-      </w:r>
-      <w:proofErr w:type="gramEnd"/>
-      <w:r>
-        <w:rPr>
-          <w:rFonts w:ascii="Consolas" w:hAnsi="Consolas"/>
-          <w:color w:val="F9FAF4"/>
-          <w:sz w:val="20"/>
-          <w:szCs w:val="20"/>
-        </w:rPr>
-        <w:t>)</w:t>
+      <w:r>
+        <w:rPr>
+          <w:rFonts w:ascii="Consolas" w:hAnsi="Consolas"/>
+          <w:color w:val="F9FAF4"/>
+          <w:sz w:val="20"/>
+          <w:szCs w:val="20"/>
+        </w:rPr>
+        <w:t>()</w:t>
       </w:r>
       <w:r>
         <w:rPr>
@@ -4895,18 +4678,7 @@
           <w:sz w:val="20"/>
           <w:szCs w:val="20"/>
         </w:rPr>
-        <w:t xml:space="preserve"> </w:t>
-      </w:r>
-      <w:proofErr w:type="spellStart"/>
-      <w:proofErr w:type="gramStart"/>
-      <w:r>
-        <w:rPr>
-          <w:rFonts w:ascii="Consolas" w:hAnsi="Consolas"/>
-          <w:color w:val="D9E8F7"/>
-          <w:sz w:val="20"/>
-          <w:szCs w:val="20"/>
-        </w:rPr>
-        <w:t>com</w:t>
+        <w:t xml:space="preserve"> com</w:t>
       </w:r>
       <w:r>
         <w:rPr>
@@ -4926,7 +4698,6 @@
         </w:rPr>
         <w:t>result</w:t>
       </w:r>
-      <w:proofErr w:type="gramEnd"/>
       <w:r>
         <w:rPr>
           <w:rFonts w:ascii="Consolas" w:hAnsi="Consolas"/>
@@ -4945,7 +4716,6 @@
         </w:rPr>
         <w:t>factory</w:t>
       </w:r>
-      <w:proofErr w:type="spellEnd"/>
       <w:r>
         <w:rPr>
           <w:rFonts w:ascii="Consolas" w:hAnsi="Consolas"/>
@@ -5017,7 +4787,6 @@
         </w:rPr>
         <w:t xml:space="preserve"> </w:t>
       </w:r>
-      <w:proofErr w:type="spellStart"/>
       <w:r>
         <w:rPr>
           <w:rFonts w:ascii="Consolas" w:hAnsi="Consolas"/>
@@ -5027,7 +4796,6 @@
         </w:rPr>
         <w:t>PdfDocument</w:t>
       </w:r>
-      <w:proofErr w:type="spellEnd"/>
       <w:r>
         <w:rPr>
           <w:rFonts w:ascii="Consolas" w:hAnsi="Consolas"/>
@@ -5186,7 +4954,6 @@
         </w:rPr>
         <w:t xml:space="preserve"> </w:t>
       </w:r>
-      <w:proofErr w:type="gramStart"/>
       <w:r>
         <w:rPr>
           <w:rFonts w:ascii="Consolas" w:hAnsi="Consolas"/>
@@ -5203,17 +4970,7 @@
           <w:sz w:val="20"/>
           <w:szCs w:val="20"/>
         </w:rPr>
-        <w:t>(</w:t>
-      </w:r>
-      <w:proofErr w:type="gramEnd"/>
-      <w:r>
-        <w:rPr>
-          <w:rFonts w:ascii="Consolas" w:hAnsi="Consolas"/>
-          <w:color w:val="F9FAF4"/>
-          <w:sz w:val="20"/>
-          <w:szCs w:val="20"/>
-        </w:rPr>
-        <w:t>)</w:t>
+        <w:t>()</w:t>
       </w:r>
       <w:r>
         <w:rPr>
@@ -5255,7 +5012,6 @@
         </w:rPr>
         <w:t xml:space="preserve">        </w:t>
       </w:r>
-      <w:proofErr w:type="spellStart"/>
       <w:r>
         <w:rPr>
           <w:rFonts w:ascii="Consolas" w:hAnsi="Consolas"/>
@@ -5305,7 +5061,6 @@
         </w:rPr>
         <w:t>println</w:t>
       </w:r>
-      <w:proofErr w:type="spellEnd"/>
       <w:r>
         <w:rPr>
           <w:rFonts w:ascii="Consolas" w:hAnsi="Consolas"/>
@@ -5447,18 +5202,7 @@
           <w:sz w:val="20"/>
           <w:szCs w:val="20"/>
         </w:rPr>
-        <w:t xml:space="preserve"> </w:t>
-      </w:r>
-      <w:proofErr w:type="spellStart"/>
-      <w:proofErr w:type="gramStart"/>
-      <w:r>
-        <w:rPr>
-          <w:rFonts w:ascii="Consolas" w:hAnsi="Consolas"/>
-          <w:color w:val="D9E8F7"/>
-          <w:sz w:val="20"/>
-          <w:szCs w:val="20"/>
-        </w:rPr>
-        <w:t>com</w:t>
+        <w:t xml:space="preserve"> com</w:t>
       </w:r>
       <w:r>
         <w:rPr>
@@ -5478,7 +5222,6 @@
         </w:rPr>
         <w:t>result</w:t>
       </w:r>
-      <w:proofErr w:type="gramEnd"/>
       <w:r>
         <w:rPr>
           <w:rFonts w:ascii="Consolas" w:hAnsi="Consolas"/>
@@ -5497,7 +5240,6 @@
         </w:rPr>
         <w:t>factory</w:t>
       </w:r>
-      <w:proofErr w:type="spellEnd"/>
       <w:r>
         <w:rPr>
           <w:rFonts w:ascii="Consolas" w:hAnsi="Consolas"/>
@@ -5569,7 +5311,6 @@
         </w:rPr>
         <w:t xml:space="preserve"> </w:t>
       </w:r>
-      <w:proofErr w:type="spellStart"/>
       <w:r>
         <w:rPr>
           <w:rFonts w:ascii="Consolas" w:hAnsi="Consolas"/>
@@ -5579,7 +5320,6 @@
         </w:rPr>
         <w:t>PdfFactory</w:t>
       </w:r>
-      <w:proofErr w:type="spellEnd"/>
       <w:r>
         <w:rPr>
           <w:rFonts w:ascii="Consolas" w:hAnsi="Consolas"/>
@@ -5607,7 +5347,6 @@
         </w:rPr>
         <w:t xml:space="preserve"> </w:t>
       </w:r>
-      <w:proofErr w:type="spellStart"/>
       <w:r>
         <w:rPr>
           <w:rFonts w:ascii="Consolas" w:hAnsi="Consolas"/>
@@ -5617,7 +5356,6 @@
         </w:rPr>
         <w:t>DocumentFactory</w:t>
       </w:r>
-      <w:proofErr w:type="spellEnd"/>
       <w:r>
         <w:rPr>
           <w:rFonts w:ascii="Consolas" w:hAnsi="Consolas"/>
@@ -5740,8 +5478,6 @@
         </w:rPr>
         <w:t xml:space="preserve"> </w:t>
       </w:r>
-      <w:proofErr w:type="spellStart"/>
-      <w:proofErr w:type="gramStart"/>
       <w:r>
         <w:rPr>
           <w:rFonts w:ascii="Consolas" w:hAnsi="Consolas"/>
@@ -5751,25 +5487,14 @@
         </w:rPr>
         <w:t>createDocument</w:t>
       </w:r>
-      <w:proofErr w:type="spellEnd"/>
-      <w:r>
-        <w:rPr>
-          <w:rFonts w:ascii="Consolas" w:hAnsi="Consolas"/>
-          <w:color w:val="F9FAF4"/>
-          <w:sz w:val="20"/>
-          <w:szCs w:val="20"/>
-        </w:rPr>
-        <w:t>(</w:t>
-      </w:r>
-      <w:proofErr w:type="gramEnd"/>
-      <w:r>
-        <w:rPr>
-          <w:rFonts w:ascii="Consolas" w:hAnsi="Consolas"/>
-          <w:color w:val="F9FAF4"/>
-          <w:sz w:val="20"/>
-          <w:szCs w:val="20"/>
-        </w:rPr>
-        <w:t>)</w:t>
+      <w:r>
+        <w:rPr>
+          <w:rFonts w:ascii="Consolas" w:hAnsi="Consolas"/>
+          <w:color w:val="F9FAF4"/>
+          <w:sz w:val="20"/>
+          <w:szCs w:val="20"/>
+        </w:rPr>
+        <w:t>()</w:t>
       </w:r>
       <w:r>
         <w:rPr>
@@ -5847,8 +5572,6 @@
         </w:rPr>
         <w:t xml:space="preserve"> </w:t>
       </w:r>
-      <w:proofErr w:type="spellStart"/>
-      <w:proofErr w:type="gramStart"/>
       <w:r>
         <w:rPr>
           <w:rFonts w:ascii="Consolas" w:hAnsi="Consolas"/>
@@ -5858,25 +5581,14 @@
         </w:rPr>
         <w:t>PdfDocument</w:t>
       </w:r>
-      <w:proofErr w:type="spellEnd"/>
-      <w:r>
-        <w:rPr>
-          <w:rFonts w:ascii="Consolas" w:hAnsi="Consolas"/>
-          <w:color w:val="F9FAF4"/>
-          <w:sz w:val="20"/>
-          <w:szCs w:val="20"/>
-        </w:rPr>
-        <w:t>(</w:t>
-      </w:r>
-      <w:proofErr w:type="gramEnd"/>
-      <w:r>
-        <w:rPr>
-          <w:rFonts w:ascii="Consolas" w:hAnsi="Consolas"/>
-          <w:color w:val="F9FAF4"/>
-          <w:sz w:val="20"/>
-          <w:szCs w:val="20"/>
-        </w:rPr>
-        <w:t>)</w:t>
+      <w:r>
+        <w:rPr>
+          <w:rFonts w:ascii="Consolas" w:hAnsi="Consolas"/>
+          <w:color w:val="F9FAF4"/>
+          <w:sz w:val="20"/>
+          <w:szCs w:val="20"/>
+        </w:rPr>
+        <w:t>()</w:t>
       </w:r>
       <w:r>
         <w:rPr>
@@ -6009,18 +5721,7 @@
           <w:sz w:val="20"/>
           <w:szCs w:val="20"/>
         </w:rPr>
-        <w:t xml:space="preserve"> </w:t>
-      </w:r>
-      <w:proofErr w:type="spellStart"/>
-      <w:proofErr w:type="gramStart"/>
-      <w:r>
-        <w:rPr>
-          <w:rFonts w:ascii="Consolas" w:hAnsi="Consolas"/>
-          <w:color w:val="D9E8F7"/>
-          <w:sz w:val="20"/>
-          <w:szCs w:val="20"/>
-        </w:rPr>
-        <w:t>com</w:t>
+        <w:t xml:space="preserve"> com</w:t>
       </w:r>
       <w:r>
         <w:rPr>
@@ -6040,7 +5741,6 @@
         </w:rPr>
         <w:t>result</w:t>
       </w:r>
-      <w:proofErr w:type="gramEnd"/>
       <w:r>
         <w:rPr>
           <w:rFonts w:ascii="Consolas" w:hAnsi="Consolas"/>
@@ -6059,7 +5759,6 @@
         </w:rPr>
         <w:t>factory</w:t>
       </w:r>
-      <w:proofErr w:type="spellEnd"/>
       <w:r>
         <w:rPr>
           <w:rFonts w:ascii="Consolas" w:hAnsi="Consolas"/>
@@ -6131,7 +5830,6 @@
         </w:rPr>
         <w:t xml:space="preserve"> </w:t>
       </w:r>
-      <w:proofErr w:type="spellStart"/>
       <w:r>
         <w:rPr>
           <w:rFonts w:ascii="Consolas" w:hAnsi="Consolas"/>
@@ -6141,7 +5839,6 @@
         </w:rPr>
         <w:t>WordDocument</w:t>
       </w:r>
-      <w:proofErr w:type="spellEnd"/>
       <w:r>
         <w:rPr>
           <w:rFonts w:ascii="Consolas" w:hAnsi="Consolas"/>
@@ -6300,7 +5997,6 @@
         </w:rPr>
         <w:t xml:space="preserve"> </w:t>
       </w:r>
-      <w:proofErr w:type="gramStart"/>
       <w:r>
         <w:rPr>
           <w:rFonts w:ascii="Consolas" w:hAnsi="Consolas"/>
@@ -6317,17 +6013,7 @@
           <w:sz w:val="20"/>
           <w:szCs w:val="20"/>
         </w:rPr>
-        <w:t>(</w:t>
-      </w:r>
-      <w:proofErr w:type="gramEnd"/>
-      <w:r>
-        <w:rPr>
-          <w:rFonts w:ascii="Consolas" w:hAnsi="Consolas"/>
-          <w:color w:val="F9FAF4"/>
-          <w:sz w:val="20"/>
-          <w:szCs w:val="20"/>
-        </w:rPr>
-        <w:t>)</w:t>
+        <w:t>()</w:t>
       </w:r>
       <w:r>
         <w:rPr>
@@ -6369,7 +6055,6 @@
         </w:rPr>
         <w:t xml:space="preserve">        </w:t>
       </w:r>
-      <w:proofErr w:type="spellStart"/>
       <w:r>
         <w:rPr>
           <w:rFonts w:ascii="Consolas" w:hAnsi="Consolas"/>
@@ -6419,7 +6104,6 @@
         </w:rPr>
         <w:t>println</w:t>
       </w:r>
-      <w:proofErr w:type="spellEnd"/>
       <w:r>
         <w:rPr>
           <w:rFonts w:ascii="Consolas" w:hAnsi="Consolas"/>
@@ -6561,18 +6245,7 @@
           <w:sz w:val="20"/>
           <w:szCs w:val="20"/>
         </w:rPr>
-        <w:t xml:space="preserve"> </w:t>
-      </w:r>
-      <w:proofErr w:type="spellStart"/>
-      <w:proofErr w:type="gramStart"/>
-      <w:r>
-        <w:rPr>
-          <w:rFonts w:ascii="Consolas" w:hAnsi="Consolas"/>
-          <w:color w:val="D9E8F7"/>
-          <w:sz w:val="20"/>
-          <w:szCs w:val="20"/>
-        </w:rPr>
-        <w:t>com</w:t>
+        <w:t xml:space="preserve"> com</w:t>
       </w:r>
       <w:r>
         <w:rPr>
@@ -6592,7 +6265,6 @@
         </w:rPr>
         <w:t>result</w:t>
       </w:r>
-      <w:proofErr w:type="gramEnd"/>
       <w:r>
         <w:rPr>
           <w:rFonts w:ascii="Consolas" w:hAnsi="Consolas"/>
@@ -6611,7 +6283,6 @@
         </w:rPr>
         <w:t>factory</w:t>
       </w:r>
-      <w:proofErr w:type="spellEnd"/>
       <w:r>
         <w:rPr>
           <w:rFonts w:ascii="Consolas" w:hAnsi="Consolas"/>
@@ -6683,7 +6354,6 @@
         </w:rPr>
         <w:t xml:space="preserve"> </w:t>
       </w:r>
-      <w:proofErr w:type="spellStart"/>
       <w:r>
         <w:rPr>
           <w:rFonts w:ascii="Consolas" w:hAnsi="Consolas"/>
@@ -6693,7 +6363,6 @@
         </w:rPr>
         <w:t>WordFactory</w:t>
       </w:r>
-      <w:proofErr w:type="spellEnd"/>
       <w:r>
         <w:rPr>
           <w:rFonts w:ascii="Consolas" w:hAnsi="Consolas"/>
@@ -6721,7 +6390,6 @@
         </w:rPr>
         <w:t xml:space="preserve"> </w:t>
       </w:r>
-      <w:proofErr w:type="spellStart"/>
       <w:r>
         <w:rPr>
           <w:rFonts w:ascii="Consolas" w:hAnsi="Consolas"/>
@@ -6731,7 +6399,6 @@
         </w:rPr>
         <w:t>DocumentFactory</w:t>
       </w:r>
-      <w:proofErr w:type="spellEnd"/>
       <w:r>
         <w:rPr>
           <w:rFonts w:ascii="Consolas" w:hAnsi="Consolas"/>
@@ -6854,8 +6521,6 @@
         </w:rPr>
         <w:t xml:space="preserve"> </w:t>
       </w:r>
-      <w:proofErr w:type="spellStart"/>
-      <w:proofErr w:type="gramStart"/>
       <w:r>
         <w:rPr>
           <w:rFonts w:ascii="Consolas" w:hAnsi="Consolas"/>
@@ -6865,25 +6530,14 @@
         </w:rPr>
         <w:t>createDocument</w:t>
       </w:r>
-      <w:proofErr w:type="spellEnd"/>
-      <w:r>
-        <w:rPr>
-          <w:rFonts w:ascii="Consolas" w:hAnsi="Consolas"/>
-          <w:color w:val="F9FAF4"/>
-          <w:sz w:val="20"/>
-          <w:szCs w:val="20"/>
-        </w:rPr>
-        <w:t>(</w:t>
-      </w:r>
-      <w:proofErr w:type="gramEnd"/>
-      <w:r>
-        <w:rPr>
-          <w:rFonts w:ascii="Consolas" w:hAnsi="Consolas"/>
-          <w:color w:val="F9FAF4"/>
-          <w:sz w:val="20"/>
-          <w:szCs w:val="20"/>
-        </w:rPr>
-        <w:t>)</w:t>
+      <w:r>
+        <w:rPr>
+          <w:rFonts w:ascii="Consolas" w:hAnsi="Consolas"/>
+          <w:color w:val="F9FAF4"/>
+          <w:sz w:val="20"/>
+          <w:szCs w:val="20"/>
+        </w:rPr>
+        <w:t>()</w:t>
       </w:r>
       <w:r>
         <w:rPr>
@@ -6961,8 +6615,6 @@
         </w:rPr>
         <w:t xml:space="preserve"> </w:t>
       </w:r>
-      <w:proofErr w:type="spellStart"/>
-      <w:proofErr w:type="gramStart"/>
       <w:r>
         <w:rPr>
           <w:rFonts w:ascii="Consolas" w:hAnsi="Consolas"/>
@@ -6972,25 +6624,14 @@
         </w:rPr>
         <w:t>WordDocument</w:t>
       </w:r>
-      <w:proofErr w:type="spellEnd"/>
-      <w:r>
-        <w:rPr>
-          <w:rFonts w:ascii="Consolas" w:hAnsi="Consolas"/>
-          <w:color w:val="F9FAF4"/>
-          <w:sz w:val="20"/>
-          <w:szCs w:val="20"/>
-        </w:rPr>
-        <w:t>(</w:t>
-      </w:r>
-      <w:proofErr w:type="gramEnd"/>
-      <w:r>
-        <w:rPr>
-          <w:rFonts w:ascii="Consolas" w:hAnsi="Consolas"/>
-          <w:color w:val="F9FAF4"/>
-          <w:sz w:val="20"/>
-          <w:szCs w:val="20"/>
-        </w:rPr>
-        <w:t>)</w:t>
+      <w:r>
+        <w:rPr>
+          <w:rFonts w:ascii="Consolas" w:hAnsi="Consolas"/>
+          <w:color w:val="F9FAF4"/>
+          <w:sz w:val="20"/>
+          <w:szCs w:val="20"/>
+        </w:rPr>
+        <w:t>()</w:t>
       </w:r>
       <w:r>
         <w:rPr>
@@ -7070,14 +6711,62 @@
           <w:bCs/>
         </w:rPr>
       </w:pPr>
-    </w:p>
-    <w:p>
-      <w:pPr>
+      <w:r>
         <w:rPr>
           <w:b/>
           <w:bCs/>
         </w:rPr>
-      </w:pPr>
+        <w:t>Output:</w:t>
+      </w:r>
+    </w:p>
+    <w:p>
+      <w:pPr>
+        <w:rPr>
+          <w:b/>
+          <w:bCs/>
+        </w:rPr>
+      </w:pPr>
+      <w:r>
+        <w:rPr>
+          <w:b/>
+          <w:bCs/>
+        </w:rPr>
+        <w:drawing>
+          <wp:inline distT="0" distB="0" distL="0" distR="0" wp14:anchorId="592C99D5" wp14:editId="41131878">
+            <wp:extent cx="5943600" cy="3161030"/>
+            <wp:effectExtent l="0" t="0" r="0" b="1270"/>
+            <wp:docPr id="836839267" name="Picture 1"/>
+            <wp:cNvGraphicFramePr>
+              <a:graphicFrameLocks xmlns:a="http://schemas.openxmlformats.org/drawingml/2006/main" noChangeAspect="1"/>
+            </wp:cNvGraphicFramePr>
+            <a:graphic xmlns:a="http://schemas.openxmlformats.org/drawingml/2006/main">
+              <a:graphicData uri="http://schemas.openxmlformats.org/drawingml/2006/picture">
+                <pic:pic xmlns:pic="http://schemas.openxmlformats.org/drawingml/2006/picture">
+                  <pic:nvPicPr>
+                    <pic:cNvPr id="836839267" name=""/>
+                    <pic:cNvPicPr/>
+                  </pic:nvPicPr>
+                  <pic:blipFill>
+                    <a:blip r:embed="rId6"/>
+                    <a:stretch>
+                      <a:fillRect/>
+                    </a:stretch>
+                  </pic:blipFill>
+                  <pic:spPr>
+                    <a:xfrm>
+                      <a:off x="0" y="0"/>
+                      <a:ext cx="5943600" cy="3161030"/>
+                    </a:xfrm>
+                    <a:prstGeom prst="rect">
+                      <a:avLst/>
+                    </a:prstGeom>
+                  </pic:spPr>
+                </pic:pic>
+              </a:graphicData>
+            </a:graphic>
+          </wp:inline>
+        </w:drawing>
+      </w:r>
     </w:p>
     <w:sectPr>
       <w:pgSz w:w="12240" w:h="15840"/>

</xml_diff>